<commit_message>
template fixes for default values
</commit_message>
<xml_diff>
--- a/aop/FASE_CONTROL_TEMPLATE.docx
+++ b/aop/FASE_CONTROL_TEMPLATE.docx
@@ -98,6 +98,34 @@
       </w:pPr>
       <w:r>
         <w:rPr>
+          <w:rFonts w:ascii="Arial" w:eastAsia="Arial" w:hAnsi="Arial"/>
+          <w:color w:val="696969"/>
+          <w:sz w:val="24"/>
+          <w:lang w:val="nl-NL"/>
+        </w:rPr>
+        <w:tab/>
+      </w:r>
+      <w:r>
+        <w:rPr>
+          <w:rFonts w:ascii="Arial" w:eastAsia="Arial" w:hAnsi="Arial"/>
+          <w:color w:val="696969"/>
+          <w:sz w:val="24"/>
+          <w:lang w:val="nl-NL"/>
+        </w:rPr>
+        <w:tab/>
+      </w:r>
+    </w:p>
+    <w:p>
+      <w:pPr>
+        <w:rPr>
+          <w:rFonts w:ascii="Arial" w:eastAsia="Arial" w:hAnsi="Arial"/>
+          <w:color w:val="696969"/>
+          <w:sz w:val="24"/>
+          <w:lang w:val="nl-NL"/>
+        </w:rPr>
+      </w:pPr>
+      <w:r>
+        <w:rPr>
           <w:rFonts w:ascii="Arial" w:eastAsia="Arial" w:hAnsi="Arial" w:cs="Arial"/>
           <w:b/>
           <w:bCs/>
@@ -110,13 +138,13 @@
         <mc:AlternateContent>
           <mc:Choice Requires="wps">
             <w:drawing>
-              <wp:anchor distT="45720" distB="45720" distL="114300" distR="114300" simplePos="0" relativeHeight="251659264" behindDoc="0" locked="0" layoutInCell="1" allowOverlap="1" wp14:anchorId="6D156ADC" wp14:editId="51BBCF6E">
+              <wp:anchor distT="45720" distB="45720" distL="114300" distR="114300" simplePos="0" relativeHeight="251659264" behindDoc="0" locked="0" layoutInCell="1" allowOverlap="1" wp14:anchorId="6D156ADC" wp14:editId="703E9788">
                 <wp:simplePos x="0" y="0"/>
                 <wp:positionH relativeFrom="margin">
                   <wp:posOffset>-309245</wp:posOffset>
                 </wp:positionH>
                 <wp:positionV relativeFrom="paragraph">
-                  <wp:posOffset>333375</wp:posOffset>
+                  <wp:posOffset>115166</wp:posOffset>
                 </wp:positionV>
                 <wp:extent cx="5709285" cy="977900"/>
                 <wp:effectExtent l="0" t="0" r="5715" b="0"/>
@@ -152,10 +180,19 @@
                       <wps:txbx>
                         <w:txbxContent>
                           <w:p>
+                            <w:pPr>
+                              <w:rPr>
+                                <w:rFonts w:ascii="Arial" w:eastAsia="Arial" w:hAnsi="Arial"/>
+                                <w:b/>
+                                <w:color w:val="FFFFFF" w:themeColor="background1"/>
+                                <w:sz w:val="52"/>
+                              </w:rPr>
+                            </w:pPr>
                             <w:r>
                               <w:rPr>
                                 <w:rFonts w:ascii="Arial" w:eastAsia="Arial" w:hAnsi="Arial"/>
                                 <w:b/>
+                                <w:color w:val="FFFFFF" w:themeColor="background1"/>
                                 <w:sz w:val="52"/>
                               </w:rPr>
                               <w:t>Rapportage</w:t>
@@ -164,13 +201,32 @@
                               <w:rPr>
                                 <w:rFonts w:ascii="Arial" w:eastAsia="Arial" w:hAnsi="Arial"/>
                                 <w:b/>
+                                <w:color w:val="FFFFFF" w:themeColor="background1"/>
                                 <w:sz w:val="52"/>
                               </w:rPr>
-                              <w:br/>
-                              <w:t>Kwaliteitsmeting Schoonmaak</w:t>
+                              <w:t xml:space="preserve"> </w:t>
                             </w:r>
+                            <w:r>
+                              <w:rPr>
+                                <w:rFonts w:ascii="Arial" w:eastAsia="Arial" w:hAnsi="Arial"/>
+                                <w:b/>
+                                <w:color w:val="FFFFFF" w:themeColor="background1"/>
+                                <w:sz w:val="52"/>
+                              </w:rPr>
+                              <w:t xml:space="preserve">VSR-IMPO </w:t>
+                            </w:r>
+                            <w:proofErr w:type="spellStart"/>
+                            <w:r>
+                              <w:rPr>
+                                <w:rFonts w:ascii="Arial" w:eastAsia="Arial" w:hAnsi="Arial"/>
+                                <w:b/>
+                                <w:color w:val="FFFFFF" w:themeColor="background1"/>
+                                <w:sz w:val="52"/>
+                              </w:rPr>
+                              <w:t>Kwaliteitsmeting</w:t>
+                            </w:r>
+                            <w:proofErr w:type="spellEnd"/>
                           </w:p>
-                          <w:p/>
                           <w:p/>
                         </w:txbxContent>
                       </wps:txbx>
@@ -195,14 +251,23 @@
                 <v:stroke joinstyle="miter"/>
                 <v:path gradientshapeok="t" o:connecttype="rect"/>
               </v:shapetype>
-              <v:shape id="Text Box 2" o:spid="_x0000_s1026" type="#_x0000_t202" style="position:absolute;margin-left:-24.35pt;margin-top:26.25pt;width:449.55pt;height:77pt;z-index:251659264;visibility:visible;mso-wrap-style:square;mso-width-percent:0;mso-height-percent:0;mso-wrap-distance-left:9pt;mso-wrap-distance-top:3.6pt;mso-wrap-distance-right:9pt;mso-wrap-distance-bottom:3.6pt;mso-position-horizontal:absolute;mso-position-horizontal-relative:margin;mso-position-vertical:absolute;mso-position-vertical-relative:text;mso-width-percent:0;mso-height-percent:0;mso-width-relative:margin;mso-height-relative:margin;v-text-anchor:top" o:gfxdata="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" fillcolor="#2596be" stroked="f">
+              <v:shape id="Text Box 2" o:spid="_x0000_s1026" type="#_x0000_t202" style="position:absolute;margin-left:-24.35pt;margin-top:9.05pt;width:449.55pt;height:77pt;z-index:251659264;visibility:visible;mso-wrap-style:square;mso-width-percent:0;mso-height-percent:0;mso-wrap-distance-left:9pt;mso-wrap-distance-top:3.6pt;mso-wrap-distance-right:9pt;mso-wrap-distance-bottom:3.6pt;mso-position-horizontal:absolute;mso-position-horizontal-relative:margin;mso-position-vertical:absolute;mso-position-vertical-relative:text;mso-width-percent:0;mso-height-percent:0;mso-width-relative:margin;mso-height-relative:margin;v-text-anchor:top" o:gfxdata="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" fillcolor="#2596be" stroked="f">
                 <v:textbox>
                   <w:txbxContent>
                     <w:p>
+                      <w:pPr>
+                        <w:rPr>
+                          <w:rFonts w:ascii="Arial" w:eastAsia="Arial" w:hAnsi="Arial"/>
+                          <w:b/>
+                          <w:color w:val="FFFFFF" w:themeColor="background1"/>
+                          <w:sz w:val="52"/>
+                        </w:rPr>
+                      </w:pPr>
                       <w:r>
                         <w:rPr>
                           <w:rFonts w:ascii="Arial" w:eastAsia="Arial" w:hAnsi="Arial"/>
                           <w:b/>
+                          <w:color w:val="FFFFFF" w:themeColor="background1"/>
                           <w:sz w:val="52"/>
                         </w:rPr>
                         <w:t>Rapportage</w:t>
@@ -211,13 +276,32 @@
                         <w:rPr>
                           <w:rFonts w:ascii="Arial" w:eastAsia="Arial" w:hAnsi="Arial"/>
                           <w:b/>
+                          <w:color w:val="FFFFFF" w:themeColor="background1"/>
                           <w:sz w:val="52"/>
                         </w:rPr>
-                        <w:br/>
-                        <w:t>Kwaliteitsmeting Schoonmaak</w:t>
+                        <w:t xml:space="preserve"> </w:t>
                       </w:r>
+                      <w:r>
+                        <w:rPr>
+                          <w:rFonts w:ascii="Arial" w:eastAsia="Arial" w:hAnsi="Arial"/>
+                          <w:b/>
+                          <w:color w:val="FFFFFF" w:themeColor="background1"/>
+                          <w:sz w:val="52"/>
+                        </w:rPr>
+                        <w:t xml:space="preserve">VSR-IMPO </w:t>
+                      </w:r>
+                      <w:proofErr w:type="spellStart"/>
+                      <w:r>
+                        <w:rPr>
+                          <w:rFonts w:ascii="Arial" w:eastAsia="Arial" w:hAnsi="Arial"/>
+                          <w:b/>
+                          <w:color w:val="FFFFFF" w:themeColor="background1"/>
+                          <w:sz w:val="52"/>
+                        </w:rPr>
+                        <w:t>Kwaliteitsmeting</w:t>
+                      </w:r>
+                      <w:proofErr w:type="spellEnd"/>
                     </w:p>
-                    <w:p/>
                     <w:p/>
                   </w:txbxContent>
                 </v:textbox>
@@ -227,24 +311,6 @@
           </mc:Fallback>
         </mc:AlternateContent>
       </w:r>
-      <w:r>
-        <w:rPr>
-          <w:rFonts w:ascii="Arial" w:eastAsia="Arial" w:hAnsi="Arial"/>
-          <w:color w:val="696969"/>
-          <w:sz w:val="24"/>
-          <w:lang w:val="nl-NL"/>
-        </w:rPr>
-        <w:tab/>
-      </w:r>
-      <w:r>
-        <w:rPr>
-          <w:rFonts w:ascii="Arial" w:eastAsia="Arial" w:hAnsi="Arial"/>
-          <w:color w:val="696969"/>
-          <w:sz w:val="24"/>
-          <w:lang w:val="nl-NL"/>
-        </w:rPr>
-        <w:tab/>
-      </w:r>
     </w:p>
     <w:p>
       <w:pPr>
@@ -278,6 +344,9 @@
     </w:p>
     <w:p>
       <w:pPr>
+        <w:tabs>
+          <w:tab w:val="left" w:pos="3731"/>
+        </w:tabs>
         <w:rPr>
           <w:rFonts w:ascii="Arial" w:eastAsia="Arial" w:hAnsi="Arial"/>
           <w:color w:val="696969"/>
@@ -285,6 +354,42 @@
           <w:lang w:val="nl-NL"/>
         </w:rPr>
       </w:pPr>
+      <w:r>
+        <w:rPr>
+          <w:rFonts w:ascii="Arial" w:eastAsia="Arial" w:hAnsi="Arial"/>
+          <w:color w:val="696969"/>
+          <w:sz w:val="24"/>
+          <w:lang w:val="nl-NL"/>
+        </w:rPr>
+        <w:t>Organisatie:</w:t>
+      </w:r>
+      <w:r>
+        <w:rPr>
+          <w:rFonts w:ascii="Arial" w:eastAsia="Arial" w:hAnsi="Arial"/>
+          <w:color w:val="696969"/>
+          <w:sz w:val="24"/>
+          <w:lang w:val="nl-NL"/>
+        </w:rPr>
+        <w:tab/>
+      </w:r>
+      <w:r>
+        <w:rPr>
+          <w:rFonts w:ascii="Arial" w:eastAsia="Arial" w:hAnsi="Arial"/>
+          <w:color w:val="696969"/>
+          <w:sz w:val="24"/>
+          <w:lang w:val="nl-NL"/>
+        </w:rPr>
+        <w:br/>
+      </w:r>
+      <w:r>
+        <w:rPr>
+          <w:rFonts w:ascii="Arial" w:eastAsia="Arial" w:hAnsi="Arial"/>
+          <w:color w:val="696969"/>
+          <w:sz w:val="24"/>
+          <w:lang w:val="nl-NL"/>
+        </w:rPr>
+        <w:t>{organisatie}</w:t>
+      </w:r>
     </w:p>
     <w:p>
       <w:pPr>
@@ -302,7 +407,7 @@
           <w:sz w:val="24"/>
           <w:lang w:val="nl-NL"/>
         </w:rPr>
-        <w:t>Organisatie:</w:t>
+        <w:t>Ter attentie van:</w:t>
       </w:r>
       <w:r>
         <w:rPr>
@@ -320,7 +425,27 @@
           <w:sz w:val="24"/>
           <w:lang w:val="nl-NL"/>
         </w:rPr>
-        <w:t>{organisatie}</w:t>
+        <w:t>{</w:t>
+      </w:r>
+      <w:proofErr w:type="spellStart"/>
+      <w:r>
+        <w:rPr>
+          <w:rFonts w:ascii="Arial" w:eastAsia="Arial" w:hAnsi="Arial"/>
+          <w:color w:val="696969"/>
+          <w:sz w:val="24"/>
+          <w:lang w:val="nl-NL"/>
+        </w:rPr>
+        <w:t>ter_attentie_van</w:t>
+      </w:r>
+      <w:proofErr w:type="spellEnd"/>
+      <w:r>
+        <w:rPr>
+          <w:rFonts w:ascii="Arial" w:eastAsia="Arial" w:hAnsi="Arial"/>
+          <w:color w:val="696969"/>
+          <w:sz w:val="24"/>
+          <w:lang w:val="nl-NL"/>
+        </w:rPr>
+        <w:t>}</w:t>
       </w:r>
     </w:p>
     <w:p>
@@ -339,7 +464,71 @@
           <w:sz w:val="24"/>
           <w:lang w:val="nl-NL"/>
         </w:rPr>
-        <w:t>Ter attentie van:</w:t>
+        <w:t>Project</w:t>
+      </w:r>
+      <w:r>
+        <w:rPr>
+          <w:rFonts w:ascii="Arial" w:eastAsia="Arial" w:hAnsi="Arial"/>
+          <w:color w:val="696969"/>
+          <w:sz w:val="24"/>
+          <w:lang w:val="nl-NL"/>
+        </w:rPr>
+        <w:tab/>
+      </w:r>
+      <w:r>
+        <w:rPr>
+          <w:rFonts w:ascii="Arial" w:eastAsia="Arial" w:hAnsi="Arial"/>
+          <w:color w:val="696969"/>
+          <w:sz w:val="24"/>
+          <w:lang w:val="nl-NL"/>
+        </w:rPr>
+        <w:tab/>
+      </w:r>
+      <w:r>
+        <w:rPr>
+          <w:rFonts w:ascii="Arial" w:eastAsia="Arial" w:hAnsi="Arial"/>
+          <w:color w:val="696969"/>
+          <w:sz w:val="24"/>
+          <w:lang w:val="nl-NL"/>
+        </w:rPr>
+        <w:tab/>
+      </w:r>
+      <w:r>
+        <w:rPr>
+          <w:rFonts w:ascii="Arial" w:eastAsia="Arial" w:hAnsi="Arial"/>
+          <w:color w:val="696969"/>
+          <w:sz w:val="24"/>
+          <w:lang w:val="nl-NL"/>
+        </w:rPr>
+        <w:tab/>
+      </w:r>
+      <w:r>
+        <w:rPr>
+          <w:rFonts w:ascii="Arial" w:eastAsia="Arial" w:hAnsi="Arial"/>
+          <w:color w:val="696969"/>
+          <w:sz w:val="24"/>
+          <w:lang w:val="nl-NL"/>
+        </w:rPr>
+        <w:tab/>
+        <w:t xml:space="preserve">: </w:t>
+      </w:r>
+      <w:r>
+        <w:rPr>
+          <w:rFonts w:ascii="Arial" w:eastAsia="Arial" w:hAnsi="Arial"/>
+          <w:color w:val="696969"/>
+          <w:sz w:val="24"/>
+          <w:lang w:val="nl-NL"/>
+        </w:rPr>
+        <w:tab/>
+      </w:r>
+      <w:r>
+        <w:rPr>
+          <w:rFonts w:ascii="Arial" w:eastAsia="Arial" w:hAnsi="Arial"/>
+          <w:color w:val="696969"/>
+          <w:sz w:val="24"/>
+          <w:lang w:val="nl-NL"/>
+        </w:rPr>
+        <w:t>{project}</w:t>
       </w:r>
       <w:r>
         <w:rPr>
@@ -349,15 +538,94 @@
           <w:lang w:val="nl-NL"/>
         </w:rPr>
         <w:br/>
-      </w:r>
-      <w:r>
-        <w:rPr>
-          <w:rFonts w:ascii="Arial" w:eastAsia="Arial" w:hAnsi="Arial"/>
-          <w:color w:val="696969"/>
-          <w:sz w:val="24"/>
-          <w:lang w:val="nl-NL"/>
-        </w:rPr>
-        <w:t>{ter_attentie_van}</w:t>
+        <w:t>Rapportnummer</w:t>
+      </w:r>
+      <w:r>
+        <w:rPr>
+          <w:rFonts w:ascii="Arial" w:eastAsia="Arial" w:hAnsi="Arial"/>
+          <w:color w:val="696969"/>
+          <w:sz w:val="24"/>
+          <w:lang w:val="nl-NL"/>
+        </w:rPr>
+        <w:tab/>
+      </w:r>
+      <w:r>
+        <w:rPr>
+          <w:rFonts w:ascii="Arial" w:eastAsia="Arial" w:hAnsi="Arial"/>
+          <w:color w:val="696969"/>
+          <w:sz w:val="24"/>
+          <w:lang w:val="nl-NL"/>
+        </w:rPr>
+        <w:tab/>
+      </w:r>
+      <w:r>
+        <w:rPr>
+          <w:rFonts w:ascii="Arial" w:eastAsia="Arial" w:hAnsi="Arial"/>
+          <w:color w:val="696969"/>
+          <w:sz w:val="24"/>
+          <w:lang w:val="nl-NL"/>
+        </w:rPr>
+        <w:tab/>
+      </w:r>
+      <w:r>
+        <w:rPr>
+          <w:rFonts w:ascii="Arial" w:eastAsia="Arial" w:hAnsi="Arial"/>
+          <w:color w:val="696969"/>
+          <w:sz w:val="24"/>
+          <w:lang w:val="nl-NL"/>
+        </w:rPr>
+        <w:tab/>
+        <w:t xml:space="preserve">: </w:t>
+      </w:r>
+      <w:r>
+        <w:rPr>
+          <w:lang w:val="nl-NL"/>
+        </w:rPr>
+        <w:t xml:space="preserve"> </w:t>
+      </w:r>
+      <w:r>
+        <w:rPr>
+          <w:lang w:val="nl-NL"/>
+        </w:rPr>
+        <w:tab/>
+      </w:r>
+      <w:r>
+        <w:rPr>
+          <w:rFonts w:ascii="Arial" w:eastAsia="Arial" w:hAnsi="Arial"/>
+          <w:color w:val="696969"/>
+          <w:sz w:val="24"/>
+          <w:lang w:val="nl-NL"/>
+        </w:rPr>
+        <w:t>{</w:t>
+      </w:r>
+      <w:proofErr w:type="spellStart"/>
+      <w:r>
+        <w:rPr>
+          <w:rFonts w:ascii="Arial" w:eastAsia="Arial" w:hAnsi="Arial"/>
+          <w:color w:val="696969"/>
+          <w:sz w:val="24"/>
+          <w:lang w:val="nl-NL"/>
+        </w:rPr>
+        <w:t>rapport_n</w:t>
+      </w:r>
+      <w:r>
+        <w:rPr>
+          <w:rFonts w:ascii="Arial" w:eastAsia="Arial" w:hAnsi="Arial"/>
+          <w:color w:val="696969"/>
+          <w:sz w:val="24"/>
+          <w:lang w:val="nl-NL"/>
+        </w:rPr>
+        <w:t>ummer</w:t>
+      </w:r>
+      <w:proofErr w:type="spellEnd"/>
+      <w:r>
+        <w:rPr>
+          <w:rFonts w:ascii="Arial" w:eastAsia="Arial" w:hAnsi="Arial"/>
+          <w:color w:val="696969"/>
+          <w:sz w:val="24"/>
+          <w:lang w:val="nl-NL"/>
+        </w:rPr>
+        <w:t>}</w:t>
       </w:r>
     </w:p>
     <w:p>
@@ -376,7 +644,7 @@
           <w:sz w:val="24"/>
           <w:lang w:val="nl-NL"/>
         </w:rPr>
-        <w:t>Project</w:t>
+        <w:t>Datum:</w:t>
       </w:r>
       <w:r>
         <w:rPr>
@@ -440,177 +708,9 @@
           <w:sz w:val="24"/>
           <w:lang w:val="nl-NL"/>
         </w:rPr>
-        <w:t>{project}</w:t>
-      </w:r>
-      <w:r>
-        <w:rPr>
-          <w:rFonts w:ascii="Arial" w:eastAsia="Arial" w:hAnsi="Arial"/>
-          <w:color w:val="696969"/>
-          <w:sz w:val="24"/>
-          <w:lang w:val="nl-NL"/>
-        </w:rPr>
-        <w:br/>
-        <w:t>Rapportnummer</w:t>
-      </w:r>
-      <w:r>
-        <w:rPr>
-          <w:rFonts w:ascii="Arial" w:eastAsia="Arial" w:hAnsi="Arial"/>
-          <w:color w:val="696969"/>
-          <w:sz w:val="24"/>
-          <w:lang w:val="nl-NL"/>
-        </w:rPr>
-        <w:tab/>
-      </w:r>
-      <w:r>
-        <w:rPr>
-          <w:rFonts w:ascii="Arial" w:eastAsia="Arial" w:hAnsi="Arial"/>
-          <w:color w:val="696969"/>
-          <w:sz w:val="24"/>
-          <w:lang w:val="nl-NL"/>
-        </w:rPr>
-        <w:tab/>
-      </w:r>
-      <w:r>
-        <w:rPr>
-          <w:rFonts w:ascii="Arial" w:eastAsia="Arial" w:hAnsi="Arial"/>
-          <w:color w:val="696969"/>
-          <w:sz w:val="24"/>
-          <w:lang w:val="nl-NL"/>
-        </w:rPr>
-        <w:tab/>
-      </w:r>
-      <w:r>
-        <w:rPr>
-          <w:rFonts w:ascii="Arial" w:eastAsia="Arial" w:hAnsi="Arial"/>
-          <w:color w:val="696969"/>
-          <w:sz w:val="24"/>
-          <w:lang w:val="nl-NL"/>
-        </w:rPr>
-        <w:tab/>
-        <w:t xml:space="preserve">: </w:t>
-      </w:r>
-      <w:r>
-        <w:rPr>
-          <w:lang w:val="nl-NL"/>
-        </w:rPr>
-        <w:t xml:space="preserve"> </w:t>
-      </w:r>
-      <w:r>
-        <w:rPr>
-          <w:lang w:val="nl-NL"/>
-        </w:rPr>
-        <w:tab/>
-      </w:r>
-      <w:r>
-        <w:rPr>
-          <w:rFonts w:ascii="Arial" w:eastAsia="Arial" w:hAnsi="Arial"/>
-          <w:color w:val="696969"/>
-          <w:sz w:val="24"/>
-          <w:lang w:val="nl-NL"/>
-        </w:rPr>
-        <w:t>{rapport_n</w:t>
-      </w:r>
-      <w:r>
-        <w:rPr>
-          <w:rFonts w:ascii="Arial" w:eastAsia="Arial" w:hAnsi="Arial"/>
-          <w:color w:val="696969"/>
-          <w:sz w:val="24"/>
-          <w:lang w:val="nl-NL"/>
-        </w:rPr>
-        <w:t>ummer</w:t>
-      </w:r>
-      <w:r>
-        <w:rPr>
-          <w:rFonts w:ascii="Arial" w:eastAsia="Arial" w:hAnsi="Arial"/>
-          <w:color w:val="696969"/>
-          <w:sz w:val="24"/>
-          <w:lang w:val="nl-NL"/>
-        </w:rPr>
-        <w:t>}</w:t>
-      </w:r>
-    </w:p>
-    <w:p>
-      <w:pPr>
-        <w:rPr>
-          <w:rFonts w:ascii="Arial" w:eastAsia="Arial" w:hAnsi="Arial"/>
-          <w:color w:val="696969"/>
-          <w:sz w:val="24"/>
-          <w:lang w:val="nl-NL"/>
-        </w:rPr>
-      </w:pPr>
-      <w:r>
-        <w:rPr>
-          <w:rFonts w:ascii="Arial" w:eastAsia="Arial" w:hAnsi="Arial"/>
-          <w:color w:val="696969"/>
-          <w:sz w:val="24"/>
-          <w:lang w:val="nl-NL"/>
-        </w:rPr>
-        <w:t>Datum:</w:t>
-      </w:r>
-      <w:r>
-        <w:rPr>
-          <w:rFonts w:ascii="Arial" w:eastAsia="Arial" w:hAnsi="Arial"/>
-          <w:color w:val="696969"/>
-          <w:sz w:val="24"/>
-          <w:lang w:val="nl-NL"/>
-        </w:rPr>
-        <w:tab/>
-      </w:r>
-      <w:r>
-        <w:rPr>
-          <w:rFonts w:ascii="Arial" w:eastAsia="Arial" w:hAnsi="Arial"/>
-          <w:color w:val="696969"/>
-          <w:sz w:val="24"/>
-          <w:lang w:val="nl-NL"/>
-        </w:rPr>
-        <w:tab/>
-      </w:r>
-      <w:r>
-        <w:rPr>
-          <w:rFonts w:ascii="Arial" w:eastAsia="Arial" w:hAnsi="Arial"/>
-          <w:color w:val="696969"/>
-          <w:sz w:val="24"/>
-          <w:lang w:val="nl-NL"/>
-        </w:rPr>
-        <w:tab/>
-      </w:r>
-      <w:r>
-        <w:rPr>
-          <w:rFonts w:ascii="Arial" w:eastAsia="Arial" w:hAnsi="Arial"/>
-          <w:color w:val="696969"/>
-          <w:sz w:val="24"/>
-          <w:lang w:val="nl-NL"/>
-        </w:rPr>
-        <w:tab/>
-      </w:r>
-      <w:r>
-        <w:rPr>
-          <w:rFonts w:ascii="Arial" w:eastAsia="Arial" w:hAnsi="Arial"/>
-          <w:color w:val="696969"/>
-          <w:sz w:val="24"/>
-          <w:lang w:val="nl-NL"/>
-        </w:rPr>
-        <w:tab/>
-        <w:t xml:space="preserve">: </w:t>
-      </w:r>
-      <w:r>
-        <w:rPr>
-          <w:rFonts w:ascii="Arial" w:eastAsia="Arial" w:hAnsi="Arial"/>
-          <w:color w:val="696969"/>
-          <w:sz w:val="24"/>
-          <w:lang w:val="nl-NL"/>
-        </w:rPr>
-        <w:tab/>
-      </w:r>
-      <w:r>
-        <w:rPr>
-          <w:rFonts w:ascii="Arial" w:eastAsia="Arial" w:hAnsi="Arial"/>
-          <w:color w:val="696969"/>
-          <w:sz w:val="24"/>
-          <w:lang w:val="nl-NL"/>
-        </w:rPr>
         <w:t>{</w:t>
       </w:r>
+      <w:proofErr w:type="spellStart"/>
       <w:r>
         <w:rPr>
           <w:rFonts w:ascii="Arial" w:eastAsia="Arial" w:hAnsi="Arial"/>
@@ -620,6 +720,7 @@
         </w:rPr>
         <w:t>datum_controle</w:t>
       </w:r>
+      <w:proofErr w:type="spellEnd"/>
       <w:r>
         <w:rPr>
           <w:rFonts w:ascii="Arial" w:eastAsia="Arial" w:hAnsi="Arial"/>
@@ -692,7 +793,27 @@
           <w:sz w:val="24"/>
           <w:lang w:val="nl-NL"/>
         </w:rPr>
-        <w:t>{tijdstip_controle}</w:t>
+        <w:t>{</w:t>
+      </w:r>
+      <w:proofErr w:type="spellStart"/>
+      <w:r>
+        <w:rPr>
+          <w:rFonts w:ascii="Arial" w:eastAsia="Arial" w:hAnsi="Arial"/>
+          <w:color w:val="696969"/>
+          <w:sz w:val="24"/>
+          <w:lang w:val="nl-NL"/>
+        </w:rPr>
+        <w:t>tijdstip_controle</w:t>
+      </w:r>
+      <w:proofErr w:type="spellEnd"/>
+      <w:r>
+        <w:rPr>
+          <w:rFonts w:ascii="Arial" w:eastAsia="Arial" w:hAnsi="Arial"/>
+          <w:color w:val="696969"/>
+          <w:sz w:val="24"/>
+          <w:lang w:val="nl-NL"/>
+        </w:rPr>
+        <w:t>}</w:t>
       </w:r>
     </w:p>
     <w:p>
@@ -757,7 +878,27 @@
           <w:sz w:val="24"/>
           <w:lang w:val="nl-NL"/>
         </w:rPr>
-        <w:t>{controle_door}</w:t>
+        <w:t>{</w:t>
+      </w:r>
+      <w:proofErr w:type="spellStart"/>
+      <w:r>
+        <w:rPr>
+          <w:rFonts w:ascii="Arial" w:eastAsia="Arial" w:hAnsi="Arial"/>
+          <w:color w:val="696969"/>
+          <w:sz w:val="24"/>
+          <w:lang w:val="nl-NL"/>
+        </w:rPr>
+        <w:t>controle_door</w:t>
+      </w:r>
+      <w:proofErr w:type="spellEnd"/>
+      <w:r>
+        <w:rPr>
+          <w:rFonts w:ascii="Arial" w:eastAsia="Arial" w:hAnsi="Arial"/>
+          <w:color w:val="696969"/>
+          <w:sz w:val="24"/>
+          <w:lang w:val="nl-NL"/>
+        </w:rPr>
+        <w:t>}</w:t>
       </w:r>
     </w:p>
     <w:p>
@@ -821,7 +962,27 @@
           <w:sz w:val="24"/>
           <w:lang w:val="nl-NL"/>
         </w:rPr>
-        <w:t>{aanwezig_leverancier}</w:t>
+        <w:t>{</w:t>
+      </w:r>
+      <w:proofErr w:type="spellStart"/>
+      <w:r>
+        <w:rPr>
+          <w:rFonts w:ascii="Arial" w:eastAsia="Arial" w:hAnsi="Arial"/>
+          <w:color w:val="696969"/>
+          <w:sz w:val="24"/>
+          <w:lang w:val="nl-NL"/>
+        </w:rPr>
+        <w:t>aanwezig_leverancier</w:t>
+      </w:r>
+      <w:proofErr w:type="spellEnd"/>
+      <w:r>
+        <w:rPr>
+          <w:rFonts w:ascii="Arial" w:eastAsia="Arial" w:hAnsi="Arial"/>
+          <w:color w:val="696969"/>
+          <w:sz w:val="24"/>
+          <w:lang w:val="nl-NL"/>
+        </w:rPr>
+        <w:t>}</w:t>
       </w:r>
       <w:r>
         <w:rPr>
@@ -911,9 +1072,7 @@
         <w:spacing w:after="0" w:line="240" w:lineRule="auto"/>
         <w:ind w:left="7200" w:firstLine="720"/>
         <w:rPr>
-          <w:rFonts w:ascii="Arial" w:eastAsia="Arial" w:hAnsi="Arial"/>
-          <w:color w:val="696969"/>
-          <w:sz w:val="24"/>
+          <w:noProof/>
           <w:lang w:val="nl-NL"/>
         </w:rPr>
       </w:pPr>
@@ -1058,37 +1217,68 @@
         </w:rPr>
         <w:t>{%client_logo}</w:t>
       </w:r>
-      <w:r>
-        <w:rPr>
-          <w:rFonts w:ascii="Arial" w:eastAsia="Arial" w:hAnsi="Arial"/>
-          <w:color w:val="696969"/>
-          <w:sz w:val="24"/>
-          <w:lang w:val="nl-NL"/>
-        </w:rPr>
-        <w:tab/>
-      </w:r>
-      <w:r>
-        <w:rPr>
-          <w:rFonts w:ascii="Arial" w:eastAsia="Arial" w:hAnsi="Arial"/>
-          <w:color w:val="696969"/>
-          <w:sz w:val="24"/>
-          <w:lang w:val="nl-NL"/>
-        </w:rPr>
-        <w:tab/>
-      </w:r>
-      <w:r>
-        <w:rPr>
-          <w:rFonts w:ascii="Arial" w:eastAsia="Arial" w:hAnsi="Arial"/>
-          <w:color w:val="696969"/>
-          <w:sz w:val="24"/>
-          <w:lang w:val="nl-NL"/>
-        </w:rPr>
-        <w:tab/>
-      </w:r>
     </w:p>
     <w:p>
       <w:pPr>
-        <w:rPr>
+        <w:spacing w:after="0" w:line="240" w:lineRule="auto"/>
+        <w:ind w:left="7200" w:firstLine="720"/>
+        <w:rPr>
+          <w:rFonts w:ascii="Arial" w:eastAsia="Arial" w:hAnsi="Arial"/>
+          <w:color w:val="696969"/>
+          <w:sz w:val="24"/>
+          <w:lang w:val="nl-NL"/>
+        </w:rPr>
+      </w:pPr>
+      <w:r>
+        <w:rPr>
+          <w:rFonts w:ascii="Arial" w:eastAsia="Arial" w:hAnsi="Arial"/>
+          <w:color w:val="696969"/>
+          <w:sz w:val="24"/>
+          <w:lang w:val="nl-NL"/>
+        </w:rPr>
+        <w:tab/>
+      </w:r>
+      <w:r>
+        <w:rPr>
+          <w:rFonts w:ascii="Arial" w:eastAsia="Arial" w:hAnsi="Arial"/>
+          <w:color w:val="696969"/>
+          <w:sz w:val="24"/>
+          <w:lang w:val="nl-NL"/>
+        </w:rPr>
+        <w:tab/>
+      </w:r>
+      <w:r>
+        <w:rPr>
+          <w:rFonts w:ascii="Arial" w:eastAsia="Arial" w:hAnsi="Arial"/>
+          <w:color w:val="696969"/>
+          <w:sz w:val="24"/>
+          <w:lang w:val="nl-NL"/>
+        </w:rPr>
+        <w:tab/>
+      </w:r>
+    </w:p>
+    <w:p>
+      <w:pPr>
+        <w:spacing w:after="160" w:line="259" w:lineRule="auto"/>
+        <w:rPr>
+          <w:noProof/>
+          <w:lang w:val="nl-NL"/>
+        </w:rPr>
+      </w:pPr>
+      <w:r>
+        <w:rPr>
+          <w:noProof/>
+          <w:lang w:val="nl-NL"/>
+        </w:rPr>
+        <w:br w:type="page"/>
+      </w:r>
+    </w:p>
+    <w:p>
+      <w:pPr>
+        <w:rPr>
+          <w:rFonts w:ascii="Arial" w:eastAsia="Arial" w:hAnsi="Arial"/>
+          <w:color w:val="696969"/>
+          <w:sz w:val="24"/>
           <w:lang w:val="nl-NL"/>
         </w:rPr>
       </w:pPr>
@@ -1099,44 +1289,6 @@
           <w:lang w:val="nl-NL"/>
         </w:rPr>
       </w:pPr>
-    </w:p>
-    <w:p>
-      <w:pPr>
-        <w:rPr>
-          <w:lang w:val="nl-NL"/>
-        </w:rPr>
-      </w:pPr>
-    </w:p>
-    <w:p>
-      <w:pPr>
-        <w:spacing w:after="160" w:line="259" w:lineRule="auto"/>
-        <w:rPr>
-          <w:lang w:val="nl-NL"/>
-        </w:rPr>
-      </w:pPr>
-      <w:r>
-        <w:rPr>
-          <w:lang w:val="nl-NL"/>
-        </w:rPr>
-        <w:br w:type="page"/>
-      </w:r>
-    </w:p>
-    <w:p>
-      <w:pPr>
-        <w:rPr>
-          <w:rFonts w:ascii="Arial" w:eastAsia="Arial" w:hAnsi="Arial"/>
-          <w:color w:val="696969"/>
-          <w:sz w:val="24"/>
-          <w:lang w:val="nl-NL"/>
-        </w:rPr>
-      </w:pPr>
-    </w:p>
-    <w:p>
-      <w:pPr>
-        <w:rPr>
-          <w:lang w:val="nl-NL"/>
-        </w:rPr>
-      </w:pPr>
       <w:r>
         <w:rPr>
           <w:rFonts w:ascii="Arial" w:eastAsia="Arial" w:hAnsi="Arial"/>
@@ -1173,7 +1325,27 @@
           <w:sz w:val="24"/>
           <w:lang w:val="nl-NL"/>
         </w:rPr>
-        <w:t xml:space="preserve">{datum_controle_volledig} </w:t>
+        <w:t>{</w:t>
+      </w:r>
+      <w:proofErr w:type="spellStart"/>
+      <w:r>
+        <w:rPr>
+          <w:rFonts w:ascii="Arial" w:eastAsia="Arial" w:hAnsi="Arial"/>
+          <w:color w:val="696969"/>
+          <w:sz w:val="24"/>
+          <w:lang w:val="nl-NL"/>
+        </w:rPr>
+        <w:t>datum_controle_volledig</w:t>
+      </w:r>
+      <w:proofErr w:type="spellEnd"/>
+      <w:r>
+        <w:rPr>
+          <w:rFonts w:ascii="Arial" w:eastAsia="Arial" w:hAnsi="Arial"/>
+          <w:color w:val="696969"/>
+          <w:sz w:val="24"/>
+          <w:lang w:val="nl-NL"/>
+        </w:rPr>
+        <w:t xml:space="preserve">} </w:t>
       </w:r>
       <w:r>
         <w:rPr>
@@ -1227,7 +1399,27 @@
           <w:sz w:val="24"/>
           <w:lang w:val="nl-NL"/>
         </w:rPr>
-        <w:t xml:space="preserve">{audit_straatnaam} </w:t>
+        <w:t>{</w:t>
+      </w:r>
+      <w:proofErr w:type="spellStart"/>
+      <w:r>
+        <w:rPr>
+          <w:rFonts w:ascii="Arial" w:eastAsia="Arial" w:hAnsi="Arial"/>
+          <w:color w:val="696969"/>
+          <w:sz w:val="24"/>
+          <w:lang w:val="nl-NL"/>
+        </w:rPr>
+        <w:t>audit_straatnaam</w:t>
+      </w:r>
+      <w:proofErr w:type="spellEnd"/>
+      <w:r>
+        <w:rPr>
+          <w:rFonts w:ascii="Arial" w:eastAsia="Arial" w:hAnsi="Arial"/>
+          <w:color w:val="696969"/>
+          <w:sz w:val="24"/>
+          <w:lang w:val="nl-NL"/>
+        </w:rPr>
+        <w:t xml:space="preserve">} </w:t>
       </w:r>
       <w:r>
         <w:rPr>
@@ -1245,7 +1437,27 @@
           <w:sz w:val="24"/>
           <w:lang w:val="nl-NL"/>
         </w:rPr>
-        <w:t>{audit_stad}</w:t>
+        <w:t>{</w:t>
+      </w:r>
+      <w:proofErr w:type="spellStart"/>
+      <w:r>
+        <w:rPr>
+          <w:rFonts w:ascii="Arial" w:eastAsia="Arial" w:hAnsi="Arial"/>
+          <w:color w:val="696969"/>
+          <w:sz w:val="24"/>
+          <w:lang w:val="nl-NL"/>
+        </w:rPr>
+        <w:t>audit_stad</w:t>
+      </w:r>
+      <w:proofErr w:type="spellEnd"/>
+      <w:r>
+        <w:rPr>
+          <w:rFonts w:ascii="Arial" w:eastAsia="Arial" w:hAnsi="Arial"/>
+          <w:color w:val="696969"/>
+          <w:sz w:val="24"/>
+          <w:lang w:val="nl-NL"/>
+        </w:rPr>
+        <w:t>}</w:t>
       </w:r>
       <w:r>
         <w:rPr>
@@ -1291,6 +1503,7 @@
     <w:p>
       <w:pPr>
         <w:spacing w:after="0" w:line="240" w:lineRule="auto"/>
+        <w:jc w:val="center"/>
         <w:rPr>
           <w:rFonts w:ascii="Arial" w:eastAsia="Arial" w:hAnsi="Arial"/>
           <w:color w:val="696969"/>
@@ -1549,7 +1762,27 @@
           <w:sz w:val="24"/>
           <w:lang w:val="nl-NL"/>
         </w:rPr>
-        <w:t>Rapportnummer: {rapport_nummer}</w:t>
+        <w:t>Rapportnummer: {</w:t>
+      </w:r>
+      <w:proofErr w:type="spellStart"/>
+      <w:r>
+        <w:rPr>
+          <w:rFonts w:ascii="Arial" w:eastAsia="Arial" w:hAnsi="Arial"/>
+          <w:color w:val="696969"/>
+          <w:sz w:val="24"/>
+          <w:lang w:val="nl-NL"/>
+        </w:rPr>
+        <w:t>rapport_nummer</w:t>
+      </w:r>
+      <w:proofErr w:type="spellEnd"/>
+      <w:r>
+        <w:rPr>
+          <w:rFonts w:ascii="Arial" w:eastAsia="Arial" w:hAnsi="Arial"/>
+          <w:color w:val="696969"/>
+          <w:sz w:val="24"/>
+          <w:lang w:val="nl-NL"/>
+        </w:rPr>
+        <w:t>}</w:t>
       </w:r>
       <w:r>
         <w:rPr>
@@ -1632,11 +1865,27 @@
         </w:trPr>
         <w:tc>
           <w:tcPr>
-            <w:tcW w:w="5659" w:type="dxa"/>
+            <w:tcW w:w="5395" w:type="dxa"/>
           </w:tcPr>
           <w:p>
             <w:r>
-              <w:t>{aopchart colChart}</w:t>
+              <w:t>{</w:t>
+            </w:r>
+            <w:proofErr w:type="spellStart"/>
+            <w:r>
+              <w:t>aopchart</w:t>
+            </w:r>
+            <w:proofErr w:type="spellEnd"/>
+            <w:r>
+              <w:t xml:space="preserve"> </w:t>
+            </w:r>
+            <w:proofErr w:type="spellStart"/>
+            <w:r>
+              <w:t>colChart</w:t>
+            </w:r>
+            <w:proofErr w:type="spellEnd"/>
+            <w:r>
+              <w:t>}</w:t>
             </w:r>
             <w:r>
               <w:br/>
@@ -1646,7 +1895,7 @@
                 <w:noProof/>
               </w:rPr>
               <w:drawing>
-                <wp:inline distT="0" distB="0" distL="0" distR="0" wp14:anchorId="04278403" wp14:editId="7B001145">
+                <wp:inline distT="0" distB="0" distL="0" distR="0" wp14:anchorId="56A318F5" wp14:editId="4A015DBF">
                   <wp:extent cx="3497580" cy="2199005"/>
                   <wp:effectExtent l="0" t="0" r="7620" b="0"/>
                   <wp:docPr id="34" name="Chart 34"/>
@@ -1670,7 +1919,7 @@
         </w:tc>
         <w:tc>
           <w:tcPr>
-            <w:tcW w:w="5131" w:type="dxa"/>
+            <w:tcW w:w="5395" w:type="dxa"/>
           </w:tcPr>
           <w:p>
             <w:pPr>
@@ -1679,7 +1928,23 @@
               </w:tabs>
             </w:pPr>
             <w:r>
-              <w:t>{aopchart timelineChart}</w:t>
+              <w:t>{</w:t>
+            </w:r>
+            <w:proofErr w:type="spellStart"/>
+            <w:r>
+              <w:t>aopchart</w:t>
+            </w:r>
+            <w:proofErr w:type="spellEnd"/>
+            <w:r>
+              <w:t xml:space="preserve"> </w:t>
+            </w:r>
+            <w:proofErr w:type="spellStart"/>
+            <w:r>
+              <w:t>timelineChart</w:t>
+            </w:r>
+            <w:proofErr w:type="spellEnd"/>
+            <w:r>
+              <w:t>}</w:t>
             </w:r>
             <w:r>
               <w:br/>
@@ -1689,7 +1954,7 @@
                 <w:noProof/>
               </w:rPr>
               <w:drawing>
-                <wp:inline distT="0" distB="0" distL="0" distR="0" wp14:anchorId="4CA38E62" wp14:editId="399A2B6E">
+                <wp:inline distT="0" distB="0" distL="0" distR="0" wp14:anchorId="3176540F" wp14:editId="23839DF7">
                   <wp:extent cx="3165764" cy="2199005"/>
                   <wp:effectExtent l="0" t="0" r="0" b="0"/>
                   <wp:docPr id="1" name="Chart 1"/>
@@ -1711,7 +1976,7 @@
         </w:trPr>
         <w:tc>
           <w:tcPr>
-            <w:tcW w:w="5659" w:type="dxa"/>
+            <w:tcW w:w="5395" w:type="dxa"/>
           </w:tcPr>
           <w:p>
             <w:pPr>
@@ -1742,6 +2007,7 @@
               <w:br/>
               <w:t>Controle {</w:t>
             </w:r>
+            <w:proofErr w:type="spellStart"/>
             <w:r>
               <w:rPr>
                 <w:rFonts w:ascii="Arial" w:eastAsia="Arial" w:hAnsi="Arial"/>
@@ -1751,6 +2017,7 @@
               </w:rPr>
               <w:t>datum_controle_volledig</w:t>
             </w:r>
+            <w:proofErr w:type="spellEnd"/>
             <w:r>
               <w:rPr>
                 <w:rFonts w:ascii="Arial" w:eastAsia="Arial" w:hAnsi="Arial"/>
@@ -1773,14 +2040,30 @@
               <w:rPr>
                 <w:lang w:val="nl-NL"/>
               </w:rPr>
-              <w:t xml:space="preserve">{aopchart </w:t>
-            </w:r>
+              <w:t>{</w:t>
+            </w:r>
+            <w:proofErr w:type="spellStart"/>
             <w:r>
               <w:rPr>
                 <w:lang w:val="nl-NL"/>
               </w:rPr>
+              <w:t>aopchart</w:t>
+            </w:r>
+            <w:proofErr w:type="spellEnd"/>
+            <w:r>
+              <w:rPr>
+                <w:lang w:val="nl-NL"/>
+              </w:rPr>
+              <w:t xml:space="preserve"> </w:t>
+            </w:r>
+            <w:proofErr w:type="spellStart"/>
+            <w:r>
+              <w:rPr>
+                <w:lang w:val="nl-NL"/>
+              </w:rPr>
               <w:t>stockChart</w:t>
             </w:r>
+            <w:proofErr w:type="spellEnd"/>
             <w:r>
               <w:rPr>
                 <w:lang w:val="nl-NL"/>
@@ -1809,7 +2092,7 @@
               <mc:AlternateContent>
                 <mc:Choice Requires="wps">
                   <w:drawing>
-                    <wp:anchor distT="0" distB="0" distL="114300" distR="114300" simplePos="0" relativeHeight="251716608" behindDoc="0" locked="0" layoutInCell="1" allowOverlap="1" wp14:anchorId="47BB59CC" wp14:editId="7970B914">
+                    <wp:anchor distT="0" distB="0" distL="114300" distR="114300" simplePos="0" relativeHeight="251700224" behindDoc="0" locked="0" layoutInCell="1" allowOverlap="1" wp14:anchorId="0B4FD065" wp14:editId="0FFA66FF">
                       <wp:simplePos x="0" y="0"/>
                       <wp:positionH relativeFrom="column">
                         <wp:posOffset>1332172</wp:posOffset>
@@ -1858,6 +2141,7 @@
                                       <w:szCs w:val="10"/>
                                     </w:rPr>
                                   </w:pPr>
+                                  <w:proofErr w:type="spellStart"/>
                                   <w:r>
                                     <w:rPr>
                                       <w:rFonts w:ascii="Arial" w:hAnsi="Arial" w:cs="Arial"/>
@@ -1867,7 +2151,19 @@
                                       <w:sz w:val="10"/>
                                       <w:szCs w:val="10"/>
                                     </w:rPr>
-                                    <w:t xml:space="preserve">Dicht </w:t>
+                                    <w:t>Dicht</w:t>
+                                  </w:r>
+                                  <w:proofErr w:type="spellEnd"/>
+                                  <w:r>
+                                    <w:rPr>
+                                      <w:rFonts w:ascii="Arial" w:hAnsi="Arial" w:cs="Arial"/>
+                                      <w:b/>
+                                      <w:bCs/>
+                                      <w:color w:val="FFFFFF" w:themeColor="background1"/>
+                                      <w:sz w:val="10"/>
+                                      <w:szCs w:val="10"/>
+                                    </w:rPr>
+                                    <w:t xml:space="preserve"> </w:t>
                                   </w:r>
                                   <w:r>
                                     <w:rPr>
@@ -1879,8 +2175,20 @@
                                       <w:szCs w:val="10"/>
                                     </w:rPr>
                                     <w:br/>
+                                  </w:r>
+                                  <w:proofErr w:type="spellStart"/>
+                                  <w:r>
+                                    <w:rPr>
+                                      <w:rFonts w:ascii="Arial" w:hAnsi="Arial" w:cs="Arial"/>
+                                      <w:b/>
+                                      <w:bCs/>
+                                      <w:color w:val="FFFFFF" w:themeColor="background1"/>
+                                      <w:sz w:val="10"/>
+                                      <w:szCs w:val="10"/>
+                                    </w:rPr>
                                     <w:t>stof</w:t>
                                   </w:r>
+                                  <w:proofErr w:type="spellEnd"/>
                                 </w:p>
                               </w:txbxContent>
                             </wps:txbx>
@@ -1904,7 +2212,7 @@
                 </mc:Choice>
                 <mc:Fallback>
                   <w:pict>
-                    <v:shape w14:anchorId="47BB59CC" id="Text Box 13" o:spid="_x0000_s1028" type="#_x0000_t202" style="position:absolute;margin-left:104.9pt;margin-top:251.15pt;width:24.3pt;height:28.8pt;z-index:251716608;visibility:visible;mso-wrap-style:square;mso-width-percent:0;mso-height-percent:0;mso-wrap-distance-left:9pt;mso-wrap-distance-top:0;mso-wrap-distance-right:9pt;mso-wrap-distance-bottom:0;mso-position-horizontal:absolute;mso-position-horizontal-relative:text;mso-position-vertical:absolute;mso-position-vertical-relative:text;mso-width-percent:0;mso-height-percent:0;mso-width-relative:margin;mso-height-relative:margin;v-text-anchor:middle" o:gfxdata="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" fillcolor="#689c9a" strokecolor="#868686" strokeweight=".5pt">
+                    <v:shape w14:anchorId="0B4FD065" id="Text Box 13" o:spid="_x0000_s1028" type="#_x0000_t202" style="position:absolute;margin-left:104.9pt;margin-top:251.15pt;width:24.3pt;height:28.8pt;z-index:251700224;visibility:visible;mso-wrap-style:square;mso-width-percent:0;mso-height-percent:0;mso-wrap-distance-left:9pt;mso-wrap-distance-top:0;mso-wrap-distance-right:9pt;mso-wrap-distance-bottom:0;mso-position-horizontal:absolute;mso-position-horizontal-relative:text;mso-position-vertical:absolute;mso-position-vertical-relative:text;mso-width-percent:0;mso-height-percent:0;mso-width-relative:margin;mso-height-relative:margin;v-text-anchor:middle" o:gfxdata="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" fillcolor="#689c9a" strokecolor="#868686" strokeweight=".5pt">
                       <v:textbox inset="0,0,0,0">
                         <w:txbxContent>
                           <w:p>
@@ -1920,6 +2228,7 @@
                                 <w:szCs w:val="10"/>
                               </w:rPr>
                             </w:pPr>
+                            <w:proofErr w:type="spellStart"/>
                             <w:r>
                               <w:rPr>
                                 <w:rFonts w:ascii="Arial" w:hAnsi="Arial" w:cs="Arial"/>
@@ -1929,7 +2238,19 @@
                                 <w:sz w:val="10"/>
                                 <w:szCs w:val="10"/>
                               </w:rPr>
-                              <w:t xml:space="preserve">Dicht </w:t>
+                              <w:t>Dicht</w:t>
+                            </w:r>
+                            <w:proofErr w:type="spellEnd"/>
+                            <w:r>
+                              <w:rPr>
+                                <w:rFonts w:ascii="Arial" w:hAnsi="Arial" w:cs="Arial"/>
+                                <w:b/>
+                                <w:bCs/>
+                                <w:color w:val="FFFFFF" w:themeColor="background1"/>
+                                <w:sz w:val="10"/>
+                                <w:szCs w:val="10"/>
+                              </w:rPr>
+                              <w:t xml:space="preserve"> </w:t>
                             </w:r>
                             <w:r>
                               <w:rPr>
@@ -1941,8 +2262,20 @@
                                 <w:szCs w:val="10"/>
                               </w:rPr>
                               <w:br/>
+                            </w:r>
+                            <w:proofErr w:type="spellStart"/>
+                            <w:r>
+                              <w:rPr>
+                                <w:rFonts w:ascii="Arial" w:hAnsi="Arial" w:cs="Arial"/>
+                                <w:b/>
+                                <w:bCs/>
+                                <w:color w:val="FFFFFF" w:themeColor="background1"/>
+                                <w:sz w:val="10"/>
+                                <w:szCs w:val="10"/>
+                              </w:rPr>
                               <w:t>stof</w:t>
                             </w:r>
+                            <w:proofErr w:type="spellEnd"/>
                           </w:p>
                         </w:txbxContent>
                       </v:textbox>
@@ -1962,7 +2295,7 @@
               <mc:AlternateContent>
                 <mc:Choice Requires="wps">
                   <w:drawing>
-                    <wp:anchor distT="0" distB="0" distL="114300" distR="114300" simplePos="0" relativeHeight="251718656" behindDoc="0" locked="0" layoutInCell="1" allowOverlap="1" wp14:anchorId="74792987" wp14:editId="673B0438">
+                    <wp:anchor distT="0" distB="0" distL="114300" distR="114300" simplePos="0" relativeHeight="251702272" behindDoc="0" locked="0" layoutInCell="1" allowOverlap="1" wp14:anchorId="144DEFE0" wp14:editId="0CF81070">
                       <wp:simplePos x="0" y="0"/>
                       <wp:positionH relativeFrom="column">
                         <wp:posOffset>2968224</wp:posOffset>
@@ -2011,6 +2344,7 @@
                                       <w:szCs w:val="10"/>
                                     </w:rPr>
                                   </w:pPr>
+                                  <w:proofErr w:type="spellStart"/>
                                   <w:r>
                                     <w:rPr>
                                       <w:rFonts w:ascii="Arial" w:hAnsi="Arial" w:cs="Arial"/>
@@ -2022,6 +2356,7 @@
                                     </w:rPr>
                                     <w:t>Spinrag</w:t>
                                   </w:r>
+                                  <w:proofErr w:type="spellEnd"/>
                                 </w:p>
                               </w:txbxContent>
                             </wps:txbx>
@@ -2045,7 +2380,7 @@
                 </mc:Choice>
                 <mc:Fallback>
                   <w:pict>
-                    <v:shape w14:anchorId="74792987" id="Text Box 16" o:spid="_x0000_s1029" type="#_x0000_t202" style="position:absolute;margin-left:233.7pt;margin-top:251.3pt;width:25.9pt;height:28.8pt;z-index:251718656;visibility:visible;mso-wrap-style:square;mso-width-percent:0;mso-height-percent:0;mso-wrap-distance-left:9pt;mso-wrap-distance-top:0;mso-wrap-distance-right:9pt;mso-wrap-distance-bottom:0;mso-position-horizontal:absolute;mso-position-horizontal-relative:text;mso-position-vertical:absolute;mso-position-vertical-relative:text;mso-width-percent:0;mso-height-percent:0;mso-width-relative:margin;mso-height-relative:margin;v-text-anchor:middle" o:gfxdata="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" fillcolor="#a9a57c" strokecolor="#868686" strokeweight=".5pt">
+                    <v:shape w14:anchorId="144DEFE0" id="Text Box 16" o:spid="_x0000_s1029" type="#_x0000_t202" style="position:absolute;margin-left:233.7pt;margin-top:251.3pt;width:25.9pt;height:28.8pt;z-index:251702272;visibility:visible;mso-wrap-style:square;mso-width-percent:0;mso-height-percent:0;mso-wrap-distance-left:9pt;mso-wrap-distance-top:0;mso-wrap-distance-right:9pt;mso-wrap-distance-bottom:0;mso-position-horizontal:absolute;mso-position-horizontal-relative:text;mso-position-vertical:absolute;mso-position-vertical-relative:text;mso-width-percent:0;mso-height-percent:0;mso-width-relative:margin;mso-height-relative:margin;v-text-anchor:middle" o:gfxdata="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" fillcolor="#a9a57c" strokecolor="#868686" strokeweight=".5pt">
                       <v:textbox inset="0,0,0,0">
                         <w:txbxContent>
                           <w:p>
@@ -2061,6 +2396,7 @@
                                 <w:szCs w:val="10"/>
                               </w:rPr>
                             </w:pPr>
+                            <w:proofErr w:type="spellStart"/>
                             <w:r>
                               <w:rPr>
                                 <w:rFonts w:ascii="Arial" w:hAnsi="Arial" w:cs="Arial"/>
@@ -2072,6 +2408,7 @@
                               </w:rPr>
                               <w:t>Spinrag</w:t>
                             </w:r>
+                            <w:proofErr w:type="spellEnd"/>
                           </w:p>
                         </w:txbxContent>
                       </v:textbox>
@@ -2091,7 +2428,7 @@
               <mc:AlternateContent>
                 <mc:Choice Requires="wps">
                   <w:drawing>
-                    <wp:anchor distT="0" distB="0" distL="114300" distR="114300" simplePos="0" relativeHeight="251717632" behindDoc="0" locked="0" layoutInCell="1" allowOverlap="1" wp14:anchorId="5E1DD300" wp14:editId="39348E1A">
+                    <wp:anchor distT="0" distB="0" distL="114300" distR="114300" simplePos="0" relativeHeight="251701248" behindDoc="0" locked="0" layoutInCell="1" allowOverlap="1" wp14:anchorId="239B44AC" wp14:editId="16A645DD">
                       <wp:simplePos x="0" y="0"/>
                       <wp:positionH relativeFrom="column">
                         <wp:posOffset>2609282</wp:posOffset>
@@ -2140,6 +2477,7 @@
                                       <w:szCs w:val="10"/>
                                     </w:rPr>
                                   </w:pPr>
+                                  <w:proofErr w:type="spellStart"/>
                                   <w:r>
                                     <w:rPr>
                                       <w:rFonts w:ascii="Arial" w:hAnsi="Arial" w:cs="Arial"/>
@@ -2149,8 +2487,33 @@
                                       <w:sz w:val="10"/>
                                       <w:szCs w:val="10"/>
                                     </w:rPr>
-                                    <w:t>Niet geleegd</w:t>
+                                    <w:t>Niet</w:t>
                                   </w:r>
+                                  <w:proofErr w:type="spellEnd"/>
+                                  <w:r>
+                                    <w:rPr>
+                                      <w:rFonts w:ascii="Arial" w:hAnsi="Arial" w:cs="Arial"/>
+                                      <w:b/>
+                                      <w:bCs/>
+                                      <w:color w:val="FFFFFF" w:themeColor="background1"/>
+                                      <w:sz w:val="10"/>
+                                      <w:szCs w:val="10"/>
+                                    </w:rPr>
+                                    <w:t xml:space="preserve"> </w:t>
+                                  </w:r>
+                                  <w:proofErr w:type="spellStart"/>
+                                  <w:r>
+                                    <w:rPr>
+                                      <w:rFonts w:ascii="Arial" w:hAnsi="Arial" w:cs="Arial"/>
+                                      <w:b/>
+                                      <w:bCs/>
+                                      <w:color w:val="FFFFFF" w:themeColor="background1"/>
+                                      <w:sz w:val="10"/>
+                                      <w:szCs w:val="10"/>
+                                    </w:rPr>
+                                    <w:t>geleegd</w:t>
+                                  </w:r>
+                                  <w:proofErr w:type="spellEnd"/>
                                 </w:p>
                               </w:txbxContent>
                             </wps:txbx>
@@ -2174,7 +2537,7 @@
                 </mc:Choice>
                 <mc:Fallback>
                   <w:pict>
-                    <v:shape w14:anchorId="5E1DD300" id="Text Box 14" o:spid="_x0000_s1030" type="#_x0000_t202" style="position:absolute;margin-left:205.45pt;margin-top:251.3pt;width:28.4pt;height:28.8pt;z-index:251717632;visibility:visible;mso-wrap-style:square;mso-width-percent:0;mso-height-percent:0;mso-wrap-distance-left:9pt;mso-wrap-distance-top:0;mso-wrap-distance-right:9pt;mso-wrap-distance-bottom:0;mso-position-horizontal:absolute;mso-position-horizontal-relative:text;mso-position-vertical:absolute;mso-position-vertical-relative:text;mso-width-percent:0;mso-height-percent:0;mso-width-relative:margin;mso-height-relative:margin;v-text-anchor:middle" o:gfxdata="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" fillcolor="#a9a57c" strokecolor="#868686" strokeweight=".5pt">
+                    <v:shape w14:anchorId="239B44AC" id="Text Box 14" o:spid="_x0000_s1030" type="#_x0000_t202" style="position:absolute;margin-left:205.45pt;margin-top:251.3pt;width:28.4pt;height:28.8pt;z-index:251701248;visibility:visible;mso-wrap-style:square;mso-width-percent:0;mso-height-percent:0;mso-wrap-distance-left:9pt;mso-wrap-distance-top:0;mso-wrap-distance-right:9pt;mso-wrap-distance-bottom:0;mso-position-horizontal:absolute;mso-position-horizontal-relative:text;mso-position-vertical:absolute;mso-position-vertical-relative:text;mso-width-percent:0;mso-height-percent:0;mso-width-relative:margin;mso-height-relative:margin;v-text-anchor:middle" o:gfxdata="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" fillcolor="#a9a57c" strokecolor="#868686" strokeweight=".5pt">
                       <v:textbox inset="0,0,0,0">
                         <w:txbxContent>
                           <w:p>
@@ -2190,6 +2553,7 @@
                                 <w:szCs w:val="10"/>
                               </w:rPr>
                             </w:pPr>
+                            <w:proofErr w:type="spellStart"/>
                             <w:r>
                               <w:rPr>
                                 <w:rFonts w:ascii="Arial" w:hAnsi="Arial" w:cs="Arial"/>
@@ -2199,8 +2563,33 @@
                                 <w:sz w:val="10"/>
                                 <w:szCs w:val="10"/>
                               </w:rPr>
-                              <w:t>Niet geleegd</w:t>
+                              <w:t>Niet</w:t>
                             </w:r>
+                            <w:proofErr w:type="spellEnd"/>
+                            <w:r>
+                              <w:rPr>
+                                <w:rFonts w:ascii="Arial" w:hAnsi="Arial" w:cs="Arial"/>
+                                <w:b/>
+                                <w:bCs/>
+                                <w:color w:val="FFFFFF" w:themeColor="background1"/>
+                                <w:sz w:val="10"/>
+                                <w:szCs w:val="10"/>
+                              </w:rPr>
+                              <w:t xml:space="preserve"> </w:t>
+                            </w:r>
+                            <w:proofErr w:type="spellStart"/>
+                            <w:r>
+                              <w:rPr>
+                                <w:rFonts w:ascii="Arial" w:hAnsi="Arial" w:cs="Arial"/>
+                                <w:b/>
+                                <w:bCs/>
+                                <w:color w:val="FFFFFF" w:themeColor="background1"/>
+                                <w:sz w:val="10"/>
+                                <w:szCs w:val="10"/>
+                              </w:rPr>
+                              <w:t>geleegd</w:t>
+                            </w:r>
+                            <w:proofErr w:type="spellEnd"/>
                           </w:p>
                         </w:txbxContent>
                       </v:textbox>
@@ -2220,7 +2609,7 @@
               <mc:AlternateContent>
                 <mc:Choice Requires="wps">
                   <w:drawing>
-                    <wp:anchor distT="0" distB="0" distL="114300" distR="114300" simplePos="0" relativeHeight="251713536" behindDoc="0" locked="0" layoutInCell="1" allowOverlap="1" wp14:anchorId="303C52E3" wp14:editId="1544A755">
+                    <wp:anchor distT="0" distB="0" distL="114300" distR="114300" simplePos="0" relativeHeight="251697152" behindDoc="0" locked="0" layoutInCell="1" allowOverlap="1" wp14:anchorId="03D2FECA" wp14:editId="50853425">
                       <wp:simplePos x="0" y="0"/>
                       <wp:positionH relativeFrom="column">
                         <wp:posOffset>1014095</wp:posOffset>
@@ -2269,6 +2658,7 @@
                                       <w:szCs w:val="10"/>
                                     </w:rPr>
                                   </w:pPr>
+                                  <w:proofErr w:type="spellStart"/>
                                   <w:r>
                                     <w:rPr>
                                       <w:rFonts w:ascii="Arial" w:hAnsi="Arial" w:cs="Arial"/>
@@ -2280,6 +2670,7 @@
                                     </w:rPr>
                                     <w:t>Aanslag</w:t>
                                   </w:r>
+                                  <w:proofErr w:type="spellEnd"/>
                                 </w:p>
                               </w:txbxContent>
                             </wps:txbx>
@@ -2303,7 +2694,7 @@
                 </mc:Choice>
                 <mc:Fallback>
                   <w:pict>
-                    <v:shape w14:anchorId="303C52E3" id="Text Box 9" o:spid="_x0000_s1031" type="#_x0000_t202" style="position:absolute;margin-left:79.85pt;margin-top:251.2pt;width:25.8pt;height:28.8pt;z-index:251713536;visibility:visible;mso-wrap-style:square;mso-width-percent:0;mso-height-percent:0;mso-wrap-distance-left:9pt;mso-wrap-distance-top:0;mso-wrap-distance-right:9pt;mso-wrap-distance-bottom:0;mso-position-horizontal:absolute;mso-position-horizontal-relative:text;mso-position-vertical:absolute;mso-position-vertical-relative:text;mso-width-percent:0;mso-height-percent:0;mso-width-relative:margin;mso-height-relative:margin;v-text-anchor:middle" o:gfxdata="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" fillcolor="#689c9a" strokecolor="#868686" strokeweight=".5pt">
+                    <v:shape w14:anchorId="03D2FECA" id="Text Box 9" o:spid="_x0000_s1031" type="#_x0000_t202" style="position:absolute;margin-left:79.85pt;margin-top:251.2pt;width:25.8pt;height:28.8pt;z-index:251697152;visibility:visible;mso-wrap-style:square;mso-width-percent:0;mso-height-percent:0;mso-wrap-distance-left:9pt;mso-wrap-distance-top:0;mso-wrap-distance-right:9pt;mso-wrap-distance-bottom:0;mso-position-horizontal:absolute;mso-position-horizontal-relative:text;mso-position-vertical:absolute;mso-position-vertical-relative:text;mso-width-percent:0;mso-height-percent:0;mso-width-relative:margin;mso-height-relative:margin;v-text-anchor:middle" o:gfxdata="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" fillcolor="#689c9a" strokecolor="#868686" strokeweight=".5pt">
                       <v:textbox inset="0,0,0,0">
                         <w:txbxContent>
                           <w:p>
@@ -2319,6 +2710,7 @@
                                 <w:szCs w:val="10"/>
                               </w:rPr>
                             </w:pPr>
+                            <w:proofErr w:type="spellStart"/>
                             <w:r>
                               <w:rPr>
                                 <w:rFonts w:ascii="Arial" w:hAnsi="Arial" w:cs="Arial"/>
@@ -2330,6 +2722,7 @@
                               </w:rPr>
                               <w:t>Aanslag</w:t>
                             </w:r>
+                            <w:proofErr w:type="spellEnd"/>
                           </w:p>
                         </w:txbxContent>
                       </v:textbox>
@@ -2349,7 +2742,7 @@
               <mc:AlternateContent>
                 <mc:Choice Requires="wps">
                   <w:drawing>
-                    <wp:anchor distT="0" distB="0" distL="114300" distR="114300" simplePos="0" relativeHeight="251712512" behindDoc="0" locked="0" layoutInCell="1" allowOverlap="1" wp14:anchorId="05D42BB1" wp14:editId="379CE78A">
+                    <wp:anchor distT="0" distB="0" distL="114300" distR="114300" simplePos="0" relativeHeight="251696128" behindDoc="0" locked="0" layoutInCell="1" allowOverlap="1" wp14:anchorId="212E4217" wp14:editId="06AA2D3F">
                       <wp:simplePos x="0" y="0"/>
                       <wp:positionH relativeFrom="column">
                         <wp:posOffset>350520</wp:posOffset>
@@ -2397,6 +2790,7 @@
                                       <w:szCs w:val="10"/>
                                     </w:rPr>
                                   </w:pPr>
+                                  <w:proofErr w:type="spellStart"/>
                                   <w:r>
                                     <w:rPr>
                                       <w:rFonts w:ascii="Arial" w:hAnsi="Arial" w:cs="Arial"/>
@@ -2406,8 +2800,105 @@
                                       <w:sz w:val="10"/>
                                       <w:szCs w:val="10"/>
                                     </w:rPr>
-                                    <w:t>Niet gehecht vuil licht stof</w:t>
+                                    <w:t>Niet</w:t>
                                   </w:r>
+                                  <w:proofErr w:type="spellEnd"/>
+                                  <w:r>
+                                    <w:rPr>
+                                      <w:rFonts w:ascii="Arial" w:hAnsi="Arial" w:cs="Arial"/>
+                                      <w:b/>
+                                      <w:bCs/>
+                                      <w:color w:val="FFFFFF" w:themeColor="background1"/>
+                                      <w:sz w:val="10"/>
+                                      <w:szCs w:val="10"/>
+                                    </w:rPr>
+                                    <w:t xml:space="preserve"> </w:t>
+                                  </w:r>
+                                  <w:proofErr w:type="spellStart"/>
+                                  <w:r>
+                                    <w:rPr>
+                                      <w:rFonts w:ascii="Arial" w:hAnsi="Arial" w:cs="Arial"/>
+                                      <w:b/>
+                                      <w:bCs/>
+                                      <w:color w:val="FFFFFF" w:themeColor="background1"/>
+                                      <w:sz w:val="10"/>
+                                      <w:szCs w:val="10"/>
+                                    </w:rPr>
+                                    <w:t>gehecht</w:t>
+                                  </w:r>
+                                  <w:proofErr w:type="spellEnd"/>
+                                  <w:r>
+                                    <w:rPr>
+                                      <w:rFonts w:ascii="Arial" w:hAnsi="Arial" w:cs="Arial"/>
+                                      <w:b/>
+                                      <w:bCs/>
+                                      <w:color w:val="FFFFFF" w:themeColor="background1"/>
+                                      <w:sz w:val="10"/>
+                                      <w:szCs w:val="10"/>
+                                    </w:rPr>
+                                    <w:t xml:space="preserve"> </w:t>
+                                  </w:r>
+                                  <w:proofErr w:type="spellStart"/>
+                                  <w:r>
+                                    <w:rPr>
+                                      <w:rFonts w:ascii="Arial" w:hAnsi="Arial" w:cs="Arial"/>
+                                      <w:b/>
+                                      <w:bCs/>
+                                      <w:color w:val="FFFFFF" w:themeColor="background1"/>
+                                      <w:sz w:val="10"/>
+                                      <w:szCs w:val="10"/>
+                                    </w:rPr>
+                                    <w:t>vuil</w:t>
+                                  </w:r>
+                                  <w:proofErr w:type="spellEnd"/>
+                                  <w:r>
+                                    <w:rPr>
+                                      <w:rFonts w:ascii="Arial" w:hAnsi="Arial" w:cs="Arial"/>
+                                      <w:b/>
+                                      <w:bCs/>
+                                      <w:color w:val="FFFFFF" w:themeColor="background1"/>
+                                      <w:sz w:val="10"/>
+                                      <w:szCs w:val="10"/>
+                                    </w:rPr>
+                                    <w:t xml:space="preserve"> </w:t>
+                                  </w:r>
+                                  <w:proofErr w:type="spellStart"/>
+                                  <w:r>
+                                    <w:rPr>
+                                      <w:rFonts w:ascii="Arial" w:hAnsi="Arial" w:cs="Arial"/>
+                                      <w:b/>
+                                      <w:bCs/>
+                                      <w:color w:val="FFFFFF" w:themeColor="background1"/>
+                                      <w:sz w:val="10"/>
+                                      <w:szCs w:val="10"/>
+                                    </w:rPr>
+                                    <w:t>licht</w:t>
+                                  </w:r>
+                                  <w:proofErr w:type="spellEnd"/>
+                                  <w:r>
+                                    <w:rPr>
+                                      <w:rFonts w:ascii="Arial" w:hAnsi="Arial" w:cs="Arial"/>
+                                      <w:b/>
+                                      <w:bCs/>
+                                      <w:color w:val="FFFFFF" w:themeColor="background1"/>
+                                      <w:sz w:val="10"/>
+                                      <w:szCs w:val="10"/>
+                                    </w:rPr>
+                                    <w:t xml:space="preserve"> </w:t>
+                                  </w:r>
+                                  <w:proofErr w:type="spellStart"/>
+                                  <w:r>
+                                    <w:rPr>
+                                      <w:rFonts w:ascii="Arial" w:hAnsi="Arial" w:cs="Arial"/>
+                                      <w:b/>
+                                      <w:bCs/>
+                                      <w:color w:val="FFFFFF" w:themeColor="background1"/>
+                                      <w:sz w:val="10"/>
+                                      <w:szCs w:val="10"/>
+                                    </w:rPr>
+                                    <w:t>stof</w:t>
+                                  </w:r>
+                                  <w:proofErr w:type="spellEnd"/>
                                 </w:p>
                               </w:txbxContent>
                             </wps:txbx>
@@ -2431,7 +2922,7 @@
                 </mc:Choice>
                 <mc:Fallback>
                   <w:pict>
-                    <v:shape w14:anchorId="05D42BB1" id="Text Box 8" o:spid="_x0000_s1032" type="#_x0000_t202" style="position:absolute;margin-left:27.6pt;margin-top:251.25pt;width:26.6pt;height:28.8pt;z-index:251712512;visibility:visible;mso-wrap-style:square;mso-width-percent:0;mso-height-percent:0;mso-wrap-distance-left:9pt;mso-wrap-distance-top:0;mso-wrap-distance-right:9pt;mso-wrap-distance-bottom:0;mso-position-horizontal:absolute;mso-position-horizontal-relative:text;mso-position-vertical:absolute;mso-position-vertical-relative:text;mso-width-percent:0;mso-height-percent:0;mso-width-relative:margin;mso-height-relative:margin;v-text-anchor:middle" o:gfxdata="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" fillcolor="#b7ae38" strokecolor="#868686" strokeweight=".5pt">
+                    <v:shape w14:anchorId="212E4217" id="Text Box 8" o:spid="_x0000_s1032" type="#_x0000_t202" style="position:absolute;margin-left:27.6pt;margin-top:251.25pt;width:26.6pt;height:28.8pt;z-index:251696128;visibility:visible;mso-wrap-style:square;mso-width-percent:0;mso-height-percent:0;mso-wrap-distance-left:9pt;mso-wrap-distance-top:0;mso-wrap-distance-right:9pt;mso-wrap-distance-bottom:0;mso-position-horizontal:absolute;mso-position-horizontal-relative:text;mso-position-vertical:absolute;mso-position-vertical-relative:text;mso-width-percent:0;mso-height-percent:0;mso-width-relative:margin;mso-height-relative:margin;v-text-anchor:middle" o:gfxdata="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" fillcolor="#b7ae38" strokecolor="#868686" strokeweight=".5pt">
                       <v:textbox inset="0,0,0,0">
                         <w:txbxContent>
                           <w:p>
@@ -2446,6 +2937,7 @@
                                 <w:szCs w:val="10"/>
                               </w:rPr>
                             </w:pPr>
+                            <w:proofErr w:type="spellStart"/>
                             <w:r>
                               <w:rPr>
                                 <w:rFonts w:ascii="Arial" w:hAnsi="Arial" w:cs="Arial"/>
@@ -2455,8 +2947,105 @@
                                 <w:sz w:val="10"/>
                                 <w:szCs w:val="10"/>
                               </w:rPr>
-                              <w:t>Niet gehecht vuil licht stof</w:t>
+                              <w:t>Niet</w:t>
                             </w:r>
+                            <w:proofErr w:type="spellEnd"/>
+                            <w:r>
+                              <w:rPr>
+                                <w:rFonts w:ascii="Arial" w:hAnsi="Arial" w:cs="Arial"/>
+                                <w:b/>
+                                <w:bCs/>
+                                <w:color w:val="FFFFFF" w:themeColor="background1"/>
+                                <w:sz w:val="10"/>
+                                <w:szCs w:val="10"/>
+                              </w:rPr>
+                              <w:t xml:space="preserve"> </w:t>
+                            </w:r>
+                            <w:proofErr w:type="spellStart"/>
+                            <w:r>
+                              <w:rPr>
+                                <w:rFonts w:ascii="Arial" w:hAnsi="Arial" w:cs="Arial"/>
+                                <w:b/>
+                                <w:bCs/>
+                                <w:color w:val="FFFFFF" w:themeColor="background1"/>
+                                <w:sz w:val="10"/>
+                                <w:szCs w:val="10"/>
+                              </w:rPr>
+                              <w:t>gehecht</w:t>
+                            </w:r>
+                            <w:proofErr w:type="spellEnd"/>
+                            <w:r>
+                              <w:rPr>
+                                <w:rFonts w:ascii="Arial" w:hAnsi="Arial" w:cs="Arial"/>
+                                <w:b/>
+                                <w:bCs/>
+                                <w:color w:val="FFFFFF" w:themeColor="background1"/>
+                                <w:sz w:val="10"/>
+                                <w:szCs w:val="10"/>
+                              </w:rPr>
+                              <w:t xml:space="preserve"> </w:t>
+                            </w:r>
+                            <w:proofErr w:type="spellStart"/>
+                            <w:r>
+                              <w:rPr>
+                                <w:rFonts w:ascii="Arial" w:hAnsi="Arial" w:cs="Arial"/>
+                                <w:b/>
+                                <w:bCs/>
+                                <w:color w:val="FFFFFF" w:themeColor="background1"/>
+                                <w:sz w:val="10"/>
+                                <w:szCs w:val="10"/>
+                              </w:rPr>
+                              <w:t>vuil</w:t>
+                            </w:r>
+                            <w:proofErr w:type="spellEnd"/>
+                            <w:r>
+                              <w:rPr>
+                                <w:rFonts w:ascii="Arial" w:hAnsi="Arial" w:cs="Arial"/>
+                                <w:b/>
+                                <w:bCs/>
+                                <w:color w:val="FFFFFF" w:themeColor="background1"/>
+                                <w:sz w:val="10"/>
+                                <w:szCs w:val="10"/>
+                              </w:rPr>
+                              <w:t xml:space="preserve"> </w:t>
+                            </w:r>
+                            <w:proofErr w:type="spellStart"/>
+                            <w:r>
+                              <w:rPr>
+                                <w:rFonts w:ascii="Arial" w:hAnsi="Arial" w:cs="Arial"/>
+                                <w:b/>
+                                <w:bCs/>
+                                <w:color w:val="FFFFFF" w:themeColor="background1"/>
+                                <w:sz w:val="10"/>
+                                <w:szCs w:val="10"/>
+                              </w:rPr>
+                              <w:t>licht</w:t>
+                            </w:r>
+                            <w:proofErr w:type="spellEnd"/>
+                            <w:r>
+                              <w:rPr>
+                                <w:rFonts w:ascii="Arial" w:hAnsi="Arial" w:cs="Arial"/>
+                                <w:b/>
+                                <w:bCs/>
+                                <w:color w:val="FFFFFF" w:themeColor="background1"/>
+                                <w:sz w:val="10"/>
+                                <w:szCs w:val="10"/>
+                              </w:rPr>
+                              <w:t xml:space="preserve"> </w:t>
+                            </w:r>
+                            <w:proofErr w:type="spellStart"/>
+                            <w:r>
+                              <w:rPr>
+                                <w:rFonts w:ascii="Arial" w:hAnsi="Arial" w:cs="Arial"/>
+                                <w:b/>
+                                <w:bCs/>
+                                <w:color w:val="FFFFFF" w:themeColor="background1"/>
+                                <w:sz w:val="10"/>
+                                <w:szCs w:val="10"/>
+                              </w:rPr>
+                              <w:t>stof</w:t>
+                            </w:r>
+                            <w:proofErr w:type="spellEnd"/>
                           </w:p>
                         </w:txbxContent>
                       </v:textbox>
@@ -2476,7 +3065,7 @@
               <mc:AlternateContent>
                 <mc:Choice Requires="wps">
                   <w:drawing>
-                    <wp:anchor distT="0" distB="0" distL="114300" distR="114300" simplePos="0" relativeHeight="251711488" behindDoc="0" locked="0" layoutInCell="1" allowOverlap="1" wp14:anchorId="196B627E" wp14:editId="47AE2895">
+                    <wp:anchor distT="0" distB="0" distL="114300" distR="114300" simplePos="0" relativeHeight="251695104" behindDoc="0" locked="0" layoutInCell="1" allowOverlap="1" wp14:anchorId="499688E7" wp14:editId="2F0ED68B">
                       <wp:simplePos x="0" y="0"/>
                       <wp:positionH relativeFrom="column">
                         <wp:posOffset>685165</wp:posOffset>
@@ -2525,6 +3114,7 @@
                                       <w:szCs w:val="10"/>
                                     </w:rPr>
                                   </w:pPr>
+                                  <w:proofErr w:type="spellStart"/>
                                   <w:r>
                                     <w:rPr>
                                       <w:rFonts w:ascii="Arial" w:hAnsi="Arial" w:cs="Arial"/>
@@ -2534,8 +3124,81 @@
                                       <w:sz w:val="10"/>
                                       <w:szCs w:val="10"/>
                                     </w:rPr>
-                                    <w:t>Niet gehecht vuil methode</w:t>
+                                    <w:t>Niet</w:t>
                                   </w:r>
+                                  <w:proofErr w:type="spellEnd"/>
+                                  <w:r>
+                                    <w:rPr>
+                                      <w:rFonts w:ascii="Arial" w:hAnsi="Arial" w:cs="Arial"/>
+                                      <w:b/>
+                                      <w:bCs/>
+                                      <w:color w:val="FFFFFF" w:themeColor="background1"/>
+                                      <w:sz w:val="10"/>
+                                      <w:szCs w:val="10"/>
+                                    </w:rPr>
+                                    <w:t xml:space="preserve"> </w:t>
+                                  </w:r>
+                                  <w:proofErr w:type="spellStart"/>
+                                  <w:r>
+                                    <w:rPr>
+                                      <w:rFonts w:ascii="Arial" w:hAnsi="Arial" w:cs="Arial"/>
+                                      <w:b/>
+                                      <w:bCs/>
+                                      <w:color w:val="FFFFFF" w:themeColor="background1"/>
+                                      <w:sz w:val="10"/>
+                                      <w:szCs w:val="10"/>
+                                    </w:rPr>
+                                    <w:t>gehecht</w:t>
+                                  </w:r>
+                                  <w:proofErr w:type="spellEnd"/>
+                                  <w:r>
+                                    <w:rPr>
+                                      <w:rFonts w:ascii="Arial" w:hAnsi="Arial" w:cs="Arial"/>
+                                      <w:b/>
+                                      <w:bCs/>
+                                      <w:color w:val="FFFFFF" w:themeColor="background1"/>
+                                      <w:sz w:val="10"/>
+                                      <w:szCs w:val="10"/>
+                                    </w:rPr>
+                                    <w:t xml:space="preserve"> </w:t>
+                                  </w:r>
+                                  <w:proofErr w:type="spellStart"/>
+                                  <w:r>
+                                    <w:rPr>
+                                      <w:rFonts w:ascii="Arial" w:hAnsi="Arial" w:cs="Arial"/>
+                                      <w:b/>
+                                      <w:bCs/>
+                                      <w:color w:val="FFFFFF" w:themeColor="background1"/>
+                                      <w:sz w:val="10"/>
+                                      <w:szCs w:val="10"/>
+                                    </w:rPr>
+                                    <w:t>vuil</w:t>
+                                  </w:r>
+                                  <w:proofErr w:type="spellEnd"/>
+                                  <w:r>
+                                    <w:rPr>
+                                      <w:rFonts w:ascii="Arial" w:hAnsi="Arial" w:cs="Arial"/>
+                                      <w:b/>
+                                      <w:bCs/>
+                                      <w:color w:val="FFFFFF" w:themeColor="background1"/>
+                                      <w:sz w:val="10"/>
+                                      <w:szCs w:val="10"/>
+                                    </w:rPr>
+                                    <w:t xml:space="preserve"> </w:t>
+                                  </w:r>
+                                  <w:proofErr w:type="spellStart"/>
+                                  <w:r>
+                                    <w:rPr>
+                                      <w:rFonts w:ascii="Arial" w:hAnsi="Arial" w:cs="Arial"/>
+                                      <w:b/>
+                                      <w:bCs/>
+                                      <w:color w:val="FFFFFF" w:themeColor="background1"/>
+                                      <w:sz w:val="10"/>
+                                      <w:szCs w:val="10"/>
+                                    </w:rPr>
+                                    <w:t>methode</w:t>
+                                  </w:r>
+                                  <w:proofErr w:type="spellEnd"/>
                                 </w:p>
                               </w:txbxContent>
                             </wps:txbx>
@@ -2559,7 +3222,7 @@
                 </mc:Choice>
                 <mc:Fallback>
                   <w:pict>
-                    <v:shape w14:anchorId="196B627E" id="Text Box 7" o:spid="_x0000_s1033" type="#_x0000_t202" style="position:absolute;margin-left:53.95pt;margin-top:251.25pt;width:25.9pt;height:28.8pt;z-index:251711488;visibility:visible;mso-wrap-style:square;mso-width-percent:0;mso-height-percent:0;mso-wrap-distance-left:9pt;mso-wrap-distance-top:0;mso-wrap-distance-right:9pt;mso-wrap-distance-bottom:0;mso-position-horizontal:absolute;mso-position-horizontal-relative:text;mso-position-vertical:absolute;mso-position-vertical-relative:text;mso-width-percent:0;mso-height-percent:0;mso-width-relative:margin;mso-height-relative:margin;v-text-anchor:middle" o:gfxdata="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" fillcolor="#b7ae38" strokecolor="#868686" strokeweight=".5pt">
+                    <v:shape w14:anchorId="499688E7" id="Text Box 7" o:spid="_x0000_s1033" type="#_x0000_t202" style="position:absolute;margin-left:53.95pt;margin-top:251.25pt;width:25.9pt;height:28.8pt;z-index:251695104;visibility:visible;mso-wrap-style:square;mso-width-percent:0;mso-height-percent:0;mso-wrap-distance-left:9pt;mso-wrap-distance-top:0;mso-wrap-distance-right:9pt;mso-wrap-distance-bottom:0;mso-position-horizontal:absolute;mso-position-horizontal-relative:text;mso-position-vertical:absolute;mso-position-vertical-relative:text;mso-width-percent:0;mso-height-percent:0;mso-width-relative:margin;mso-height-relative:margin;v-text-anchor:middle" o:gfxdata="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" fillcolor="#b7ae38" strokecolor="#868686" strokeweight=".5pt">
                       <v:textbox inset="0,0,0,0">
                         <w:txbxContent>
                           <w:p>
@@ -2575,6 +3238,7 @@
                                 <w:szCs w:val="10"/>
                               </w:rPr>
                             </w:pPr>
+                            <w:proofErr w:type="spellStart"/>
                             <w:r>
                               <w:rPr>
                                 <w:rFonts w:ascii="Arial" w:hAnsi="Arial" w:cs="Arial"/>
@@ -2584,8 +3248,81 @@
                                 <w:sz w:val="10"/>
                                 <w:szCs w:val="10"/>
                               </w:rPr>
-                              <w:t>Niet gehecht vuil methode</w:t>
+                              <w:t>Niet</w:t>
                             </w:r>
+                            <w:proofErr w:type="spellEnd"/>
+                            <w:r>
+                              <w:rPr>
+                                <w:rFonts w:ascii="Arial" w:hAnsi="Arial" w:cs="Arial"/>
+                                <w:b/>
+                                <w:bCs/>
+                                <w:color w:val="FFFFFF" w:themeColor="background1"/>
+                                <w:sz w:val="10"/>
+                                <w:szCs w:val="10"/>
+                              </w:rPr>
+                              <w:t xml:space="preserve"> </w:t>
+                            </w:r>
+                            <w:proofErr w:type="spellStart"/>
+                            <w:r>
+                              <w:rPr>
+                                <w:rFonts w:ascii="Arial" w:hAnsi="Arial" w:cs="Arial"/>
+                                <w:b/>
+                                <w:bCs/>
+                                <w:color w:val="FFFFFF" w:themeColor="background1"/>
+                                <w:sz w:val="10"/>
+                                <w:szCs w:val="10"/>
+                              </w:rPr>
+                              <w:t>gehecht</w:t>
+                            </w:r>
+                            <w:proofErr w:type="spellEnd"/>
+                            <w:r>
+                              <w:rPr>
+                                <w:rFonts w:ascii="Arial" w:hAnsi="Arial" w:cs="Arial"/>
+                                <w:b/>
+                                <w:bCs/>
+                                <w:color w:val="FFFFFF" w:themeColor="background1"/>
+                                <w:sz w:val="10"/>
+                                <w:szCs w:val="10"/>
+                              </w:rPr>
+                              <w:t xml:space="preserve"> </w:t>
+                            </w:r>
+                            <w:proofErr w:type="spellStart"/>
+                            <w:r>
+                              <w:rPr>
+                                <w:rFonts w:ascii="Arial" w:hAnsi="Arial" w:cs="Arial"/>
+                                <w:b/>
+                                <w:bCs/>
+                                <w:color w:val="FFFFFF" w:themeColor="background1"/>
+                                <w:sz w:val="10"/>
+                                <w:szCs w:val="10"/>
+                              </w:rPr>
+                              <w:t>vuil</w:t>
+                            </w:r>
+                            <w:proofErr w:type="spellEnd"/>
+                            <w:r>
+                              <w:rPr>
+                                <w:rFonts w:ascii="Arial" w:hAnsi="Arial" w:cs="Arial"/>
+                                <w:b/>
+                                <w:bCs/>
+                                <w:color w:val="FFFFFF" w:themeColor="background1"/>
+                                <w:sz w:val="10"/>
+                                <w:szCs w:val="10"/>
+                              </w:rPr>
+                              <w:t xml:space="preserve"> </w:t>
+                            </w:r>
+                            <w:proofErr w:type="spellStart"/>
+                            <w:r>
+                              <w:rPr>
+                                <w:rFonts w:ascii="Arial" w:hAnsi="Arial" w:cs="Arial"/>
+                                <w:b/>
+                                <w:bCs/>
+                                <w:color w:val="FFFFFF" w:themeColor="background1"/>
+                                <w:sz w:val="10"/>
+                                <w:szCs w:val="10"/>
+                              </w:rPr>
+                              <w:t>methode</w:t>
+                            </w:r>
+                            <w:proofErr w:type="spellEnd"/>
                           </w:p>
                         </w:txbxContent>
                       </v:textbox>
@@ -2605,7 +3342,7 @@
               <mc:AlternateContent>
                 <mc:Choice Requires="wps">
                   <w:drawing>
-                    <wp:anchor distT="0" distB="0" distL="114300" distR="114300" simplePos="0" relativeHeight="251715584" behindDoc="0" locked="0" layoutInCell="1" allowOverlap="1" wp14:anchorId="7F57A76E" wp14:editId="60BF15DA">
+                    <wp:anchor distT="0" distB="0" distL="114300" distR="114300" simplePos="0" relativeHeight="251699200" behindDoc="0" locked="0" layoutInCell="1" allowOverlap="1" wp14:anchorId="6749570E" wp14:editId="039D95A6">
                       <wp:simplePos x="0" y="0"/>
                       <wp:positionH relativeFrom="column">
                         <wp:posOffset>2303145</wp:posOffset>
@@ -2654,6 +3391,7 @@
                                       <w:szCs w:val="10"/>
                                     </w:rPr>
                                   </w:pPr>
+                                  <w:proofErr w:type="spellStart"/>
                                   <w:r>
                                     <w:rPr>
                                       <w:rFonts w:ascii="Arial" w:hAnsi="Arial" w:cs="Arial"/>
@@ -2663,8 +3401,33 @@
                                       <w:sz w:val="10"/>
                                       <w:szCs w:val="10"/>
                                     </w:rPr>
-                                    <w:t>Niet aangevuld</w:t>
+                                    <w:t>Niet</w:t>
                                   </w:r>
+                                  <w:proofErr w:type="spellEnd"/>
+                                  <w:r>
+                                    <w:rPr>
+                                      <w:rFonts w:ascii="Arial" w:hAnsi="Arial" w:cs="Arial"/>
+                                      <w:b/>
+                                      <w:bCs/>
+                                      <w:color w:val="FFFFFF" w:themeColor="background1"/>
+                                      <w:sz w:val="10"/>
+                                      <w:szCs w:val="10"/>
+                                    </w:rPr>
+                                    <w:t xml:space="preserve"> </w:t>
+                                  </w:r>
+                                  <w:proofErr w:type="spellStart"/>
+                                  <w:r>
+                                    <w:rPr>
+                                      <w:rFonts w:ascii="Arial" w:hAnsi="Arial" w:cs="Arial"/>
+                                      <w:b/>
+                                      <w:bCs/>
+                                      <w:color w:val="FFFFFF" w:themeColor="background1"/>
+                                      <w:sz w:val="10"/>
+                                      <w:szCs w:val="10"/>
+                                    </w:rPr>
+                                    <w:t>aangevuld</w:t>
+                                  </w:r>
+                                  <w:proofErr w:type="spellEnd"/>
                                 </w:p>
                               </w:txbxContent>
                             </wps:txbx>
@@ -2688,7 +3451,7 @@
                 </mc:Choice>
                 <mc:Fallback>
                   <w:pict>
-                    <v:shape w14:anchorId="7F57A76E" id="Text Box 11" o:spid="_x0000_s1034" type="#_x0000_t202" style="position:absolute;margin-left:181.35pt;margin-top:251.25pt;width:24.1pt;height:28.7pt;z-index:251715584;visibility:visible;mso-wrap-style:square;mso-width-percent:0;mso-height-percent:0;mso-wrap-distance-left:9pt;mso-wrap-distance-top:0;mso-wrap-distance-right:9pt;mso-wrap-distance-bottom:0;mso-position-horizontal:absolute;mso-position-horizontal-relative:text;mso-position-vertical:absolute;mso-position-vertical-relative:text;mso-width-percent:0;mso-height-percent:0;mso-width-relative:margin;mso-height-relative:margin;v-text-anchor:middle" o:gfxdata="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" fillcolor="#a9a57c" strokecolor="#868686" strokeweight=".5pt">
+                    <v:shape w14:anchorId="6749570E" id="Text Box 11" o:spid="_x0000_s1034" type="#_x0000_t202" style="position:absolute;margin-left:181.35pt;margin-top:251.25pt;width:24.1pt;height:28.7pt;z-index:251699200;visibility:visible;mso-wrap-style:square;mso-width-percent:0;mso-height-percent:0;mso-wrap-distance-left:9pt;mso-wrap-distance-top:0;mso-wrap-distance-right:9pt;mso-wrap-distance-bottom:0;mso-position-horizontal:absolute;mso-position-horizontal-relative:text;mso-position-vertical:absolute;mso-position-vertical-relative:text;mso-width-percent:0;mso-height-percent:0;mso-width-relative:margin;mso-height-relative:margin;v-text-anchor:middle" o:gfxdata="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" fillcolor="#a9a57c" strokecolor="#868686" strokeweight=".5pt">
                       <v:textbox inset="0,0,0,0">
                         <w:txbxContent>
                           <w:p>
@@ -2704,6 +3467,7 @@
                                 <w:szCs w:val="10"/>
                               </w:rPr>
                             </w:pPr>
+                            <w:proofErr w:type="spellStart"/>
                             <w:r>
                               <w:rPr>
                                 <w:rFonts w:ascii="Arial" w:hAnsi="Arial" w:cs="Arial"/>
@@ -2713,8 +3477,33 @@
                                 <w:sz w:val="10"/>
                                 <w:szCs w:val="10"/>
                               </w:rPr>
-                              <w:t>Niet aangevuld</w:t>
+                              <w:t>Niet</w:t>
                             </w:r>
+                            <w:proofErr w:type="spellEnd"/>
+                            <w:r>
+                              <w:rPr>
+                                <w:rFonts w:ascii="Arial" w:hAnsi="Arial" w:cs="Arial"/>
+                                <w:b/>
+                                <w:bCs/>
+                                <w:color w:val="FFFFFF" w:themeColor="background1"/>
+                                <w:sz w:val="10"/>
+                                <w:szCs w:val="10"/>
+                              </w:rPr>
+                              <w:t xml:space="preserve"> </w:t>
+                            </w:r>
+                            <w:proofErr w:type="spellStart"/>
+                            <w:r>
+                              <w:rPr>
+                                <w:rFonts w:ascii="Arial" w:hAnsi="Arial" w:cs="Arial"/>
+                                <w:b/>
+                                <w:bCs/>
+                                <w:color w:val="FFFFFF" w:themeColor="background1"/>
+                                <w:sz w:val="10"/>
+                                <w:szCs w:val="10"/>
+                              </w:rPr>
+                              <w:t>aangevuld</w:t>
+                            </w:r>
+                            <w:proofErr w:type="spellEnd"/>
                           </w:p>
                         </w:txbxContent>
                       </v:textbox>
@@ -2734,7 +3523,7 @@
               <mc:AlternateContent>
                 <mc:Choice Requires="wps">
                   <w:drawing>
-                    <wp:anchor distT="0" distB="0" distL="114300" distR="114300" simplePos="0" relativeHeight="251714560" behindDoc="0" locked="0" layoutInCell="1" allowOverlap="1" wp14:anchorId="1DB645CE" wp14:editId="74A0C21B">
+                    <wp:anchor distT="0" distB="0" distL="114300" distR="114300" simplePos="0" relativeHeight="251698176" behindDoc="0" locked="0" layoutInCell="1" allowOverlap="1" wp14:anchorId="4F82A173" wp14:editId="61788FB1">
                       <wp:simplePos x="0" y="0"/>
                       <wp:positionH relativeFrom="column">
                         <wp:posOffset>1976247</wp:posOffset>
@@ -2783,6 +3572,7 @@
                                       <w:szCs w:val="10"/>
                                     </w:rPr>
                                   </w:pPr>
+                                  <w:proofErr w:type="spellStart"/>
                                   <w:r>
                                     <w:rPr>
                                       <w:rFonts w:ascii="Arial" w:hAnsi="Arial" w:cs="Arial"/>
@@ -2792,8 +3582,81 @@
                                       <w:sz w:val="10"/>
                                       <w:szCs w:val="10"/>
                                     </w:rPr>
-                                    <w:t>Gehecht vuil vlek vingertast</w:t>
+                                    <w:t>Gehecht</w:t>
                                   </w:r>
+                                  <w:proofErr w:type="spellEnd"/>
+                                  <w:r>
+                                    <w:rPr>
+                                      <w:rFonts w:ascii="Arial" w:hAnsi="Arial" w:cs="Arial"/>
+                                      <w:b/>
+                                      <w:bCs/>
+                                      <w:color w:val="FFFFFF" w:themeColor="background1"/>
+                                      <w:sz w:val="10"/>
+                                      <w:szCs w:val="10"/>
+                                    </w:rPr>
+                                    <w:t xml:space="preserve"> </w:t>
+                                  </w:r>
+                                  <w:proofErr w:type="spellStart"/>
+                                  <w:r>
+                                    <w:rPr>
+                                      <w:rFonts w:ascii="Arial" w:hAnsi="Arial" w:cs="Arial"/>
+                                      <w:b/>
+                                      <w:bCs/>
+                                      <w:color w:val="FFFFFF" w:themeColor="background1"/>
+                                      <w:sz w:val="10"/>
+                                      <w:szCs w:val="10"/>
+                                    </w:rPr>
+                                    <w:t>vuil</w:t>
+                                  </w:r>
+                                  <w:proofErr w:type="spellEnd"/>
+                                  <w:r>
+                                    <w:rPr>
+                                      <w:rFonts w:ascii="Arial" w:hAnsi="Arial" w:cs="Arial"/>
+                                      <w:b/>
+                                      <w:bCs/>
+                                      <w:color w:val="FFFFFF" w:themeColor="background1"/>
+                                      <w:sz w:val="10"/>
+                                      <w:szCs w:val="10"/>
+                                    </w:rPr>
+                                    <w:t xml:space="preserve"> </w:t>
+                                  </w:r>
+                                  <w:proofErr w:type="spellStart"/>
+                                  <w:r>
+                                    <w:rPr>
+                                      <w:rFonts w:ascii="Arial" w:hAnsi="Arial" w:cs="Arial"/>
+                                      <w:b/>
+                                      <w:bCs/>
+                                      <w:color w:val="FFFFFF" w:themeColor="background1"/>
+                                      <w:sz w:val="10"/>
+                                      <w:szCs w:val="10"/>
+                                    </w:rPr>
+                                    <w:t>vlek</w:t>
+                                  </w:r>
+                                  <w:proofErr w:type="spellEnd"/>
+                                  <w:r>
+                                    <w:rPr>
+                                      <w:rFonts w:ascii="Arial" w:hAnsi="Arial" w:cs="Arial"/>
+                                      <w:b/>
+                                      <w:bCs/>
+                                      <w:color w:val="FFFFFF" w:themeColor="background1"/>
+                                      <w:sz w:val="10"/>
+                                      <w:szCs w:val="10"/>
+                                    </w:rPr>
+                                    <w:t xml:space="preserve"> </w:t>
+                                  </w:r>
+                                  <w:proofErr w:type="spellStart"/>
+                                  <w:r>
+                                    <w:rPr>
+                                      <w:rFonts w:ascii="Arial" w:hAnsi="Arial" w:cs="Arial"/>
+                                      <w:b/>
+                                      <w:bCs/>
+                                      <w:color w:val="FFFFFF" w:themeColor="background1"/>
+                                      <w:sz w:val="10"/>
+                                      <w:szCs w:val="10"/>
+                                    </w:rPr>
+                                    <w:t>vingertast</w:t>
+                                  </w:r>
+                                  <w:proofErr w:type="spellEnd"/>
                                 </w:p>
                               </w:txbxContent>
                             </wps:txbx>
@@ -2817,7 +3680,7 @@
                 </mc:Choice>
                 <mc:Fallback>
                   <w:pict>
-                    <v:shape w14:anchorId="1DB645CE" id="Text Box 10" o:spid="_x0000_s1035" type="#_x0000_t202" style="position:absolute;margin-left:155.6pt;margin-top:251.25pt;width:26.3pt;height:28.8pt;z-index:251714560;visibility:visible;mso-wrap-style:square;mso-width-percent:0;mso-height-percent:0;mso-wrap-distance-left:9pt;mso-wrap-distance-top:0;mso-wrap-distance-right:9pt;mso-wrap-distance-bottom:0;mso-position-horizontal:absolute;mso-position-horizontal-relative:text;mso-position-vertical:absolute;mso-position-vertical-relative:text;mso-width-percent:0;mso-height-percent:0;mso-width-relative:margin;mso-height-relative:margin;v-text-anchor:middle" o:gfxdata="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" fillcolor="#689c9a" strokecolor="#868686" strokeweight=".5pt">
+                    <v:shape w14:anchorId="4F82A173" id="Text Box 10" o:spid="_x0000_s1035" type="#_x0000_t202" style="position:absolute;margin-left:155.6pt;margin-top:251.25pt;width:26.3pt;height:28.8pt;z-index:251698176;visibility:visible;mso-wrap-style:square;mso-width-percent:0;mso-height-percent:0;mso-wrap-distance-left:9pt;mso-wrap-distance-top:0;mso-wrap-distance-right:9pt;mso-wrap-distance-bottom:0;mso-position-horizontal:absolute;mso-position-horizontal-relative:text;mso-position-vertical:absolute;mso-position-vertical-relative:text;mso-width-percent:0;mso-height-percent:0;mso-width-relative:margin;mso-height-relative:margin;v-text-anchor:middle" o:gfxdata="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" fillcolor="#689c9a" strokecolor="#868686" strokeweight=".5pt">
                       <v:textbox inset="0,0,0,0">
                         <w:txbxContent>
                           <w:p>
@@ -2833,6 +3696,7 @@
                                 <w:szCs w:val="10"/>
                               </w:rPr>
                             </w:pPr>
+                            <w:proofErr w:type="spellStart"/>
                             <w:r>
                               <w:rPr>
                                 <w:rFonts w:ascii="Arial" w:hAnsi="Arial" w:cs="Arial"/>
@@ -2842,8 +3706,81 @@
                                 <w:sz w:val="10"/>
                                 <w:szCs w:val="10"/>
                               </w:rPr>
-                              <w:t>Gehecht vuil vlek vingertast</w:t>
+                              <w:t>Gehecht</w:t>
                             </w:r>
+                            <w:proofErr w:type="spellEnd"/>
+                            <w:r>
+                              <w:rPr>
+                                <w:rFonts w:ascii="Arial" w:hAnsi="Arial" w:cs="Arial"/>
+                                <w:b/>
+                                <w:bCs/>
+                                <w:color w:val="FFFFFF" w:themeColor="background1"/>
+                                <w:sz w:val="10"/>
+                                <w:szCs w:val="10"/>
+                              </w:rPr>
+                              <w:t xml:space="preserve"> </w:t>
+                            </w:r>
+                            <w:proofErr w:type="spellStart"/>
+                            <w:r>
+                              <w:rPr>
+                                <w:rFonts w:ascii="Arial" w:hAnsi="Arial" w:cs="Arial"/>
+                                <w:b/>
+                                <w:bCs/>
+                                <w:color w:val="FFFFFF" w:themeColor="background1"/>
+                                <w:sz w:val="10"/>
+                                <w:szCs w:val="10"/>
+                              </w:rPr>
+                              <w:t>vuil</w:t>
+                            </w:r>
+                            <w:proofErr w:type="spellEnd"/>
+                            <w:r>
+                              <w:rPr>
+                                <w:rFonts w:ascii="Arial" w:hAnsi="Arial" w:cs="Arial"/>
+                                <w:b/>
+                                <w:bCs/>
+                                <w:color w:val="FFFFFF" w:themeColor="background1"/>
+                                <w:sz w:val="10"/>
+                                <w:szCs w:val="10"/>
+                              </w:rPr>
+                              <w:t xml:space="preserve"> </w:t>
+                            </w:r>
+                            <w:proofErr w:type="spellStart"/>
+                            <w:r>
+                              <w:rPr>
+                                <w:rFonts w:ascii="Arial" w:hAnsi="Arial" w:cs="Arial"/>
+                                <w:b/>
+                                <w:bCs/>
+                                <w:color w:val="FFFFFF" w:themeColor="background1"/>
+                                <w:sz w:val="10"/>
+                                <w:szCs w:val="10"/>
+                              </w:rPr>
+                              <w:t>vlek</w:t>
+                            </w:r>
+                            <w:proofErr w:type="spellEnd"/>
+                            <w:r>
+                              <w:rPr>
+                                <w:rFonts w:ascii="Arial" w:hAnsi="Arial" w:cs="Arial"/>
+                                <w:b/>
+                                <w:bCs/>
+                                <w:color w:val="FFFFFF" w:themeColor="background1"/>
+                                <w:sz w:val="10"/>
+                                <w:szCs w:val="10"/>
+                              </w:rPr>
+                              <w:t xml:space="preserve"> </w:t>
+                            </w:r>
+                            <w:proofErr w:type="spellStart"/>
+                            <w:r>
+                              <w:rPr>
+                                <w:rFonts w:ascii="Arial" w:hAnsi="Arial" w:cs="Arial"/>
+                                <w:b/>
+                                <w:bCs/>
+                                <w:color w:val="FFFFFF" w:themeColor="background1"/>
+                                <w:sz w:val="10"/>
+                                <w:szCs w:val="10"/>
+                              </w:rPr>
+                              <w:t>vingertast</w:t>
+                            </w:r>
+                            <w:proofErr w:type="spellEnd"/>
                           </w:p>
                         </w:txbxContent>
                       </v:textbox>
@@ -2863,7 +3800,7 @@
               <mc:AlternateContent>
                 <mc:Choice Requires="wps">
                   <w:drawing>
-                    <wp:anchor distT="0" distB="0" distL="114300" distR="114300" simplePos="0" relativeHeight="251719680" behindDoc="0" locked="0" layoutInCell="1" allowOverlap="1" wp14:anchorId="56437095" wp14:editId="7442D7D2">
+                    <wp:anchor distT="0" distB="0" distL="114300" distR="114300" simplePos="0" relativeHeight="251703296" behindDoc="0" locked="0" layoutInCell="1" allowOverlap="1" wp14:anchorId="692D6E1D" wp14:editId="0EE62F32">
                       <wp:simplePos x="0" y="0"/>
                       <wp:positionH relativeFrom="column">
                         <wp:posOffset>1642745</wp:posOffset>
@@ -2912,6 +3849,7 @@
                                       <w:szCs w:val="10"/>
                                     </w:rPr>
                                   </w:pPr>
+                                  <w:proofErr w:type="spellStart"/>
                                   <w:r>
                                     <w:rPr>
                                       <w:rFonts w:ascii="Arial" w:hAnsi="Arial" w:cs="Arial"/>
@@ -2921,8 +3859,57 @@
                                       <w:sz w:val="10"/>
                                       <w:szCs w:val="10"/>
                                     </w:rPr>
-                                    <w:t>Gehecht vuil methode</w:t>
+                                    <w:t>Gehecht</w:t>
                                   </w:r>
+                                  <w:proofErr w:type="spellEnd"/>
+                                  <w:r>
+                                    <w:rPr>
+                                      <w:rFonts w:ascii="Arial" w:hAnsi="Arial" w:cs="Arial"/>
+                                      <w:b/>
+                                      <w:bCs/>
+                                      <w:color w:val="FFFFFF" w:themeColor="background1"/>
+                                      <w:sz w:val="10"/>
+                                      <w:szCs w:val="10"/>
+                                    </w:rPr>
+                                    <w:t xml:space="preserve"> </w:t>
+                                  </w:r>
+                                  <w:proofErr w:type="spellStart"/>
+                                  <w:r>
+                                    <w:rPr>
+                                      <w:rFonts w:ascii="Arial" w:hAnsi="Arial" w:cs="Arial"/>
+                                      <w:b/>
+                                      <w:bCs/>
+                                      <w:color w:val="FFFFFF" w:themeColor="background1"/>
+                                      <w:sz w:val="10"/>
+                                      <w:szCs w:val="10"/>
+                                    </w:rPr>
+                                    <w:t>vuil</w:t>
+                                  </w:r>
+                                  <w:proofErr w:type="spellEnd"/>
+                                  <w:r>
+                                    <w:rPr>
+                                      <w:rFonts w:ascii="Arial" w:hAnsi="Arial" w:cs="Arial"/>
+                                      <w:b/>
+                                      <w:bCs/>
+                                      <w:color w:val="FFFFFF" w:themeColor="background1"/>
+                                      <w:sz w:val="10"/>
+                                      <w:szCs w:val="10"/>
+                                    </w:rPr>
+                                    <w:t xml:space="preserve"> </w:t>
+                                  </w:r>
+                                  <w:proofErr w:type="spellStart"/>
+                                  <w:r>
+                                    <w:rPr>
+                                      <w:rFonts w:ascii="Arial" w:hAnsi="Arial" w:cs="Arial"/>
+                                      <w:b/>
+                                      <w:bCs/>
+                                      <w:color w:val="FFFFFF" w:themeColor="background1"/>
+                                      <w:sz w:val="10"/>
+                                      <w:szCs w:val="10"/>
+                                    </w:rPr>
+                                    <w:t>methode</w:t>
+                                  </w:r>
+                                  <w:proofErr w:type="spellEnd"/>
                                 </w:p>
                               </w:txbxContent>
                             </wps:txbx>
@@ -2946,7 +3933,7 @@
                 </mc:Choice>
                 <mc:Fallback>
                   <w:pict>
-                    <v:shape w14:anchorId="56437095" id="Text Box 17" o:spid="_x0000_s1036" type="#_x0000_t202" style="position:absolute;margin-left:129.35pt;margin-top:251.25pt;width:26.65pt;height:28.8pt;z-index:251719680;visibility:visible;mso-wrap-style:square;mso-width-percent:0;mso-height-percent:0;mso-wrap-distance-left:9pt;mso-wrap-distance-top:0;mso-wrap-distance-right:9pt;mso-wrap-distance-bottom:0;mso-position-horizontal:absolute;mso-position-horizontal-relative:text;mso-position-vertical:absolute;mso-position-vertical-relative:text;mso-width-percent:0;mso-height-percent:0;mso-width-relative:margin;mso-height-relative:margin;v-text-anchor:middle" o:gfxdata="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" fillcolor="#689c9a" strokecolor="#868686" strokeweight=".5pt">
+                    <v:shape w14:anchorId="692D6E1D" id="Text Box 17" o:spid="_x0000_s1036" type="#_x0000_t202" style="position:absolute;margin-left:129.35pt;margin-top:251.25pt;width:26.65pt;height:28.8pt;z-index:251703296;visibility:visible;mso-wrap-style:square;mso-width-percent:0;mso-height-percent:0;mso-wrap-distance-left:9pt;mso-wrap-distance-top:0;mso-wrap-distance-right:9pt;mso-wrap-distance-bottom:0;mso-position-horizontal:absolute;mso-position-horizontal-relative:text;mso-position-vertical:absolute;mso-position-vertical-relative:text;mso-width-percent:0;mso-height-percent:0;mso-width-relative:margin;mso-height-relative:margin;v-text-anchor:middle" o:gfxdata="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" fillcolor="#689c9a" strokecolor="#868686" strokeweight=".5pt">
                       <v:textbox inset="0,0,0,0">
                         <w:txbxContent>
                           <w:p>
@@ -2962,6 +3949,7 @@
                                 <w:szCs w:val="10"/>
                               </w:rPr>
                             </w:pPr>
+                            <w:proofErr w:type="spellStart"/>
                             <w:r>
                               <w:rPr>
                                 <w:rFonts w:ascii="Arial" w:hAnsi="Arial" w:cs="Arial"/>
@@ -2971,8 +3959,57 @@
                                 <w:sz w:val="10"/>
                                 <w:szCs w:val="10"/>
                               </w:rPr>
-                              <w:t>Gehecht vuil methode</w:t>
+                              <w:t>Gehecht</w:t>
                             </w:r>
+                            <w:proofErr w:type="spellEnd"/>
+                            <w:r>
+                              <w:rPr>
+                                <w:rFonts w:ascii="Arial" w:hAnsi="Arial" w:cs="Arial"/>
+                                <w:b/>
+                                <w:bCs/>
+                                <w:color w:val="FFFFFF" w:themeColor="background1"/>
+                                <w:sz w:val="10"/>
+                                <w:szCs w:val="10"/>
+                              </w:rPr>
+                              <w:t xml:space="preserve"> </w:t>
+                            </w:r>
+                            <w:proofErr w:type="spellStart"/>
+                            <w:r>
+                              <w:rPr>
+                                <w:rFonts w:ascii="Arial" w:hAnsi="Arial" w:cs="Arial"/>
+                                <w:b/>
+                                <w:bCs/>
+                                <w:color w:val="FFFFFF" w:themeColor="background1"/>
+                                <w:sz w:val="10"/>
+                                <w:szCs w:val="10"/>
+                              </w:rPr>
+                              <w:t>vuil</w:t>
+                            </w:r>
+                            <w:proofErr w:type="spellEnd"/>
+                            <w:r>
+                              <w:rPr>
+                                <w:rFonts w:ascii="Arial" w:hAnsi="Arial" w:cs="Arial"/>
+                                <w:b/>
+                                <w:bCs/>
+                                <w:color w:val="FFFFFF" w:themeColor="background1"/>
+                                <w:sz w:val="10"/>
+                                <w:szCs w:val="10"/>
+                              </w:rPr>
+                              <w:t xml:space="preserve"> </w:t>
+                            </w:r>
+                            <w:proofErr w:type="spellStart"/>
+                            <w:r>
+                              <w:rPr>
+                                <w:rFonts w:ascii="Arial" w:hAnsi="Arial" w:cs="Arial"/>
+                                <w:b/>
+                                <w:bCs/>
+                                <w:color w:val="FFFFFF" w:themeColor="background1"/>
+                                <w:sz w:val="10"/>
+                                <w:szCs w:val="10"/>
+                              </w:rPr>
+                              <w:t>methode</w:t>
+                            </w:r>
+                            <w:proofErr w:type="spellEnd"/>
                           </w:p>
                         </w:txbxContent>
                       </v:textbox>
@@ -2987,7 +4024,7 @@
                 <w:lang w:val="nl-NL"/>
               </w:rPr>
               <w:drawing>
-                <wp:inline distT="0" distB="0" distL="0" distR="0" wp14:anchorId="435E8F5F" wp14:editId="1DAF0190">
+                <wp:inline distT="0" distB="0" distL="0" distR="0" wp14:anchorId="2FAD50C8" wp14:editId="2700C44D">
                   <wp:extent cx="3429000" cy="3200400"/>
                   <wp:effectExtent l="0" t="0" r="0" b="0"/>
                   <wp:docPr id="27" name="Chart 27"/>
@@ -3039,7 +4076,7 @@
         </w:tc>
         <w:tc>
           <w:tcPr>
-            <w:tcW w:w="5131" w:type="dxa"/>
+            <w:tcW w:w="5395" w:type="dxa"/>
           </w:tcPr>
           <w:p>
             <w:pPr>
@@ -3062,7 +4099,7 @@
               <mc:AlternateContent>
                 <mc:Choice Requires="wps">
                   <w:drawing>
-                    <wp:anchor distT="0" distB="0" distL="114300" distR="114300" simplePos="0" relativeHeight="251710464" behindDoc="0" locked="0" layoutInCell="1" allowOverlap="1" wp14:anchorId="7EAB0854" wp14:editId="026B7FC6">
+                    <wp:anchor distT="0" distB="0" distL="114300" distR="114300" simplePos="0" relativeHeight="251706368" behindDoc="0" locked="0" layoutInCell="1" allowOverlap="1" wp14:anchorId="637787ED" wp14:editId="7BA673A6">
                       <wp:simplePos x="0" y="0"/>
                       <wp:positionH relativeFrom="column">
                         <wp:posOffset>2165325</wp:posOffset>
@@ -3130,7 +4167,31 @@
                                       <w:szCs w:val="10"/>
                                     </w:rPr>
                                     <w:br/>
-                                    <w:t>{donut_chart_diverse_pct}</w:t>
+                                    <w:t>{</w:t>
+                                  </w:r>
+                                  <w:proofErr w:type="spellStart"/>
+                                  <w:r>
+                                    <w:rPr>
+                                      <w:rFonts w:ascii="Arial" w:hAnsi="Arial" w:cs="Arial"/>
+                                      <w:b/>
+                                      <w:bCs/>
+                                      <w:color w:val="FFFFFF" w:themeColor="background1"/>
+                                      <w:sz w:val="10"/>
+                                      <w:szCs w:val="10"/>
+                                    </w:rPr>
+                                    <w:t>donut_chart_diverse_pct</w:t>
+                                  </w:r>
+                                  <w:proofErr w:type="spellEnd"/>
+                                  <w:r>
+                                    <w:rPr>
+                                      <w:rFonts w:ascii="Arial" w:hAnsi="Arial" w:cs="Arial"/>
+                                      <w:b/>
+                                      <w:bCs/>
+                                      <w:color w:val="FFFFFF" w:themeColor="background1"/>
+                                      <w:sz w:val="10"/>
+                                      <w:szCs w:val="10"/>
+                                    </w:rPr>
+                                    <w:t>}</w:t>
                                   </w:r>
                                 </w:p>
                               </w:txbxContent>
@@ -3155,7 +4216,7 @@
                 </mc:Choice>
                 <mc:Fallback>
                   <w:pict>
-                    <v:shape w14:anchorId="7EAB0854" id="Text Box 19" o:spid="_x0000_s1037" type="#_x0000_t202" style="position:absolute;margin-left:170.5pt;margin-top:164.75pt;width:45.15pt;height:28.8pt;z-index:251710464;visibility:visible;mso-wrap-style:square;mso-width-percent:0;mso-height-percent:0;mso-wrap-distance-left:9pt;mso-wrap-distance-top:0;mso-wrap-distance-right:9pt;mso-wrap-distance-bottom:0;mso-position-horizontal:absolute;mso-position-horizontal-relative:text;mso-position-vertical:absolute;mso-position-vertical-relative:text;mso-width-percent:0;mso-height-percent:0;mso-width-relative:margin;mso-height-relative:margin;v-text-anchor:middle" o:gfxdata="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" fillcolor="#a9a57c" stroked="f" strokeweight=".25pt">
+                    <v:shape w14:anchorId="637787ED" id="Text Box 19" o:spid="_x0000_s1037" type="#_x0000_t202" style="position:absolute;margin-left:170.5pt;margin-top:164.75pt;width:45.15pt;height:28.8pt;z-index:251706368;visibility:visible;mso-wrap-style:square;mso-width-percent:0;mso-height-percent:0;mso-wrap-distance-left:9pt;mso-wrap-distance-top:0;mso-wrap-distance-right:9pt;mso-wrap-distance-bottom:0;mso-position-horizontal:absolute;mso-position-horizontal-relative:text;mso-position-vertical:absolute;mso-position-vertical-relative:text;mso-width-percent:0;mso-height-percent:0;mso-width-relative:margin;mso-height-relative:margin;v-text-anchor:middle" o:gfxdata="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" fillcolor="#a9a57c" stroked="f" strokeweight=".25pt">
                       <v:textbox inset="0,0,0,0">
                         <w:txbxContent>
                           <w:p>
@@ -3192,7 +4253,31 @@
                                 <w:szCs w:val="10"/>
                               </w:rPr>
                               <w:br/>
-                              <w:t>{donut_chart_diverse_pct}</w:t>
+                              <w:t>{</w:t>
+                            </w:r>
+                            <w:proofErr w:type="spellStart"/>
+                            <w:r>
+                              <w:rPr>
+                                <w:rFonts w:ascii="Arial" w:hAnsi="Arial" w:cs="Arial"/>
+                                <w:b/>
+                                <w:bCs/>
+                                <w:color w:val="FFFFFF" w:themeColor="background1"/>
+                                <w:sz w:val="10"/>
+                                <w:szCs w:val="10"/>
+                              </w:rPr>
+                              <w:t>donut_chart_diverse_pct</w:t>
+                            </w:r>
+                            <w:proofErr w:type="spellEnd"/>
+                            <w:r>
+                              <w:rPr>
+                                <w:rFonts w:ascii="Arial" w:hAnsi="Arial" w:cs="Arial"/>
+                                <w:b/>
+                                <w:bCs/>
+                                <w:color w:val="FFFFFF" w:themeColor="background1"/>
+                                <w:sz w:val="10"/>
+                                <w:szCs w:val="10"/>
+                              </w:rPr>
+                              <w:t>}</w:t>
                             </w:r>
                           </w:p>
                         </w:txbxContent>
@@ -3213,7 +4298,7 @@
               <mc:AlternateContent>
                 <mc:Choice Requires="wps">
                   <w:drawing>
-                    <wp:anchor distT="0" distB="0" distL="114300" distR="114300" simplePos="0" relativeHeight="251709440" behindDoc="0" locked="0" layoutInCell="1" allowOverlap="1" wp14:anchorId="7111772A" wp14:editId="461574DB">
+                    <wp:anchor distT="0" distB="0" distL="114300" distR="114300" simplePos="0" relativeHeight="251705344" behindDoc="0" locked="0" layoutInCell="1" allowOverlap="1" wp14:anchorId="3BAF9E5E" wp14:editId="5B5B47C0">
                       <wp:simplePos x="0" y="0"/>
                       <wp:positionH relativeFrom="column">
                         <wp:posOffset>449580</wp:posOffset>
@@ -3284,7 +4369,33 @@
                                       <w:lang w:val="nl-NL"/>
                                     </w:rPr>
                                     <w:br/>
-                                    <w:t>{donut_chart_dagelijkse_pct}</w:t>
+                                    <w:t>{</w:t>
+                                  </w:r>
+                                  <w:proofErr w:type="spellStart"/>
+                                  <w:r>
+                                    <w:rPr>
+                                      <w:rFonts w:ascii="Arial" w:hAnsi="Arial" w:cs="Arial"/>
+                                      <w:b/>
+                                      <w:bCs/>
+                                      <w:color w:val="FFFFFF" w:themeColor="background1"/>
+                                      <w:sz w:val="10"/>
+                                      <w:szCs w:val="10"/>
+                                      <w:lang w:val="nl-NL"/>
+                                    </w:rPr>
+                                    <w:t>donut_chart_dagelijkse_pct</w:t>
+                                  </w:r>
+                                  <w:proofErr w:type="spellEnd"/>
+                                  <w:r>
+                                    <w:rPr>
+                                      <w:rFonts w:ascii="Arial" w:hAnsi="Arial" w:cs="Arial"/>
+                                      <w:b/>
+                                      <w:bCs/>
+                                      <w:color w:val="FFFFFF" w:themeColor="background1"/>
+                                      <w:sz w:val="10"/>
+                                      <w:szCs w:val="10"/>
+                                      <w:lang w:val="nl-NL"/>
+                                    </w:rPr>
+                                    <w:t>}</w:t>
                                   </w:r>
                                 </w:p>
                               </w:txbxContent>
@@ -3309,7 +4420,7 @@
                 </mc:Choice>
                 <mc:Fallback>
                   <w:pict>
-                    <v:shape w14:anchorId="7111772A" id="Text Box 18" o:spid="_x0000_s1038" type="#_x0000_t202" style="position:absolute;margin-left:35.4pt;margin-top:166.05pt;width:46.65pt;height:28.8pt;z-index:251709440;visibility:visible;mso-wrap-style:square;mso-width-percent:0;mso-height-percent:0;mso-wrap-distance-left:9pt;mso-wrap-distance-top:0;mso-wrap-distance-right:9pt;mso-wrap-distance-bottom:0;mso-position-horizontal:absolute;mso-position-horizontal-relative:text;mso-position-vertical:absolute;mso-position-vertical-relative:text;mso-width-percent:0;mso-height-percent:0;mso-width-relative:margin;mso-height-relative:margin;v-text-anchor:middle" o:gfxdata="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" fillcolor="#b7ae38" stroked="f" strokeweight=".25pt">
+                    <v:shape w14:anchorId="3BAF9E5E" id="Text Box 18" o:spid="_x0000_s1038" type="#_x0000_t202" style="position:absolute;margin-left:35.4pt;margin-top:166.05pt;width:46.65pt;height:28.8pt;z-index:251705344;visibility:visible;mso-wrap-style:square;mso-width-percent:0;mso-height-percent:0;mso-wrap-distance-left:9pt;mso-wrap-distance-top:0;mso-wrap-distance-right:9pt;mso-wrap-distance-bottom:0;mso-position-horizontal:absolute;mso-position-horizontal-relative:text;mso-position-vertical:absolute;mso-position-vertical-relative:text;mso-width-percent:0;mso-height-percent:0;mso-width-relative:margin;mso-height-relative:margin;v-text-anchor:middle" o:gfxdata="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" fillcolor="#b7ae38" stroked="f" strokeweight=".25pt">
                       <v:textbox inset="0,0,0,0">
                         <w:txbxContent>
                           <w:p>
@@ -3349,7 +4460,33 @@
                                 <w:lang w:val="nl-NL"/>
                               </w:rPr>
                               <w:br/>
-                              <w:t>{donut_chart_dagelijkse_pct}</w:t>
+                              <w:t>{</w:t>
+                            </w:r>
+                            <w:proofErr w:type="spellStart"/>
+                            <w:r>
+                              <w:rPr>
+                                <w:rFonts w:ascii="Arial" w:hAnsi="Arial" w:cs="Arial"/>
+                                <w:b/>
+                                <w:bCs/>
+                                <w:color w:val="FFFFFF" w:themeColor="background1"/>
+                                <w:sz w:val="10"/>
+                                <w:szCs w:val="10"/>
+                                <w:lang w:val="nl-NL"/>
+                              </w:rPr>
+                              <w:t>donut_chart_dagelijkse_pct</w:t>
+                            </w:r>
+                            <w:proofErr w:type="spellEnd"/>
+                            <w:r>
+                              <w:rPr>
+                                <w:rFonts w:ascii="Arial" w:hAnsi="Arial" w:cs="Arial"/>
+                                <w:b/>
+                                <w:bCs/>
+                                <w:color w:val="FFFFFF" w:themeColor="background1"/>
+                                <w:sz w:val="10"/>
+                                <w:szCs w:val="10"/>
+                                <w:lang w:val="nl-NL"/>
+                              </w:rPr>
+                              <w:t>}</w:t>
                             </w:r>
                           </w:p>
                         </w:txbxContent>
@@ -3370,7 +4507,7 @@
               <mc:AlternateContent>
                 <mc:Choice Requires="wps">
                   <w:drawing>
-                    <wp:anchor distT="0" distB="0" distL="114300" distR="114300" simplePos="0" relativeHeight="251708416" behindDoc="0" locked="0" layoutInCell="1" allowOverlap="1" wp14:anchorId="4030C402" wp14:editId="29DC6163">
+                    <wp:anchor distT="0" distB="0" distL="114300" distR="114300" simplePos="0" relativeHeight="251704320" behindDoc="0" locked="0" layoutInCell="1" allowOverlap="1" wp14:anchorId="57DC7527" wp14:editId="3F87424B">
                       <wp:simplePos x="0" y="0"/>
                       <wp:positionH relativeFrom="column">
                         <wp:posOffset>1364336</wp:posOffset>
@@ -3417,6 +4554,7 @@
                                       <w:szCs w:val="10"/>
                                     </w:rPr>
                                   </w:pPr>
+                                  <w:proofErr w:type="spellStart"/>
                                   <w:r>
                                     <w:rPr>
                                       <w:rFonts w:ascii="Arial" w:hAnsi="Arial" w:cs="Arial"/>
@@ -3428,6 +4566,7 @@
                                     </w:rPr>
                                     <w:t>Cumulatief</w:t>
                                   </w:r>
+                                  <w:proofErr w:type="spellEnd"/>
                                   <w:r>
                                     <w:rPr>
                                       <w:rFonts w:ascii="Arial" w:hAnsi="Arial" w:cs="Arial"/>
@@ -3438,7 +4577,31 @@
                                       <w:szCs w:val="10"/>
                                     </w:rPr>
                                     <w:br/>
-                                    <w:t>{donut_chart_cumulatief_pct}</w:t>
+                                    <w:t>{</w:t>
+                                  </w:r>
+                                  <w:proofErr w:type="spellStart"/>
+                                  <w:r>
+                                    <w:rPr>
+                                      <w:rFonts w:ascii="Arial" w:hAnsi="Arial" w:cs="Arial"/>
+                                      <w:b/>
+                                      <w:bCs/>
+                                      <w:color w:val="FFFFFF" w:themeColor="background1"/>
+                                      <w:sz w:val="10"/>
+                                      <w:szCs w:val="10"/>
+                                    </w:rPr>
+                                    <w:t>donut_chart_cumulatief_pct</w:t>
+                                  </w:r>
+                                  <w:proofErr w:type="spellEnd"/>
+                                  <w:r>
+                                    <w:rPr>
+                                      <w:rFonts w:ascii="Arial" w:hAnsi="Arial" w:cs="Arial"/>
+                                      <w:b/>
+                                      <w:bCs/>
+                                      <w:color w:val="FFFFFF" w:themeColor="background1"/>
+                                      <w:sz w:val="10"/>
+                                      <w:szCs w:val="10"/>
+                                    </w:rPr>
+                                    <w:t>}</w:t>
                                   </w:r>
                                 </w:p>
                               </w:txbxContent>
@@ -3463,7 +4626,7 @@
                 </mc:Choice>
                 <mc:Fallback>
                   <w:pict>
-                    <v:shape w14:anchorId="4030C402" id="Text Box 12" o:spid="_x0000_s1039" type="#_x0000_t202" style="position:absolute;margin-left:107.45pt;margin-top:164.75pt;width:45pt;height:28.8pt;z-index:251708416;visibility:visible;mso-wrap-style:square;mso-width-percent:0;mso-height-percent:0;mso-wrap-distance-left:9pt;mso-wrap-distance-top:0;mso-wrap-distance-right:9pt;mso-wrap-distance-bottom:0;mso-position-horizontal:absolute;mso-position-horizontal-relative:text;mso-position-vertical:absolute;mso-position-vertical-relative:text;mso-width-percent:0;mso-height-percent:0;mso-width-relative:margin;mso-height-relative:margin;v-text-anchor:middle" o:gfxdata="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" fillcolor="#689c9a" stroked="f" strokeweight=".25pt">
+                    <v:shape w14:anchorId="57DC7527" id="Text Box 12" o:spid="_x0000_s1039" type="#_x0000_t202" style="position:absolute;margin-left:107.45pt;margin-top:164.75pt;width:45pt;height:28.8pt;z-index:251704320;visibility:visible;mso-wrap-style:square;mso-width-percent:0;mso-height-percent:0;mso-wrap-distance-left:9pt;mso-wrap-distance-top:0;mso-wrap-distance-right:9pt;mso-wrap-distance-bottom:0;mso-position-horizontal:absolute;mso-position-horizontal-relative:text;mso-position-vertical:absolute;mso-position-vertical-relative:text;mso-width-percent:0;mso-height-percent:0;mso-width-relative:margin;mso-height-relative:margin;v-text-anchor:middle" o:gfxdata="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" fillcolor="#689c9a" stroked="f" strokeweight=".25pt">
                       <v:textbox inset="0,0,0,0">
                         <w:txbxContent>
                           <w:p>
@@ -3479,6 +4642,7 @@
                                 <w:szCs w:val="10"/>
                               </w:rPr>
                             </w:pPr>
+                            <w:proofErr w:type="spellStart"/>
                             <w:r>
                               <w:rPr>
                                 <w:rFonts w:ascii="Arial" w:hAnsi="Arial" w:cs="Arial"/>
@@ -3490,6 +4654,7 @@
                               </w:rPr>
                               <w:t>Cumulatief</w:t>
                             </w:r>
+                            <w:proofErr w:type="spellEnd"/>
                             <w:r>
                               <w:rPr>
                                 <w:rFonts w:ascii="Arial" w:hAnsi="Arial" w:cs="Arial"/>
@@ -3500,7 +4665,31 @@
                                 <w:szCs w:val="10"/>
                               </w:rPr>
                               <w:br/>
-                              <w:t>{donut_chart_cumulatief_pct}</w:t>
+                              <w:t>{</w:t>
+                            </w:r>
+                            <w:proofErr w:type="spellStart"/>
+                            <w:r>
+                              <w:rPr>
+                                <w:rFonts w:ascii="Arial" w:hAnsi="Arial" w:cs="Arial"/>
+                                <w:b/>
+                                <w:bCs/>
+                                <w:color w:val="FFFFFF" w:themeColor="background1"/>
+                                <w:sz w:val="10"/>
+                                <w:szCs w:val="10"/>
+                              </w:rPr>
+                              <w:t>donut_chart_cumulatief_pct</w:t>
+                            </w:r>
+                            <w:proofErr w:type="spellEnd"/>
+                            <w:r>
+                              <w:rPr>
+                                <w:rFonts w:ascii="Arial" w:hAnsi="Arial" w:cs="Arial"/>
+                                <w:b/>
+                                <w:bCs/>
+                                <w:color w:val="FFFFFF" w:themeColor="background1"/>
+                                <w:sz w:val="10"/>
+                                <w:szCs w:val="10"/>
+                              </w:rPr>
+                              <w:t>}</w:t>
                             </w:r>
                           </w:p>
                         </w:txbxContent>
@@ -3516,16 +4705,36 @@
                 <w:szCs w:val="16"/>
                 <w:lang w:val="nl-NL"/>
               </w:rPr>
-              <w:t xml:space="preserve">{aopchart </w:t>
-            </w:r>
+              <w:t>{</w:t>
+            </w:r>
+            <w:proofErr w:type="spellStart"/>
             <w:r>
               <w:rPr>
                 <w:sz w:val="16"/>
                 <w:szCs w:val="16"/>
                 <w:lang w:val="nl-NL"/>
               </w:rPr>
+              <w:t>aopchart</w:t>
+            </w:r>
+            <w:proofErr w:type="spellEnd"/>
+            <w:r>
+              <w:rPr>
+                <w:sz w:val="16"/>
+                <w:szCs w:val="16"/>
+                <w:lang w:val="nl-NL"/>
+              </w:rPr>
+              <w:t xml:space="preserve"> </w:t>
+            </w:r>
+            <w:proofErr w:type="spellStart"/>
+            <w:r>
+              <w:rPr>
+                <w:sz w:val="16"/>
+                <w:szCs w:val="16"/>
+                <w:lang w:val="nl-NL"/>
+              </w:rPr>
               <w:t>donutChart</w:t>
             </w:r>
+            <w:proofErr w:type="spellEnd"/>
             <w:r>
               <w:rPr>
                 <w:sz w:val="16"/>
@@ -3570,7 +4779,7 @@
                 <w:noProof/>
               </w:rPr>
               <w:drawing>
-                <wp:inline distT="0" distB="0" distL="0" distR="0" wp14:anchorId="0690D295" wp14:editId="7CEB59C5">
+                <wp:inline distT="0" distB="0" distL="0" distR="0" wp14:anchorId="43070B04" wp14:editId="003E7525">
                   <wp:extent cx="3147060" cy="2451735"/>
                   <wp:effectExtent l="0" t="0" r="15240" b="5715"/>
                   <wp:docPr id="5" name="Chart 5"/>
@@ -3599,7 +4808,6 @@
     </w:tbl>
     <w:p>
       <w:pPr>
-        <w:spacing w:after="160" w:line="259" w:lineRule="auto"/>
         <w:rPr>
           <w:color w:val="FFFFFF" w:themeColor="background1"/>
           <w:lang w:val="nl-NL"/>
@@ -3678,6 +4886,7 @@
                 <w:szCs w:val="18"/>
               </w:rPr>
             </w:pPr>
+            <w:proofErr w:type="spellStart"/>
             <w:r>
               <w:rPr>
                 <w:rFonts w:ascii="Arial" w:hAnsi="Arial" w:cs="Arial"/>
@@ -3689,6 +4898,7 @@
               <w:lastRenderedPageBreak/>
               <w:t>Categorie</w:t>
             </w:r>
+            <w:proofErr w:type="spellEnd"/>
           </w:p>
         </w:tc>
         <w:tc>
@@ -3749,6 +4959,7 @@
                 <w:szCs w:val="18"/>
               </w:rPr>
             </w:pPr>
+            <w:proofErr w:type="spellStart"/>
             <w:r>
               <w:rPr>
                 <w:rFonts w:ascii="Arial" w:hAnsi="Arial" w:cs="Arial"/>
@@ -3759,6 +4970,7 @@
               </w:rPr>
               <w:t>Goedkeurgrens</w:t>
             </w:r>
+            <w:proofErr w:type="spellEnd"/>
           </w:p>
         </w:tc>
         <w:tc>
@@ -3784,6 +4996,7 @@
                 <w:szCs w:val="18"/>
               </w:rPr>
             </w:pPr>
+            <w:proofErr w:type="spellStart"/>
             <w:r>
               <w:rPr>
                 <w:rFonts w:ascii="Arial" w:hAnsi="Arial" w:cs="Arial"/>
@@ -3792,8 +5005,53 @@
                 <w:sz w:val="18"/>
                 <w:szCs w:val="18"/>
               </w:rPr>
-              <w:t>Aantal behaalde fouten</w:t>
-            </w:r>
+              <w:t>Aantal</w:t>
+            </w:r>
+            <w:proofErr w:type="spellEnd"/>
+            <w:r>
+              <w:rPr>
+                <w:rFonts w:ascii="Arial" w:hAnsi="Arial" w:cs="Arial"/>
+                <w:b/>
+                <w:bCs/>
+                <w:sz w:val="18"/>
+                <w:szCs w:val="18"/>
+              </w:rPr>
+              <w:t xml:space="preserve"> </w:t>
+            </w:r>
+            <w:proofErr w:type="spellStart"/>
+            <w:r>
+              <w:rPr>
+                <w:rFonts w:ascii="Arial" w:hAnsi="Arial" w:cs="Arial"/>
+                <w:b/>
+                <w:bCs/>
+                <w:sz w:val="18"/>
+                <w:szCs w:val="18"/>
+              </w:rPr>
+              <w:t>behaalde</w:t>
+            </w:r>
+            <w:proofErr w:type="spellEnd"/>
+            <w:r>
+              <w:rPr>
+                <w:rFonts w:ascii="Arial" w:hAnsi="Arial" w:cs="Arial"/>
+                <w:b/>
+                <w:bCs/>
+                <w:sz w:val="18"/>
+                <w:szCs w:val="18"/>
+              </w:rPr>
+              <w:t xml:space="preserve"> </w:t>
+            </w:r>
+            <w:proofErr w:type="spellStart"/>
+            <w:r>
+              <w:rPr>
+                <w:rFonts w:ascii="Arial" w:hAnsi="Arial" w:cs="Arial"/>
+                <w:b/>
+                <w:bCs/>
+                <w:sz w:val="18"/>
+                <w:szCs w:val="18"/>
+              </w:rPr>
+              <w:t>fouten</w:t>
+            </w:r>
+            <w:proofErr w:type="spellEnd"/>
           </w:p>
         </w:tc>
         <w:tc>
@@ -3819,6 +5077,7 @@
                 <w:szCs w:val="18"/>
               </w:rPr>
             </w:pPr>
+            <w:proofErr w:type="spellStart"/>
             <w:r>
               <w:rPr>
                 <w:rFonts w:ascii="Arial" w:hAnsi="Arial" w:cs="Arial"/>
@@ -3829,6 +5088,7 @@
               </w:rPr>
               <w:t>Beoordeling</w:t>
             </w:r>
+            <w:proofErr w:type="spellEnd"/>
           </w:p>
         </w:tc>
       </w:tr>
@@ -3892,7 +5152,25 @@
                 <w:sz w:val="18"/>
                 <w:szCs w:val="18"/>
               </w:rPr>
-              <w:t>{tel_elementen}</w:t>
+              <w:t>{</w:t>
+            </w:r>
+            <w:proofErr w:type="spellStart"/>
+            <w:r>
+              <w:rPr>
+                <w:rFonts w:ascii="Arial" w:hAnsi="Arial" w:cs="Arial"/>
+                <w:sz w:val="18"/>
+                <w:szCs w:val="18"/>
+              </w:rPr>
+              <w:t>tel_elementen</w:t>
+            </w:r>
+            <w:proofErr w:type="spellEnd"/>
+            <w:r>
+              <w:rPr>
+                <w:rFonts w:ascii="Arial" w:hAnsi="Arial" w:cs="Arial"/>
+                <w:sz w:val="18"/>
+                <w:szCs w:val="18"/>
+              </w:rPr>
+              <w:t>}</w:t>
             </w:r>
           </w:p>
         </w:tc>
@@ -3922,7 +5200,25 @@
                 <w:sz w:val="18"/>
                 <w:szCs w:val="18"/>
               </w:rPr>
-              <w:t>{goedkeurgrens}</w:t>
+              <w:t>{</w:t>
+            </w:r>
+            <w:proofErr w:type="spellStart"/>
+            <w:r>
+              <w:rPr>
+                <w:rFonts w:ascii="Arial" w:hAnsi="Arial" w:cs="Arial"/>
+                <w:sz w:val="18"/>
+                <w:szCs w:val="18"/>
+              </w:rPr>
+              <w:t>goedkeurgrens</w:t>
+            </w:r>
+            <w:proofErr w:type="spellEnd"/>
+            <w:r>
+              <w:rPr>
+                <w:rFonts w:ascii="Arial" w:hAnsi="Arial" w:cs="Arial"/>
+                <w:sz w:val="18"/>
+                <w:szCs w:val="18"/>
+              </w:rPr>
+              <w:t>}</w:t>
             </w:r>
           </w:p>
         </w:tc>
@@ -3953,7 +5249,25 @@
                 <w:sz w:val="18"/>
                 <w:szCs w:val="18"/>
               </w:rPr>
-              <w:t>{aantal_fouten}</w:t>
+              <w:t>{</w:t>
+            </w:r>
+            <w:proofErr w:type="spellStart"/>
+            <w:r>
+              <w:rPr>
+                <w:rFonts w:ascii="Arial" w:hAnsi="Arial" w:cs="Arial"/>
+                <w:sz w:val="18"/>
+                <w:szCs w:val="18"/>
+              </w:rPr>
+              <w:t>aantal_fouten</w:t>
+            </w:r>
+            <w:proofErr w:type="spellEnd"/>
+            <w:r>
+              <w:rPr>
+                <w:rFonts w:ascii="Arial" w:hAnsi="Arial" w:cs="Arial"/>
+                <w:sz w:val="18"/>
+                <w:szCs w:val="18"/>
+              </w:rPr>
+              <w:t>}</w:t>
             </w:r>
           </w:p>
         </w:tc>
@@ -4040,9 +5354,9 @@
           <w:lang w:val="nl-NL"/>
         </w:rPr>
         <w:sectPr>
-          <w:footerReference w:type="default" r:id="rId11"/>
-          <w:headerReference w:type="first" r:id="rId12"/>
-          <w:footerReference w:type="first" r:id="rId13"/>
+          <w:headerReference w:type="default" r:id="rId11"/>
+          <w:footerReference w:type="default" r:id="rId12"/>
+          <w:headerReference w:type="first" r:id="rId13"/>
           <w:pgSz w:w="12240" w:h="15840" w:code="1"/>
           <w:pgMar w:top="720" w:right="720" w:bottom="720" w:left="720" w:header="720" w:footer="720" w:gutter="0"/>
           <w:cols w:space="720"/>
@@ -4182,6 +5496,7 @@
                 <w:lang w:val="nl-NL"/>
               </w:rPr>
             </w:pPr>
+            <w:proofErr w:type="spellStart"/>
             <w:r>
               <w:rPr>
                 <w:rFonts w:ascii="Arial" w:hAnsi="Arial" w:cs="Arial"/>
@@ -4192,6 +5507,7 @@
               </w:rPr>
               <w:t>Categorie</w:t>
             </w:r>
+            <w:proofErr w:type="spellEnd"/>
           </w:p>
         </w:tc>
         <w:tc>
@@ -4258,6 +5574,7 @@
                 <w:lang w:val="nl-NL"/>
               </w:rPr>
             </w:pPr>
+            <w:proofErr w:type="spellStart"/>
             <w:r>
               <w:rPr>
                 <w:rFonts w:ascii="Arial" w:hAnsi="Arial" w:cs="Arial"/>
@@ -4268,6 +5585,7 @@
               </w:rPr>
               <w:t>Vuilsoort</w:t>
             </w:r>
+            <w:proofErr w:type="spellEnd"/>
           </w:p>
         </w:tc>
         <w:tc>
@@ -4296,6 +5614,7 @@
                 <w:lang w:val="nl-NL"/>
               </w:rPr>
             </w:pPr>
+            <w:proofErr w:type="spellStart"/>
             <w:r>
               <w:rPr>
                 <w:rFonts w:ascii="Arial" w:hAnsi="Arial" w:cs="Arial"/>
@@ -4306,6 +5625,7 @@
               </w:rPr>
               <w:t>Opmerking</w:t>
             </w:r>
+            <w:proofErr w:type="spellEnd"/>
           </w:p>
         </w:tc>
         <w:tc>
@@ -4327,6 +5647,7 @@
                 <w:szCs w:val="24"/>
               </w:rPr>
             </w:pPr>
+            <w:proofErr w:type="spellStart"/>
             <w:r>
               <w:rPr>
                 <w:rFonts w:ascii="Arial" w:hAnsi="Arial" w:cs="Arial"/>
@@ -4335,7 +5656,62 @@
                 <w:sz w:val="24"/>
                 <w:szCs w:val="24"/>
               </w:rPr>
-              <w:t>Aantal fout(en)</w:t>
+              <w:t>Aantal</w:t>
+            </w:r>
+            <w:proofErr w:type="spellEnd"/>
+            <w:r>
+              <w:rPr>
+                <w:rFonts w:ascii="Arial" w:hAnsi="Arial" w:cs="Arial"/>
+                <w:b/>
+                <w:bCs/>
+                <w:sz w:val="24"/>
+                <w:szCs w:val="24"/>
+              </w:rPr>
+              <w:t xml:space="preserve"> </w:t>
+            </w:r>
+            <w:proofErr w:type="spellStart"/>
+            <w:r>
+              <w:rPr>
+                <w:rFonts w:ascii="Arial" w:hAnsi="Arial" w:cs="Arial"/>
+                <w:b/>
+                <w:bCs/>
+                <w:sz w:val="24"/>
+                <w:szCs w:val="24"/>
+              </w:rPr>
+              <w:t>fout</w:t>
+            </w:r>
+            <w:proofErr w:type="spellEnd"/>
+            <w:r>
+              <w:rPr>
+                <w:rFonts w:ascii="Arial" w:hAnsi="Arial" w:cs="Arial"/>
+                <w:b/>
+                <w:bCs/>
+                <w:sz w:val="24"/>
+                <w:szCs w:val="24"/>
+              </w:rPr>
+              <w:t>(</w:t>
+            </w:r>
+            <w:proofErr w:type="spellStart"/>
+            <w:r>
+              <w:rPr>
+                <w:rFonts w:ascii="Arial" w:hAnsi="Arial" w:cs="Arial"/>
+                <w:b/>
+                <w:bCs/>
+                <w:sz w:val="24"/>
+                <w:szCs w:val="24"/>
+              </w:rPr>
+              <w:t>en</w:t>
+            </w:r>
+            <w:proofErr w:type="spellEnd"/>
+            <w:r>
+              <w:rPr>
+                <w:rFonts w:ascii="Arial" w:hAnsi="Arial" w:cs="Arial"/>
+                <w:b/>
+                <w:bCs/>
+                <w:sz w:val="24"/>
+                <w:szCs w:val="24"/>
+              </w:rPr>
+              <w:t>)</w:t>
             </w:r>
           </w:p>
         </w:tc>
@@ -4365,6 +5741,7 @@
                 <w:lang w:val="nl-NL"/>
               </w:rPr>
             </w:pPr>
+            <w:proofErr w:type="spellStart"/>
             <w:r>
               <w:rPr>
                 <w:rFonts w:ascii="Arial" w:hAnsi="Arial" w:cs="Arial"/>
@@ -4373,7 +5750,18 @@
                 <w:sz w:val="24"/>
                 <w:szCs w:val="24"/>
               </w:rPr>
-              <w:t>Foto nr.</w:t>
+              <w:t>Foto</w:t>
+            </w:r>
+            <w:proofErr w:type="spellEnd"/>
+            <w:r>
+              <w:rPr>
+                <w:rFonts w:ascii="Arial" w:hAnsi="Arial" w:cs="Arial"/>
+                <w:b/>
+                <w:bCs/>
+                <w:sz w:val="24"/>
+                <w:szCs w:val="24"/>
+              </w:rPr>
+              <w:t xml:space="preserve"> nr.</w:t>
             </w:r>
           </w:p>
         </w:tc>
@@ -4442,7 +5830,25 @@
                 <w:sz w:val="18"/>
                 <w:szCs w:val="18"/>
               </w:rPr>
-              <w:t>{categorie}</w:t>
+              <w:t>{</w:t>
+            </w:r>
+            <w:proofErr w:type="spellStart"/>
+            <w:r>
+              <w:rPr>
+                <w:rFonts w:ascii="Arial" w:hAnsi="Arial" w:cs="Arial"/>
+                <w:sz w:val="18"/>
+                <w:szCs w:val="18"/>
+              </w:rPr>
+              <w:t>categorie</w:t>
+            </w:r>
+            <w:proofErr w:type="spellEnd"/>
+            <w:r>
+              <w:rPr>
+                <w:rFonts w:ascii="Arial" w:hAnsi="Arial" w:cs="Arial"/>
+                <w:sz w:val="18"/>
+                <w:szCs w:val="18"/>
+              </w:rPr>
+              <w:t>}</w:t>
             </w:r>
           </w:p>
         </w:tc>
@@ -4504,7 +5910,25 @@
                 <w:sz w:val="18"/>
                 <w:szCs w:val="18"/>
               </w:rPr>
-              <w:t>{vuilsoort}</w:t>
+              <w:t>{</w:t>
+            </w:r>
+            <w:proofErr w:type="spellStart"/>
+            <w:r>
+              <w:rPr>
+                <w:rFonts w:ascii="Arial" w:hAnsi="Arial" w:cs="Arial"/>
+                <w:sz w:val="18"/>
+                <w:szCs w:val="18"/>
+              </w:rPr>
+              <w:t>vuilsoort</w:t>
+            </w:r>
+            <w:proofErr w:type="spellEnd"/>
+            <w:r>
+              <w:rPr>
+                <w:rFonts w:ascii="Arial" w:hAnsi="Arial" w:cs="Arial"/>
+                <w:sz w:val="18"/>
+                <w:szCs w:val="18"/>
+              </w:rPr>
+              <w:t>}</w:t>
             </w:r>
           </w:p>
         </w:tc>
@@ -4535,7 +5959,25 @@
                 <w:sz w:val="18"/>
                 <w:szCs w:val="18"/>
               </w:rPr>
-              <w:t>{opmerking}</w:t>
+              <w:t>{</w:t>
+            </w:r>
+            <w:proofErr w:type="spellStart"/>
+            <w:r>
+              <w:rPr>
+                <w:rFonts w:ascii="Arial" w:hAnsi="Arial" w:cs="Arial"/>
+                <w:sz w:val="18"/>
+                <w:szCs w:val="18"/>
+              </w:rPr>
+              <w:t>opmerking</w:t>
+            </w:r>
+            <w:proofErr w:type="spellEnd"/>
+            <w:r>
+              <w:rPr>
+                <w:rFonts w:ascii="Arial" w:hAnsi="Arial" w:cs="Arial"/>
+                <w:sz w:val="18"/>
+                <w:szCs w:val="18"/>
+              </w:rPr>
+              <w:t>}</w:t>
             </w:r>
           </w:p>
         </w:tc>
@@ -4563,6 +6005,7 @@
               </w:rPr>
               <w:t>{</w:t>
             </w:r>
+            <w:proofErr w:type="spellStart"/>
             <w:r>
               <w:rPr>
                 <w:rFonts w:ascii="Arial" w:hAnsi="Arial" w:cs="Arial"/>
@@ -4571,6 +6014,7 @@
               </w:rPr>
               <w:t>aantal_fouten</w:t>
             </w:r>
+            <w:proofErr w:type="spellEnd"/>
             <w:r>
               <w:rPr>
                 <w:rFonts w:ascii="Arial" w:hAnsi="Arial" w:cs="Arial"/>
@@ -4610,17 +6054,36 @@
                 <w:sz w:val="18"/>
                 <w:szCs w:val="18"/>
               </w:rPr>
-              <w:t>{foto_nr}</w:t>
-            </w:r>
+              <w:t>{</w:t>
+            </w:r>
+            <w:proofErr w:type="spellStart"/>
             <w:r>
               <w:rPr>
                 <w:rFonts w:ascii="Arial" w:hAnsi="Arial" w:cs="Arial"/>
                 <w:sz w:val="18"/>
                 <w:szCs w:val="18"/>
               </w:rPr>
+              <w:t>foto_nr</w:t>
+            </w:r>
+            <w:proofErr w:type="spellEnd"/>
+            <w:r>
+              <w:rPr>
+                <w:rFonts w:ascii="Arial" w:hAnsi="Arial" w:cs="Arial"/>
+                <w:sz w:val="18"/>
+                <w:szCs w:val="18"/>
+              </w:rPr>
+              <w:t>}</w:t>
+            </w:r>
+            <w:r>
+              <w:rPr>
+                <w:rFonts w:ascii="Arial" w:hAnsi="Arial" w:cs="Arial"/>
+                <w:sz w:val="18"/>
+                <w:szCs w:val="18"/>
+              </w:rPr>
               <w:br/>
               <w:t>{/</w:t>
             </w:r>
+            <w:proofErr w:type="spellStart"/>
             <w:r>
               <w:rPr>
                 <w:rFonts w:ascii="Arial" w:hAnsi="Arial" w:cs="Arial"/>
@@ -4628,7 +6091,17 @@
                 <w:szCs w:val="18"/>
                 <w:lang w:val="nl-NL"/>
               </w:rPr>
-              <w:t>ruimteniveau_opmerkingen}</w:t>
+              <w:t>ruimteniveau_opmerkingen</w:t>
+            </w:r>
+            <w:proofErr w:type="spellEnd"/>
+            <w:r>
+              <w:rPr>
+                <w:rFonts w:ascii="Arial" w:hAnsi="Arial" w:cs="Arial"/>
+                <w:sz w:val="18"/>
+                <w:szCs w:val="18"/>
+                <w:lang w:val="nl-NL"/>
+              </w:rPr>
+              <w:t>}</w:t>
             </w:r>
           </w:p>
         </w:tc>
@@ -4695,8 +6168,18 @@
           <w:szCs w:val="16"/>
           <w:lang w:val="nl-NL"/>
         </w:rPr>
-        <w:t>{_htmlContent</w:t>
-      </w:r>
+        <w:t>{_</w:t>
+      </w:r>
+      <w:proofErr w:type="spellStart"/>
+      <w:r>
+        <w:rPr>
+          <w:sz w:val="16"/>
+          <w:szCs w:val="16"/>
+          <w:lang w:val="nl-NL"/>
+        </w:rPr>
+        <w:t>htmlContent</w:t>
+      </w:r>
+      <w:proofErr w:type="spellEnd"/>
       <w:r>
         <w:rPr>
           <w:sz w:val="16"/>
@@ -4724,7 +6207,31 @@
           <w:szCs w:val="16"/>
           <w:lang w:val="nl-NL"/>
         </w:rPr>
-        <w:t>{/htmlContent.length &gt; 1}</w:t>
+        <w:t>{/</w:t>
+      </w:r>
+      <w:proofErr w:type="spellStart"/>
+      <w:r>
+        <w:rPr>
+          <w:rFonts w:ascii="Arial" w:hAnsi="Arial" w:cs="Arial"/>
+          <w:b/>
+          <w:bCs/>
+          <w:sz w:val="16"/>
+          <w:szCs w:val="16"/>
+          <w:lang w:val="nl-NL"/>
+        </w:rPr>
+        <w:t>htmlContent.length</w:t>
+      </w:r>
+      <w:proofErr w:type="spellEnd"/>
+      <w:r>
+        <w:rPr>
+          <w:rFonts w:ascii="Arial" w:hAnsi="Arial" w:cs="Arial"/>
+          <w:b/>
+          <w:bCs/>
+          <w:sz w:val="16"/>
+          <w:szCs w:val="16"/>
+          <w:lang w:val="nl-NL"/>
+        </w:rPr>
+        <w:t xml:space="preserve"> &gt; 1}</w:t>
       </w:r>
       <w:r>
         <w:rPr>
@@ -4825,6 +6332,7 @@
                 <w:lang w:val="nl-NL"/>
               </w:rPr>
             </w:pPr>
+            <w:proofErr w:type="spellStart"/>
             <w:r>
               <w:rPr>
                 <w:rFonts w:ascii="Arial" w:hAnsi="Arial" w:cs="Arial"/>
@@ -4835,6 +6343,7 @@
               </w:rPr>
               <w:t>Opmerkingen</w:t>
             </w:r>
+            <w:proofErr w:type="spellEnd"/>
             <w:r>
               <w:rPr>
                 <w:rFonts w:ascii="Arial" w:hAnsi="Arial" w:cs="Arial"/>
@@ -4912,8 +6421,27 @@
                 <w:sz w:val="18"/>
                 <w:szCs w:val="18"/>
               </w:rPr>
-              <w:t>{opmerking}{/</w:t>
-            </w:r>
+              <w:t>{</w:t>
+            </w:r>
+            <w:proofErr w:type="spellStart"/>
+            <w:r>
+              <w:rPr>
+                <w:rFonts w:ascii="Arial" w:hAnsi="Arial" w:cs="Arial"/>
+                <w:sz w:val="18"/>
+                <w:szCs w:val="18"/>
+              </w:rPr>
+              <w:t>opmerking</w:t>
+            </w:r>
+            <w:proofErr w:type="spellEnd"/>
+            <w:r>
+              <w:rPr>
+                <w:rFonts w:ascii="Arial" w:hAnsi="Arial" w:cs="Arial"/>
+                <w:sz w:val="18"/>
+                <w:szCs w:val="18"/>
+              </w:rPr>
+              <w:t>}{/</w:t>
+            </w:r>
+            <w:proofErr w:type="spellStart"/>
             <w:r>
               <w:rPr>
                 <w:rFonts w:ascii="Arial" w:hAnsi="Arial" w:cs="Arial"/>
@@ -4921,7 +6449,17 @@
                 <w:szCs w:val="18"/>
                 <w:lang w:val="nl-NL"/>
               </w:rPr>
-              <w:t>algemene_opmerkingen}</w:t>
+              <w:t>algemene_opmerkingen</w:t>
+            </w:r>
+            <w:proofErr w:type="spellEnd"/>
+            <w:r>
+              <w:rPr>
+                <w:rFonts w:ascii="Arial" w:hAnsi="Arial" w:cs="Arial"/>
+                <w:sz w:val="18"/>
+                <w:szCs w:val="18"/>
+                <w:lang w:val="nl-NL"/>
+              </w:rPr>
+              <w:t>}</w:t>
             </w:r>
           </w:p>
         </w:tc>
@@ -4938,6 +6476,7 @@
       <w:pPr>
         <w:spacing w:after="0" w:line="240" w:lineRule="auto"/>
       </w:pPr>
+      <w:proofErr w:type="spellStart"/>
       <w:r>
         <w:rPr>
           <w:rFonts w:ascii="Arial" w:eastAsia="Arial" w:hAnsi="Arial"/>
@@ -4945,8 +6484,69 @@
           <w:color w:val="000000"/>
           <w:sz w:val="18"/>
         </w:rPr>
-        <w:t>Overige- en hygiëne aspecten</w:t>
-      </w:r>
+        <w:t>Overige</w:t>
+      </w:r>
+      <w:proofErr w:type="spellEnd"/>
+      <w:r>
+        <w:rPr>
+          <w:rFonts w:ascii="Arial" w:eastAsia="Arial" w:hAnsi="Arial"/>
+          <w:b/>
+          <w:color w:val="000000"/>
+          <w:sz w:val="18"/>
+        </w:rPr>
+        <w:t xml:space="preserve">- </w:t>
+      </w:r>
+      <w:proofErr w:type="spellStart"/>
+      <w:r>
+        <w:rPr>
+          <w:rFonts w:ascii="Arial" w:eastAsia="Arial" w:hAnsi="Arial"/>
+          <w:b/>
+          <w:color w:val="000000"/>
+          <w:sz w:val="18"/>
+        </w:rPr>
+        <w:t>en</w:t>
+      </w:r>
+      <w:proofErr w:type="spellEnd"/>
+      <w:r>
+        <w:rPr>
+          <w:rFonts w:ascii="Arial" w:eastAsia="Arial" w:hAnsi="Arial"/>
+          <w:b/>
+          <w:color w:val="000000"/>
+          <w:sz w:val="18"/>
+        </w:rPr>
+        <w:t xml:space="preserve"> </w:t>
+      </w:r>
+      <w:proofErr w:type="spellStart"/>
+      <w:r>
+        <w:rPr>
+          <w:rFonts w:ascii="Arial" w:eastAsia="Arial" w:hAnsi="Arial"/>
+          <w:b/>
+          <w:color w:val="000000"/>
+          <w:sz w:val="18"/>
+        </w:rPr>
+        <w:t>hygiëne</w:t>
+      </w:r>
+      <w:proofErr w:type="spellEnd"/>
+      <w:r>
+        <w:rPr>
+          <w:rFonts w:ascii="Arial" w:eastAsia="Arial" w:hAnsi="Arial"/>
+          <w:b/>
+          <w:color w:val="000000"/>
+          <w:sz w:val="18"/>
+        </w:rPr>
+        <w:t xml:space="preserve"> </w:t>
+      </w:r>
+      <w:proofErr w:type="spellStart"/>
+      <w:r>
+        <w:rPr>
+          <w:rFonts w:ascii="Arial" w:eastAsia="Arial" w:hAnsi="Arial"/>
+          <w:b/>
+          <w:color w:val="000000"/>
+          <w:sz w:val="18"/>
+        </w:rPr>
+        <w:t>aspecten</w:t>
+      </w:r>
+      <w:proofErr w:type="spellEnd"/>
     </w:p>
     <w:p>
       <w:pPr>
@@ -5078,6 +6678,7 @@
                 <w:szCs w:val="24"/>
               </w:rPr>
             </w:pPr>
+            <w:proofErr w:type="spellStart"/>
             <w:r>
               <w:rPr>
                 <w:rFonts w:ascii="Arial" w:hAnsi="Arial" w:cs="Arial"/>
@@ -5088,6 +6689,7 @@
               </w:rPr>
               <w:t>Opmerkingen</w:t>
             </w:r>
+            <w:proofErr w:type="spellEnd"/>
           </w:p>
         </w:tc>
       </w:tr>
@@ -5230,22 +6832,32 @@
                 <w:sz w:val="18"/>
                 <w:szCs w:val="18"/>
               </w:rPr>
-              <w:t>{opmerking</w:t>
-            </w:r>
+              <w:t>{</w:t>
+            </w:r>
+            <w:proofErr w:type="spellStart"/>
             <w:r>
               <w:rPr>
                 <w:rFonts w:ascii="Arial" w:hAnsi="Arial" w:cs="Arial"/>
                 <w:sz w:val="18"/>
                 <w:szCs w:val="18"/>
               </w:rPr>
-              <w:t>}</w:t>
-            </w:r>
+              <w:t>opmerking</w:t>
+            </w:r>
+            <w:proofErr w:type="spellEnd"/>
             <w:r>
               <w:rPr>
                 <w:rFonts w:ascii="Arial" w:hAnsi="Arial" w:cs="Arial"/>
                 <w:sz w:val="18"/>
                 <w:szCs w:val="18"/>
               </w:rPr>
+              <w:t>}</w:t>
+            </w:r>
+            <w:r>
+              <w:rPr>
+                <w:rFonts w:ascii="Arial" w:hAnsi="Arial" w:cs="Arial"/>
+                <w:sz w:val="18"/>
+                <w:szCs w:val="18"/>
+              </w:rPr>
               <w:t xml:space="preserve"> </w:t>
             </w:r>
             <w:r>
@@ -5256,6 +6868,7 @@
               </w:rPr>
               <w:t>{/</w:t>
             </w:r>
+            <w:proofErr w:type="spellStart"/>
             <w:r>
               <w:rPr>
                 <w:rFonts w:ascii="Arial" w:hAnsi="Arial" w:cs="Arial"/>
@@ -5263,7 +6876,17 @@
                 <w:szCs w:val="10"/>
                 <w:lang w:val="nl-NL"/>
               </w:rPr>
-              <w:t>overige_hygienische_aspecten}</w:t>
+              <w:t>overige_hygienische_aspecten</w:t>
+            </w:r>
+            <w:proofErr w:type="spellEnd"/>
+            <w:r>
+              <w:rPr>
+                <w:rFonts w:ascii="Arial" w:hAnsi="Arial" w:cs="Arial"/>
+                <w:sz w:val="10"/>
+                <w:szCs w:val="10"/>
+                <w:lang w:val="nl-NL"/>
+              </w:rPr>
+              <w:t>}</w:t>
             </w:r>
           </w:p>
         </w:tc>
@@ -5433,6 +7056,7 @@
                             </w:rPr>
                             <w:t>{</w:t>
                           </w:r>
+                          <w:proofErr w:type="spellStart"/>
                           <w:r>
                             <w:rPr>
                               <w:rFonts w:ascii="Arial" w:eastAsia="Arial" w:hAnsi="Arial" w:cs="Arial"/>
@@ -5477,6 +7101,7 @@
                             </w:rPr>
                             <w:t>_volledig</w:t>
                           </w:r>
+                          <w:proofErr w:type="spellEnd"/>
                           <w:r>
                             <w:rPr>
                               <w:rFonts w:ascii="Arial" w:hAnsi="Arial" w:cs="Arial"/>
@@ -6085,11 +7710,36 @@
 </w:ftr>
 </file>
 
-<file path=word/footer2.xml><?xml version="1.0" encoding="utf-8"?>
-<w:ftr xmlns:wpc="http://schemas.microsoft.com/office/word/2010/wordprocessingCanvas" xmlns:cx="http://schemas.microsoft.com/office/drawing/2014/chartex" xmlns:cx1="http://schemas.microsoft.com/office/drawing/2015/9/8/chartex" xmlns:cx2="http://schemas.microsoft.com/office/drawing/2015/10/21/chartex" xmlns:cx3="http://schemas.microsoft.com/office/drawing/2016/5/9/chartex" xmlns:cx4="http://schemas.microsoft.com/office/drawing/2016/5/10/chartex" xmlns:cx5="http://schemas.microsoft.com/office/drawing/2016/5/11/chartex" xmlns:cx6="http://schemas.microsoft.com/office/drawing/2016/5/12/chartex" xmlns:cx7="http://schemas.microsoft.com/office/drawing/2016/5/13/chartex" xmlns:cx8="http://schemas.microsoft.com/office/drawing/2016/5/14/chartex" xmlns:mc="http://schemas.openxmlformats.org/markup-compatibility/2006" xmlns:aink="http://schemas.microsoft.com/office/drawing/2016/ink" xmlns:am3d="http://schemas.microsoft.com/office/drawing/2017/model3d" xmlns:o="urn:schemas-microsoft-com:office:office" xmlns:r="http://schemas.openxmlformats.org/officeDocument/2006/relationships" xmlns:m="http://schemas.openxmlformats.org/officeDocument/2006/math" xmlns:v="urn:schemas-microsoft-com:vml" xmlns:wp14="http://schemas.microsoft.com/office/word/2010/wordprocessingDrawing" xmlns:wp="http://schemas.openxmlformats.org/drawingml/2006/wordprocessingDrawing" xmlns:w10="urn:schemas-microsoft-com:office:word" xmlns:w="http://schemas.openxmlformats.org/wordprocessingml/2006/main" xmlns:w14="http://schemas.microsoft.com/office/word/2010/wordml" xmlns:w15="http://schemas.microsoft.com/office/word/2012/wordml" xmlns:w16cex="http://schemas.microsoft.com/office/word/2018/wordml/cex" xmlns:w16cid="http://schemas.microsoft.com/office/word/2016/wordml/cid" xmlns:w16="http://schemas.microsoft.com/office/word/2018/wordml" xmlns:w16sdtdh="http://schemas.microsoft.com/office/word/2020/wordml/sdtdatahash" xmlns:w16se="http://schemas.microsoft.com/office/word/2015/wordml/symex" xmlns:wpg="http://schemas.microsoft.com/office/word/2010/wordprocessingGroup" xmlns:wpi="http://schemas.microsoft.com/office/word/2010/wordprocessingInk" xmlns:wne="http://schemas.microsoft.com/office/word/2006/wordml" xmlns:wps="http://schemas.microsoft.com/office/word/2010/wordprocessingShape" mc:Ignorable="w14 w15 w16se w16cid w16 w16cex w16sdtdh wp14">
+<file path=word/footnotes.xml><?xml version="1.0" encoding="utf-8"?>
+<w:footnotes xmlns:wpc="http://schemas.microsoft.com/office/word/2010/wordprocessingCanvas" xmlns:cx="http://schemas.microsoft.com/office/drawing/2014/chartex" xmlns:cx1="http://schemas.microsoft.com/office/drawing/2015/9/8/chartex" xmlns:cx2="http://schemas.microsoft.com/office/drawing/2015/10/21/chartex" xmlns:cx3="http://schemas.microsoft.com/office/drawing/2016/5/9/chartex" xmlns:cx4="http://schemas.microsoft.com/office/drawing/2016/5/10/chartex" xmlns:cx5="http://schemas.microsoft.com/office/drawing/2016/5/11/chartex" xmlns:cx6="http://schemas.microsoft.com/office/drawing/2016/5/12/chartex" xmlns:cx7="http://schemas.microsoft.com/office/drawing/2016/5/13/chartex" xmlns:cx8="http://schemas.microsoft.com/office/drawing/2016/5/14/chartex" xmlns:mc="http://schemas.openxmlformats.org/markup-compatibility/2006" xmlns:aink="http://schemas.microsoft.com/office/drawing/2016/ink" xmlns:am3d="http://schemas.microsoft.com/office/drawing/2017/model3d" xmlns:o="urn:schemas-microsoft-com:office:office" xmlns:r="http://schemas.openxmlformats.org/officeDocument/2006/relationships" xmlns:m="http://schemas.openxmlformats.org/officeDocument/2006/math" xmlns:v="urn:schemas-microsoft-com:vml" xmlns:wp14="http://schemas.microsoft.com/office/word/2010/wordprocessingDrawing" xmlns:wp="http://schemas.openxmlformats.org/drawingml/2006/wordprocessingDrawing" xmlns:w10="urn:schemas-microsoft-com:office:word" xmlns:w="http://schemas.openxmlformats.org/wordprocessingml/2006/main" xmlns:w14="http://schemas.microsoft.com/office/word/2010/wordml" xmlns:w15="http://schemas.microsoft.com/office/word/2012/wordml" xmlns:w16cex="http://schemas.microsoft.com/office/word/2018/wordml/cex" xmlns:w16cid="http://schemas.microsoft.com/office/word/2016/wordml/cid" xmlns:w16="http://schemas.microsoft.com/office/word/2018/wordml" xmlns:w16sdtdh="http://schemas.microsoft.com/office/word/2020/wordml/sdtdatahash" xmlns:w16se="http://schemas.microsoft.com/office/word/2015/wordml/symex" xmlns:wpg="http://schemas.microsoft.com/office/word/2010/wordprocessingGroup" xmlns:wpi="http://schemas.microsoft.com/office/word/2010/wordprocessingInk" xmlns:wne="http://schemas.microsoft.com/office/word/2006/wordml" xmlns:wps="http://schemas.microsoft.com/office/word/2010/wordprocessingShape" mc:Ignorable="w14 w15 w16se w16cid w16 w16cex w16sdtdh wp14">
+  <w:footnote w:type="separator" w:id="-1">
+    <w:p>
+      <w:pPr>
+        <w:spacing w:after="0" w:line="240" w:lineRule="auto"/>
+      </w:pPr>
+      <w:r>
+        <w:separator/>
+      </w:r>
+    </w:p>
+  </w:footnote>
+  <w:footnote w:type="continuationSeparator" w:id="0">
+    <w:p>
+      <w:pPr>
+        <w:spacing w:after="0" w:line="240" w:lineRule="auto"/>
+      </w:pPr>
+      <w:r>
+        <w:continuationSeparator/>
+      </w:r>
+    </w:p>
+  </w:footnote>
+</w:footnotes>
+</file>
+
+<file path=word/header1.xml><?xml version="1.0" encoding="utf-8"?>
+<w:hdr xmlns:wpc="http://schemas.microsoft.com/office/word/2010/wordprocessingCanvas" xmlns:cx="http://schemas.microsoft.com/office/drawing/2014/chartex" xmlns:cx1="http://schemas.microsoft.com/office/drawing/2015/9/8/chartex" xmlns:cx2="http://schemas.microsoft.com/office/drawing/2015/10/21/chartex" xmlns:cx3="http://schemas.microsoft.com/office/drawing/2016/5/9/chartex" xmlns:cx4="http://schemas.microsoft.com/office/drawing/2016/5/10/chartex" xmlns:cx5="http://schemas.microsoft.com/office/drawing/2016/5/11/chartex" xmlns:cx6="http://schemas.microsoft.com/office/drawing/2016/5/12/chartex" xmlns:cx7="http://schemas.microsoft.com/office/drawing/2016/5/13/chartex" xmlns:cx8="http://schemas.microsoft.com/office/drawing/2016/5/14/chartex" xmlns:mc="http://schemas.openxmlformats.org/markup-compatibility/2006" xmlns:aink="http://schemas.microsoft.com/office/drawing/2016/ink" xmlns:am3d="http://schemas.microsoft.com/office/drawing/2017/model3d" xmlns:o="urn:schemas-microsoft-com:office:office" xmlns:r="http://schemas.openxmlformats.org/officeDocument/2006/relationships" xmlns:m="http://schemas.openxmlformats.org/officeDocument/2006/math" xmlns:v="urn:schemas-microsoft-com:vml" xmlns:wp14="http://schemas.microsoft.com/office/word/2010/wordprocessingDrawing" xmlns:wp="http://schemas.openxmlformats.org/drawingml/2006/wordprocessingDrawing" xmlns:w10="urn:schemas-microsoft-com:office:word" xmlns:w="http://schemas.openxmlformats.org/wordprocessingml/2006/main" xmlns:w14="http://schemas.microsoft.com/office/word/2010/wordml" xmlns:w15="http://schemas.microsoft.com/office/word/2012/wordml" xmlns:w16cex="http://schemas.microsoft.com/office/word/2018/wordml/cex" xmlns:w16cid="http://schemas.microsoft.com/office/word/2016/wordml/cid" xmlns:w16="http://schemas.microsoft.com/office/word/2018/wordml" xmlns:w16sdtdh="http://schemas.microsoft.com/office/word/2020/wordml/sdtdatahash" xmlns:w16se="http://schemas.microsoft.com/office/word/2015/wordml/symex" xmlns:wpg="http://schemas.microsoft.com/office/word/2010/wordprocessingGroup" xmlns:wpi="http://schemas.microsoft.com/office/word/2010/wordprocessingInk" xmlns:wne="http://schemas.microsoft.com/office/word/2006/wordml" xmlns:wps="http://schemas.microsoft.com/office/word/2010/wordprocessingShape" mc:Ignorable="w14 w15 w16se w16cid w16 w16cex w16sdtdh wp14">
   <w:p>
     <w:pPr>
-      <w:pStyle w:val="Footer"/>
+      <w:pStyle w:val="Header"/>
     </w:pPr>
     <w:r>
       <w:rPr>
@@ -6098,18 +7748,18 @@
       <mc:AlternateContent>
         <mc:Choice Requires="wps">
           <w:drawing>
-            <wp:anchor distT="45720" distB="45720" distL="114300" distR="114300" simplePos="0" relativeHeight="251664384" behindDoc="1" locked="0" layoutInCell="1" allowOverlap="1" wp14:anchorId="19130E20" wp14:editId="57DAB76C">
+            <wp:anchor distT="45720" distB="45720" distL="114300" distR="114300" simplePos="0" relativeHeight="251664384" behindDoc="0" locked="0" layoutInCell="1" allowOverlap="1" wp14:anchorId="64329AFC" wp14:editId="46C3EDBF">
               <wp:simplePos x="0" y="0"/>
-              <wp:positionH relativeFrom="margin">
-                <wp:posOffset>0</wp:posOffset>
+              <wp:positionH relativeFrom="column">
+                <wp:posOffset>40987</wp:posOffset>
               </wp:positionH>
-              <wp:positionV relativeFrom="paragraph">
-                <wp:posOffset>342900</wp:posOffset>
+              <wp:positionV relativeFrom="page">
+                <wp:posOffset>115166</wp:posOffset>
               </wp:positionV>
-              <wp:extent cx="6629400" cy="227618"/>
-              <wp:effectExtent l="0" t="0" r="19050" b="20320"/>
-              <wp:wrapNone/>
-              <wp:docPr id="2" name="Text Box 2"/>
+              <wp:extent cx="6670675" cy="248920"/>
+              <wp:effectExtent l="0" t="0" r="0" b="0"/>
+              <wp:wrapSquare wrapText="bothSides"/>
+              <wp:docPr id="24" name="Text Box 2"/>
               <wp:cNvGraphicFramePr>
                 <a:graphicFrameLocks xmlns:a="http://schemas.openxmlformats.org/drawingml/2006/main"/>
               </wp:cNvGraphicFramePr>
@@ -6122,18 +7772,16 @@
                     <wps:spPr bwMode="auto">
                       <a:xfrm>
                         <a:off x="0" y="0"/>
-                        <a:ext cx="6629400" cy="227618"/>
+                        <a:ext cx="6670675" cy="248920"/>
                       </a:xfrm>
                       <a:prstGeom prst="rect">
                         <a:avLst/>
                       </a:prstGeom>
                       <a:solidFill>
-                        <a:srgbClr val="2596BE"/>
+                        <a:srgbClr val="458FA6"/>
                       </a:solidFill>
                       <a:ln w="9525">
-                        <a:solidFill>
-                          <a:srgbClr val="458FA6"/>
-                        </a:solidFill>
+                        <a:noFill/>
                         <a:miter lim="800000"/>
                         <a:headEnd/>
                         <a:tailEnd/>
@@ -6143,11 +7791,11 @@
                       <w:txbxContent>
                         <w:p>
                           <w:pPr>
-                            <w:spacing w:after="0" w:line="240" w:lineRule="auto"/>
                             <w:rPr>
                               <w:rFonts w:ascii="Arial" w:hAnsi="Arial" w:cs="Arial"/>
                               <w:i/>
                               <w:iCs/>
+                              <w:color w:val="FFFFFF" w:themeColor="background1"/>
                               <w:sz w:val="20"/>
                               <w:szCs w:val="20"/>
                               <w:lang w:val="nl-NL"/>
@@ -6158,48 +7806,113 @@
                               <w:rFonts w:ascii="Arial" w:hAnsi="Arial" w:cs="Arial"/>
                               <w:i/>
                               <w:iCs/>
+                              <w:color w:val="FFFFFF" w:themeColor="background1"/>
                               <w:sz w:val="20"/>
                               <w:szCs w:val="20"/>
                               <w:lang w:val="nl-NL"/>
                             </w:rPr>
-                            <w:t xml:space="preserve">      </w:t>
+                            <w:t xml:space="preserve">Project: </w:t>
                           </w:r>
                           <w:r>
                             <w:rPr>
                               <w:rFonts w:ascii="Arial" w:eastAsia="Arial" w:hAnsi="Arial" w:cs="Arial"/>
                               <w:i/>
-                              <w:color w:val="FFFFFF"/>
+                              <w:iCs/>
+                              <w:color w:val="FFFFFF" w:themeColor="background1"/>
                               <w:sz w:val="20"/>
                               <w:szCs w:val="20"/>
                               <w:lang w:val="nl-NL"/>
                             </w:rPr>
-                            <w:t>Datum</w:t>
+                            <w:t>{project}</w:t>
                           </w:r>
                           <w:r>
                             <w:rPr>
                               <w:rFonts w:ascii="Arial" w:eastAsia="Arial" w:hAnsi="Arial" w:cs="Arial"/>
                               <w:i/>
-                              <w:color w:val="FFFFFF"/>
+                              <w:iCs/>
+                              <w:color w:val="FFFFFF" w:themeColor="background1"/>
                               <w:sz w:val="20"/>
                               <w:szCs w:val="20"/>
                               <w:lang w:val="nl-NL"/>
                             </w:rPr>
-                            <w:t>:</w:t>
+                            <w:tab/>
                           </w:r>
                           <w:r>
                             <w:rPr>
-                              <w:rFonts w:ascii="Arial" w:hAnsi="Arial" w:cs="Arial"/>
+                              <w:rFonts w:ascii="Arial" w:eastAsia="Arial" w:hAnsi="Arial" w:cs="Arial"/>
                               <w:i/>
                               <w:iCs/>
+                              <w:color w:val="FFFFFF" w:themeColor="background1"/>
                               <w:sz w:val="20"/>
                               <w:szCs w:val="20"/>
                               <w:lang w:val="nl-NL"/>
                             </w:rPr>
-                            <w:t xml:space="preserve"> </w:t>
+                            <w:tab/>
                           </w:r>
                           <w:r>
                             <w:rPr>
-                              <w:rFonts w:ascii="Arial" w:hAnsi="Arial" w:cs="Arial"/>
+                              <w:rFonts w:ascii="Arial" w:eastAsia="Arial" w:hAnsi="Arial" w:cs="Arial"/>
+                              <w:i/>
+                              <w:iCs/>
+                              <w:color w:val="FFFFFF" w:themeColor="background1"/>
+                              <w:sz w:val="20"/>
+                              <w:szCs w:val="20"/>
+                              <w:lang w:val="nl-NL"/>
+                            </w:rPr>
+                            <w:tab/>
+                          </w:r>
+                          <w:r>
+                            <w:rPr>
+                              <w:rFonts w:ascii="Arial" w:eastAsia="Arial" w:hAnsi="Arial" w:cs="Arial"/>
+                              <w:i/>
+                              <w:iCs/>
+                              <w:color w:val="FFFFFF" w:themeColor="background1"/>
+                              <w:sz w:val="20"/>
+                              <w:szCs w:val="20"/>
+                              <w:lang w:val="nl-NL"/>
+                            </w:rPr>
+                            <w:tab/>
+                          </w:r>
+                          <w:r>
+                            <w:rPr>
+                              <w:rFonts w:ascii="Arial" w:eastAsia="Arial" w:hAnsi="Arial" w:cs="Arial"/>
+                              <w:i/>
+                              <w:iCs/>
+                              <w:color w:val="FFFFFF" w:themeColor="background1"/>
+                              <w:sz w:val="20"/>
+                              <w:szCs w:val="20"/>
+                              <w:lang w:val="nl-NL"/>
+                            </w:rPr>
+                            <w:tab/>
+                          </w:r>
+                          <w:r>
+                            <w:rPr>
+                              <w:rFonts w:ascii="Arial" w:eastAsia="Arial" w:hAnsi="Arial" w:cs="Arial"/>
+                              <w:i/>
+                              <w:iCs/>
+                              <w:color w:val="FFFFFF" w:themeColor="background1"/>
+                              <w:sz w:val="20"/>
+                              <w:szCs w:val="20"/>
+                              <w:lang w:val="nl-NL"/>
+                            </w:rPr>
+                            <w:tab/>
+                          </w:r>
+                          <w:r>
+                            <w:rPr>
+                              <w:rFonts w:ascii="Arial" w:eastAsia="Arial" w:hAnsi="Arial" w:cs="Arial"/>
+                              <w:i/>
+                              <w:iCs/>
+                              <w:color w:val="FFFFFF" w:themeColor="background1"/>
+                              <w:sz w:val="20"/>
+                              <w:szCs w:val="20"/>
+                              <w:lang w:val="nl-NL"/>
+                            </w:rPr>
+                            <w:tab/>
+                            <w:t>Rapportnummer:</w:t>
+                          </w:r>
+                          <w:r>
+                            <w:rPr>
+                              <w:rFonts w:ascii="Arial" w:eastAsia="Arial" w:hAnsi="Arial"/>
                               <w:i/>
                               <w:iCs/>
                               <w:color w:val="FFFFFF" w:themeColor="background1"/>
@@ -6209,20 +7922,23 @@
                             </w:rPr>
                             <w:t>{</w:t>
                           </w:r>
+                          <w:proofErr w:type="spellStart"/>
                           <w:r>
                             <w:rPr>
-                              <w:rFonts w:ascii="Arial" w:eastAsia="Arial" w:hAnsi="Arial" w:cs="Arial"/>
+                              <w:rFonts w:ascii="Arial" w:eastAsia="Arial" w:hAnsi="Arial"/>
                               <w:i/>
-                              <w:color w:val="FFFFFF"/>
+                              <w:iCs/>
+                              <w:color w:val="FFFFFF" w:themeColor="background1"/>
                               <w:sz w:val="20"/>
                               <w:szCs w:val="20"/>
                               <w:lang w:val="nl-NL"/>
                             </w:rPr>
-                            <w:t>datum_controle_volledig</w:t>
+                            <w:t>rapport_nummer</w:t>
                           </w:r>
+                          <w:proofErr w:type="spellEnd"/>
                           <w:r>
                             <w:rPr>
-                              <w:rFonts w:ascii="Arial" w:hAnsi="Arial" w:cs="Arial"/>
+                              <w:rFonts w:ascii="Arial" w:eastAsia="Arial" w:hAnsi="Arial"/>
                               <w:i/>
                               <w:iCs/>
                               <w:color w:val="FFFFFF" w:themeColor="background1"/>
@@ -6234,209 +7950,15 @@
                           </w:r>
                           <w:r>
                             <w:rPr>
-                              <w:rFonts w:ascii="Arial" w:hAnsi="Arial" w:cs="Arial"/>
+                              <w:rFonts w:ascii="Arial" w:eastAsia="Arial" w:hAnsi="Arial" w:cs="Arial"/>
                               <w:i/>
                               <w:iCs/>
+                              <w:color w:val="FFFFFF" w:themeColor="background1"/>
                               <w:sz w:val="20"/>
                               <w:szCs w:val="20"/>
                               <w:lang w:val="nl-NL"/>
                             </w:rPr>
-                            <w:tab/>
-                          </w:r>
-                          <w:r>
-                            <w:rPr>
-                              <w:rFonts w:ascii="Arial" w:hAnsi="Arial" w:cs="Arial"/>
-                              <w:i/>
-                              <w:iCs/>
-                              <w:sz w:val="20"/>
-                              <w:szCs w:val="20"/>
-                              <w:lang w:val="nl-NL"/>
-                            </w:rPr>
-                            <w:tab/>
-                          </w:r>
-                          <w:r>
-                            <w:rPr>
-                              <w:rFonts w:ascii="Arial" w:hAnsi="Arial" w:cs="Arial"/>
-                              <w:i/>
-                              <w:iCs/>
-                              <w:sz w:val="20"/>
-                              <w:szCs w:val="20"/>
-                              <w:lang w:val="nl-NL"/>
-                            </w:rPr>
-                            <w:tab/>
-                          </w:r>
-                          <w:r>
-                            <w:rPr>
-                              <w:rFonts w:ascii="Arial" w:hAnsi="Arial" w:cs="Arial"/>
-                              <w:i/>
-                              <w:iCs/>
-                              <w:sz w:val="20"/>
-                              <w:szCs w:val="20"/>
-                              <w:lang w:val="nl-NL"/>
-                            </w:rPr>
-                            <w:tab/>
-                          </w:r>
-                          <w:r>
-                            <w:rPr>
-                              <w:rFonts w:ascii="Arial" w:hAnsi="Arial" w:cs="Arial"/>
-                              <w:i/>
-                              <w:iCs/>
-                              <w:sz w:val="20"/>
-                              <w:szCs w:val="20"/>
-                              <w:lang w:val="nl-NL"/>
-                            </w:rPr>
-                            <w:tab/>
-                          </w:r>
-                          <w:r>
-                            <w:rPr>
-                              <w:rFonts w:ascii="Arial" w:hAnsi="Arial" w:cs="Arial"/>
-                              <w:i/>
-                              <w:iCs/>
-                              <w:sz w:val="20"/>
-                              <w:szCs w:val="20"/>
-                              <w:lang w:val="nl-NL"/>
-                            </w:rPr>
-                            <w:tab/>
-                          </w:r>
-                          <w:r>
-                            <w:rPr>
-                              <w:rFonts w:ascii="Arial" w:hAnsi="Arial" w:cs="Arial"/>
-                              <w:i/>
-                              <w:iCs/>
-                              <w:sz w:val="20"/>
-                              <w:szCs w:val="20"/>
-                              <w:lang w:val="nl-NL"/>
-                            </w:rPr>
-                            <w:tab/>
-                            <w:t xml:space="preserve">                    </w:t>
-                          </w:r>
-                          <w:r>
-                            <w:rPr>
-                              <w:rFonts w:ascii="Arial" w:eastAsia="Arial" w:hAnsi="Arial" w:cs="Arial"/>
-                              <w:i/>
-                              <w:color w:val="FFFFFF"/>
-                              <w:sz w:val="20"/>
-                              <w:szCs w:val="20"/>
-                              <w:lang w:val="nl-NL"/>
-                            </w:rPr>
-                            <w:t xml:space="preserve">Blad </w:t>
-                          </w:r>
-                          <w:r>
-                            <w:rPr>
-                              <w:rFonts w:ascii="Arial" w:eastAsia="Arial" w:hAnsi="Arial" w:cs="Arial"/>
-                              <w:i/>
-                              <w:color w:val="FFFFFF"/>
-                              <w:sz w:val="20"/>
-                              <w:szCs w:val="20"/>
-                            </w:rPr>
-                            <w:fldChar w:fldCharType="begin"/>
-                          </w:r>
-                          <w:r>
-                            <w:rPr>
-                              <w:rFonts w:ascii="Arial" w:eastAsia="Arial" w:hAnsi="Arial" w:cs="Arial"/>
-                              <w:i/>
-                              <w:noProof/>
-                              <w:color w:val="FFFFFF"/>
-                              <w:sz w:val="20"/>
-                              <w:szCs w:val="20"/>
-                              <w:lang w:val="nl-NL"/>
-                            </w:rPr>
-                            <w:instrText xml:space="preserve"> PAGE </w:instrText>
-                          </w:r>
-                          <w:r>
-                            <w:rPr>
-                              <w:rFonts w:ascii="Arial" w:eastAsia="Arial" w:hAnsi="Arial" w:cs="Arial"/>
-                              <w:i/>
-                              <w:color w:val="FFFFFF"/>
-                              <w:sz w:val="20"/>
-                              <w:szCs w:val="20"/>
-                            </w:rPr>
-                            <w:fldChar w:fldCharType="separate"/>
-                          </w:r>
-                          <w:r>
-                            <w:rPr>
-                              <w:rFonts w:ascii="Arial" w:eastAsia="Arial" w:hAnsi="Arial" w:cs="Arial"/>
-                              <w:i/>
-                              <w:color w:val="FFFFFF"/>
-                              <w:sz w:val="20"/>
-                              <w:szCs w:val="20"/>
-                              <w:lang w:val="nl-NL"/>
-                            </w:rPr>
-                            <w:t>2</w:t>
-                          </w:r>
-                          <w:r>
-                            <w:rPr>
-                              <w:rFonts w:ascii="Arial" w:eastAsia="Arial" w:hAnsi="Arial" w:cs="Arial"/>
-                              <w:i/>
-                              <w:color w:val="FFFFFF"/>
-                              <w:sz w:val="20"/>
-                              <w:szCs w:val="20"/>
-                            </w:rPr>
-                            <w:fldChar w:fldCharType="end"/>
-                          </w:r>
-                          <w:r>
-                            <w:rPr>
-                              <w:rFonts w:ascii="Arial" w:eastAsia="Arial" w:hAnsi="Arial" w:cs="Arial"/>
-                              <w:i/>
-                              <w:color w:val="FFFFFF"/>
-                              <w:sz w:val="20"/>
-                              <w:szCs w:val="20"/>
-                              <w:lang w:val="nl-NL"/>
-                            </w:rPr>
-                            <w:t xml:space="preserve"> van </w:t>
-                          </w:r>
-                          <w:r>
-                            <w:rPr>
-                              <w:rFonts w:ascii="Arial" w:eastAsia="Arial" w:hAnsi="Arial" w:cs="Arial"/>
-                              <w:i/>
-                              <w:color w:val="FFFFFF"/>
-                              <w:sz w:val="20"/>
-                              <w:szCs w:val="20"/>
-                            </w:rPr>
-                            <w:fldChar w:fldCharType="begin"/>
-                          </w:r>
-                          <w:r>
-                            <w:rPr>
-                              <w:rFonts w:ascii="Arial" w:eastAsia="Arial" w:hAnsi="Arial" w:cs="Arial"/>
-                              <w:i/>
-                              <w:noProof/>
-                              <w:color w:val="FFFFFF"/>
-                              <w:sz w:val="20"/>
-                              <w:szCs w:val="20"/>
-                              <w:lang w:val="nl-NL"/>
-                            </w:rPr>
-                            <w:instrText xml:space="preserve"> NUMPAGES </w:instrText>
-                          </w:r>
-                          <w:r>
-                            <w:rPr>
-                              <w:rFonts w:ascii="Arial" w:eastAsia="Arial" w:hAnsi="Arial" w:cs="Arial"/>
-                              <w:i/>
-                              <w:color w:val="FFFFFF"/>
-                              <w:sz w:val="20"/>
-                              <w:szCs w:val="20"/>
-                            </w:rPr>
-                            <w:fldChar w:fldCharType="separate"/>
-                          </w:r>
-                          <w:r>
-                            <w:rPr>
-                              <w:rFonts w:ascii="Arial" w:eastAsia="Arial" w:hAnsi="Arial" w:cs="Arial"/>
-                              <w:i/>
-                              <w:color w:val="FFFFFF"/>
-                              <w:sz w:val="20"/>
-                              <w:szCs w:val="20"/>
-                              <w:lang w:val="nl-NL"/>
-                            </w:rPr>
-                            <w:t>7</w:t>
-                          </w:r>
-                          <w:r>
-                            <w:rPr>
-                              <w:rFonts w:ascii="Arial" w:eastAsia="Arial" w:hAnsi="Arial" w:cs="Arial"/>
-                              <w:i/>
-                              <w:color w:val="FFFFFF"/>
-                              <w:sz w:val="20"/>
-                              <w:szCs w:val="20"/>
-                            </w:rPr>
-                            <w:fldChar w:fldCharType="end"/>
+                            <w:br/>
                           </w:r>
                         </w:p>
                       </w:txbxContent>
@@ -6458,20 +7980,20 @@
         </mc:Choice>
         <mc:Fallback>
           <w:pict>
-            <v:shapetype w14:anchorId="19130E20" id="_x0000_t202" coordsize="21600,21600" o:spt="202" path="m,l,21600r21600,l21600,xe">
+            <v:shapetype w14:anchorId="64329AFC" id="_x0000_t202" coordsize="21600,21600" o:spt="202" path="m,l,21600r21600,l21600,xe">
               <v:stroke joinstyle="miter"/>
               <v:path gradientshapeok="t" o:connecttype="rect"/>
             </v:shapetype>
-            <v:shape id="_x0000_s1041" type="#_x0000_t202" style="position:absolute;margin-left:0;margin-top:27pt;width:522pt;height:17.9pt;z-index:-251652096;visibility:visible;mso-wrap-style:square;mso-width-percent:0;mso-height-percent:0;mso-wrap-distance-left:9pt;mso-wrap-distance-top:3.6pt;mso-wrap-distance-right:9pt;mso-wrap-distance-bottom:3.6pt;mso-position-horizontal:absolute;mso-position-horizontal-relative:margin;mso-position-vertical:absolute;mso-position-vertical-relative:text;mso-width-percent:0;mso-height-percent:0;mso-width-relative:margin;mso-height-relative:margin;v-text-anchor:top" o:gfxdata="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" fillcolor="#2596be" strokecolor="#458fa6">
+            <v:shape id="_x0000_s1040" type="#_x0000_t202" style="position:absolute;margin-left:3.25pt;margin-top:9.05pt;width:525.25pt;height:19.6pt;z-index:251664384;visibility:visible;mso-wrap-style:square;mso-width-percent:0;mso-height-percent:0;mso-wrap-distance-left:9pt;mso-wrap-distance-top:3.6pt;mso-wrap-distance-right:9pt;mso-wrap-distance-bottom:3.6pt;mso-position-horizontal:absolute;mso-position-horizontal-relative:text;mso-position-vertical:absolute;mso-position-vertical-relative:page;mso-width-percent:0;mso-height-percent:0;mso-width-relative:margin;mso-height-relative:margin;v-text-anchor:top" o:gfxdata="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" fillcolor="#458fa6" stroked="f">
               <v:textbox>
                 <w:txbxContent>
                   <w:p>
                     <w:pPr>
-                      <w:spacing w:after="0" w:line="240" w:lineRule="auto"/>
                       <w:rPr>
                         <w:rFonts w:ascii="Arial" w:hAnsi="Arial" w:cs="Arial"/>
                         <w:i/>
                         <w:iCs/>
+                        <w:color w:val="FFFFFF" w:themeColor="background1"/>
                         <w:sz w:val="20"/>
                         <w:szCs w:val="20"/>
                         <w:lang w:val="nl-NL"/>
@@ -6482,48 +8004,113 @@
                         <w:rFonts w:ascii="Arial" w:hAnsi="Arial" w:cs="Arial"/>
                         <w:i/>
                         <w:iCs/>
+                        <w:color w:val="FFFFFF" w:themeColor="background1"/>
                         <w:sz w:val="20"/>
                         <w:szCs w:val="20"/>
                         <w:lang w:val="nl-NL"/>
                       </w:rPr>
-                      <w:t xml:space="preserve">      </w:t>
+                      <w:t xml:space="preserve">Project: </w:t>
                     </w:r>
                     <w:r>
                       <w:rPr>
                         <w:rFonts w:ascii="Arial" w:eastAsia="Arial" w:hAnsi="Arial" w:cs="Arial"/>
                         <w:i/>
-                        <w:color w:val="FFFFFF"/>
+                        <w:iCs/>
+                        <w:color w:val="FFFFFF" w:themeColor="background1"/>
                         <w:sz w:val="20"/>
                         <w:szCs w:val="20"/>
                         <w:lang w:val="nl-NL"/>
                       </w:rPr>
-                      <w:t>Datum</w:t>
+                      <w:t>{project}</w:t>
                     </w:r>
                     <w:r>
                       <w:rPr>
                         <w:rFonts w:ascii="Arial" w:eastAsia="Arial" w:hAnsi="Arial" w:cs="Arial"/>
                         <w:i/>
-                        <w:color w:val="FFFFFF"/>
+                        <w:iCs/>
+                        <w:color w:val="FFFFFF" w:themeColor="background1"/>
                         <w:sz w:val="20"/>
                         <w:szCs w:val="20"/>
                         <w:lang w:val="nl-NL"/>
                       </w:rPr>
-                      <w:t>:</w:t>
+                      <w:tab/>
                     </w:r>
                     <w:r>
                       <w:rPr>
-                        <w:rFonts w:ascii="Arial" w:hAnsi="Arial" w:cs="Arial"/>
+                        <w:rFonts w:ascii="Arial" w:eastAsia="Arial" w:hAnsi="Arial" w:cs="Arial"/>
                         <w:i/>
                         <w:iCs/>
+                        <w:color w:val="FFFFFF" w:themeColor="background1"/>
                         <w:sz w:val="20"/>
                         <w:szCs w:val="20"/>
                         <w:lang w:val="nl-NL"/>
                       </w:rPr>
-                      <w:t xml:space="preserve"> </w:t>
+                      <w:tab/>
                     </w:r>
                     <w:r>
                       <w:rPr>
-                        <w:rFonts w:ascii="Arial" w:hAnsi="Arial" w:cs="Arial"/>
+                        <w:rFonts w:ascii="Arial" w:eastAsia="Arial" w:hAnsi="Arial" w:cs="Arial"/>
+                        <w:i/>
+                        <w:iCs/>
+                        <w:color w:val="FFFFFF" w:themeColor="background1"/>
+                        <w:sz w:val="20"/>
+                        <w:szCs w:val="20"/>
+                        <w:lang w:val="nl-NL"/>
+                      </w:rPr>
+                      <w:tab/>
+                    </w:r>
+                    <w:r>
+                      <w:rPr>
+                        <w:rFonts w:ascii="Arial" w:eastAsia="Arial" w:hAnsi="Arial" w:cs="Arial"/>
+                        <w:i/>
+                        <w:iCs/>
+                        <w:color w:val="FFFFFF" w:themeColor="background1"/>
+                        <w:sz w:val="20"/>
+                        <w:szCs w:val="20"/>
+                        <w:lang w:val="nl-NL"/>
+                      </w:rPr>
+                      <w:tab/>
+                    </w:r>
+                    <w:r>
+                      <w:rPr>
+                        <w:rFonts w:ascii="Arial" w:eastAsia="Arial" w:hAnsi="Arial" w:cs="Arial"/>
+                        <w:i/>
+                        <w:iCs/>
+                        <w:color w:val="FFFFFF" w:themeColor="background1"/>
+                        <w:sz w:val="20"/>
+                        <w:szCs w:val="20"/>
+                        <w:lang w:val="nl-NL"/>
+                      </w:rPr>
+                      <w:tab/>
+                    </w:r>
+                    <w:r>
+                      <w:rPr>
+                        <w:rFonts w:ascii="Arial" w:eastAsia="Arial" w:hAnsi="Arial" w:cs="Arial"/>
+                        <w:i/>
+                        <w:iCs/>
+                        <w:color w:val="FFFFFF" w:themeColor="background1"/>
+                        <w:sz w:val="20"/>
+                        <w:szCs w:val="20"/>
+                        <w:lang w:val="nl-NL"/>
+                      </w:rPr>
+                      <w:tab/>
+                    </w:r>
+                    <w:r>
+                      <w:rPr>
+                        <w:rFonts w:ascii="Arial" w:eastAsia="Arial" w:hAnsi="Arial" w:cs="Arial"/>
+                        <w:i/>
+                        <w:iCs/>
+                        <w:color w:val="FFFFFF" w:themeColor="background1"/>
+                        <w:sz w:val="20"/>
+                        <w:szCs w:val="20"/>
+                        <w:lang w:val="nl-NL"/>
+                      </w:rPr>
+                      <w:tab/>
+                      <w:t>Rapportnummer:</w:t>
+                    </w:r>
+                    <w:r>
+                      <w:rPr>
+                        <w:rFonts w:ascii="Arial" w:eastAsia="Arial" w:hAnsi="Arial"/>
                         <w:i/>
                         <w:iCs/>
                         <w:color w:val="FFFFFF" w:themeColor="background1"/>
@@ -6533,20 +8120,23 @@
                       </w:rPr>
                       <w:t>{</w:t>
                     </w:r>
+                    <w:proofErr w:type="spellStart"/>
                     <w:r>
                       <w:rPr>
-                        <w:rFonts w:ascii="Arial" w:eastAsia="Arial" w:hAnsi="Arial" w:cs="Arial"/>
+                        <w:rFonts w:ascii="Arial" w:eastAsia="Arial" w:hAnsi="Arial"/>
                         <w:i/>
-                        <w:color w:val="FFFFFF"/>
+                        <w:iCs/>
+                        <w:color w:val="FFFFFF" w:themeColor="background1"/>
                         <w:sz w:val="20"/>
                         <w:szCs w:val="20"/>
                         <w:lang w:val="nl-NL"/>
                       </w:rPr>
-                      <w:t>datum_controle_volledig</w:t>
+                      <w:t>rapport_nummer</w:t>
                     </w:r>
+                    <w:proofErr w:type="spellEnd"/>
                     <w:r>
                       <w:rPr>
-                        <w:rFonts w:ascii="Arial" w:hAnsi="Arial" w:cs="Arial"/>
+                        <w:rFonts w:ascii="Arial" w:eastAsia="Arial" w:hAnsi="Arial"/>
                         <w:i/>
                         <w:iCs/>
                         <w:color w:val="FFFFFF" w:themeColor="background1"/>
@@ -6558,249 +8148,30 @@
                     </w:r>
                     <w:r>
                       <w:rPr>
-                        <w:rFonts w:ascii="Arial" w:hAnsi="Arial" w:cs="Arial"/>
+                        <w:rFonts w:ascii="Arial" w:eastAsia="Arial" w:hAnsi="Arial" w:cs="Arial"/>
                         <w:i/>
                         <w:iCs/>
+                        <w:color w:val="FFFFFF" w:themeColor="background1"/>
                         <w:sz w:val="20"/>
                         <w:szCs w:val="20"/>
                         <w:lang w:val="nl-NL"/>
                       </w:rPr>
-                      <w:tab/>
-                    </w:r>
-                    <w:r>
-                      <w:rPr>
-                        <w:rFonts w:ascii="Arial" w:hAnsi="Arial" w:cs="Arial"/>
-                        <w:i/>
-                        <w:iCs/>
-                        <w:sz w:val="20"/>
-                        <w:szCs w:val="20"/>
-                        <w:lang w:val="nl-NL"/>
-                      </w:rPr>
-                      <w:tab/>
-                    </w:r>
-                    <w:r>
-                      <w:rPr>
-                        <w:rFonts w:ascii="Arial" w:hAnsi="Arial" w:cs="Arial"/>
-                        <w:i/>
-                        <w:iCs/>
-                        <w:sz w:val="20"/>
-                        <w:szCs w:val="20"/>
-                        <w:lang w:val="nl-NL"/>
-                      </w:rPr>
-                      <w:tab/>
-                    </w:r>
-                    <w:r>
-                      <w:rPr>
-                        <w:rFonts w:ascii="Arial" w:hAnsi="Arial" w:cs="Arial"/>
-                        <w:i/>
-                        <w:iCs/>
-                        <w:sz w:val="20"/>
-                        <w:szCs w:val="20"/>
-                        <w:lang w:val="nl-NL"/>
-                      </w:rPr>
-                      <w:tab/>
-                    </w:r>
-                    <w:r>
-                      <w:rPr>
-                        <w:rFonts w:ascii="Arial" w:hAnsi="Arial" w:cs="Arial"/>
-                        <w:i/>
-                        <w:iCs/>
-                        <w:sz w:val="20"/>
-                        <w:szCs w:val="20"/>
-                        <w:lang w:val="nl-NL"/>
-                      </w:rPr>
-                      <w:tab/>
-                    </w:r>
-                    <w:r>
-                      <w:rPr>
-                        <w:rFonts w:ascii="Arial" w:hAnsi="Arial" w:cs="Arial"/>
-                        <w:i/>
-                        <w:iCs/>
-                        <w:sz w:val="20"/>
-                        <w:szCs w:val="20"/>
-                        <w:lang w:val="nl-NL"/>
-                      </w:rPr>
-                      <w:tab/>
-                    </w:r>
-                    <w:r>
-                      <w:rPr>
-                        <w:rFonts w:ascii="Arial" w:hAnsi="Arial" w:cs="Arial"/>
-                        <w:i/>
-                        <w:iCs/>
-                        <w:sz w:val="20"/>
-                        <w:szCs w:val="20"/>
-                        <w:lang w:val="nl-NL"/>
-                      </w:rPr>
-                      <w:tab/>
-                      <w:t xml:space="preserve">                    </w:t>
-                    </w:r>
-                    <w:r>
-                      <w:rPr>
-                        <w:rFonts w:ascii="Arial" w:eastAsia="Arial" w:hAnsi="Arial" w:cs="Arial"/>
-                        <w:i/>
-                        <w:color w:val="FFFFFF"/>
-                        <w:sz w:val="20"/>
-                        <w:szCs w:val="20"/>
-                        <w:lang w:val="nl-NL"/>
-                      </w:rPr>
-                      <w:t xml:space="preserve">Blad </w:t>
-                    </w:r>
-                    <w:r>
-                      <w:rPr>
-                        <w:rFonts w:ascii="Arial" w:eastAsia="Arial" w:hAnsi="Arial" w:cs="Arial"/>
-                        <w:i/>
-                        <w:color w:val="FFFFFF"/>
-                        <w:sz w:val="20"/>
-                        <w:szCs w:val="20"/>
-                      </w:rPr>
-                      <w:fldChar w:fldCharType="begin"/>
-                    </w:r>
-                    <w:r>
-                      <w:rPr>
-                        <w:rFonts w:ascii="Arial" w:eastAsia="Arial" w:hAnsi="Arial" w:cs="Arial"/>
-                        <w:i/>
-                        <w:noProof/>
-                        <w:color w:val="FFFFFF"/>
-                        <w:sz w:val="20"/>
-                        <w:szCs w:val="20"/>
-                        <w:lang w:val="nl-NL"/>
-                      </w:rPr>
-                      <w:instrText xml:space="preserve"> PAGE </w:instrText>
-                    </w:r>
-                    <w:r>
-                      <w:rPr>
-                        <w:rFonts w:ascii="Arial" w:eastAsia="Arial" w:hAnsi="Arial" w:cs="Arial"/>
-                        <w:i/>
-                        <w:color w:val="FFFFFF"/>
-                        <w:sz w:val="20"/>
-                        <w:szCs w:val="20"/>
-                      </w:rPr>
-                      <w:fldChar w:fldCharType="separate"/>
-                    </w:r>
-                    <w:r>
-                      <w:rPr>
-                        <w:rFonts w:ascii="Arial" w:eastAsia="Arial" w:hAnsi="Arial" w:cs="Arial"/>
-                        <w:i/>
-                        <w:color w:val="FFFFFF"/>
-                        <w:sz w:val="20"/>
-                        <w:szCs w:val="20"/>
-                        <w:lang w:val="nl-NL"/>
-                      </w:rPr>
-                      <w:t>2</w:t>
-                    </w:r>
-                    <w:r>
-                      <w:rPr>
-                        <w:rFonts w:ascii="Arial" w:eastAsia="Arial" w:hAnsi="Arial" w:cs="Arial"/>
-                        <w:i/>
-                        <w:color w:val="FFFFFF"/>
-                        <w:sz w:val="20"/>
-                        <w:szCs w:val="20"/>
-                      </w:rPr>
-                      <w:fldChar w:fldCharType="end"/>
-                    </w:r>
-                    <w:r>
-                      <w:rPr>
-                        <w:rFonts w:ascii="Arial" w:eastAsia="Arial" w:hAnsi="Arial" w:cs="Arial"/>
-                        <w:i/>
-                        <w:color w:val="FFFFFF"/>
-                        <w:sz w:val="20"/>
-                        <w:szCs w:val="20"/>
-                        <w:lang w:val="nl-NL"/>
-                      </w:rPr>
-                      <w:t xml:space="preserve"> van </w:t>
-                    </w:r>
-                    <w:r>
-                      <w:rPr>
-                        <w:rFonts w:ascii="Arial" w:eastAsia="Arial" w:hAnsi="Arial" w:cs="Arial"/>
-                        <w:i/>
-                        <w:color w:val="FFFFFF"/>
-                        <w:sz w:val="20"/>
-                        <w:szCs w:val="20"/>
-                      </w:rPr>
-                      <w:fldChar w:fldCharType="begin"/>
-                    </w:r>
-                    <w:r>
-                      <w:rPr>
-                        <w:rFonts w:ascii="Arial" w:eastAsia="Arial" w:hAnsi="Arial" w:cs="Arial"/>
-                        <w:i/>
-                        <w:noProof/>
-                        <w:color w:val="FFFFFF"/>
-                        <w:sz w:val="20"/>
-                        <w:szCs w:val="20"/>
-                        <w:lang w:val="nl-NL"/>
-                      </w:rPr>
-                      <w:instrText xml:space="preserve"> NUMPAGES </w:instrText>
-                    </w:r>
-                    <w:r>
-                      <w:rPr>
-                        <w:rFonts w:ascii="Arial" w:eastAsia="Arial" w:hAnsi="Arial" w:cs="Arial"/>
-                        <w:i/>
-                        <w:color w:val="FFFFFF"/>
-                        <w:sz w:val="20"/>
-                        <w:szCs w:val="20"/>
-                      </w:rPr>
-                      <w:fldChar w:fldCharType="separate"/>
-                    </w:r>
-                    <w:r>
-                      <w:rPr>
-                        <w:rFonts w:ascii="Arial" w:eastAsia="Arial" w:hAnsi="Arial" w:cs="Arial"/>
-                        <w:i/>
-                        <w:color w:val="FFFFFF"/>
-                        <w:sz w:val="20"/>
-                        <w:szCs w:val="20"/>
-                        <w:lang w:val="nl-NL"/>
-                      </w:rPr>
-                      <w:t>7</w:t>
-                    </w:r>
-                    <w:r>
-                      <w:rPr>
-                        <w:rFonts w:ascii="Arial" w:eastAsia="Arial" w:hAnsi="Arial" w:cs="Arial"/>
-                        <w:i/>
-                        <w:color w:val="FFFFFF"/>
-                        <w:sz w:val="20"/>
-                        <w:szCs w:val="20"/>
-                      </w:rPr>
-                      <w:fldChar w:fldCharType="end"/>
+                      <w:br/>
                     </w:r>
                   </w:p>
                 </w:txbxContent>
               </v:textbox>
-              <w10:wrap anchorx="margin"/>
+              <w10:wrap type="square" anchory="page"/>
             </v:shape>
           </w:pict>
         </mc:Fallback>
       </mc:AlternateContent>
     </w:r>
   </w:p>
-</w:ftr>
+</w:hdr>
 </file>
 
-<file path=word/footnotes.xml><?xml version="1.0" encoding="utf-8"?>
-<w:footnotes xmlns:wpc="http://schemas.microsoft.com/office/word/2010/wordprocessingCanvas" xmlns:cx="http://schemas.microsoft.com/office/drawing/2014/chartex" xmlns:cx1="http://schemas.microsoft.com/office/drawing/2015/9/8/chartex" xmlns:cx2="http://schemas.microsoft.com/office/drawing/2015/10/21/chartex" xmlns:cx3="http://schemas.microsoft.com/office/drawing/2016/5/9/chartex" xmlns:cx4="http://schemas.microsoft.com/office/drawing/2016/5/10/chartex" xmlns:cx5="http://schemas.microsoft.com/office/drawing/2016/5/11/chartex" xmlns:cx6="http://schemas.microsoft.com/office/drawing/2016/5/12/chartex" xmlns:cx7="http://schemas.microsoft.com/office/drawing/2016/5/13/chartex" xmlns:cx8="http://schemas.microsoft.com/office/drawing/2016/5/14/chartex" xmlns:mc="http://schemas.openxmlformats.org/markup-compatibility/2006" xmlns:aink="http://schemas.microsoft.com/office/drawing/2016/ink" xmlns:am3d="http://schemas.microsoft.com/office/drawing/2017/model3d" xmlns:o="urn:schemas-microsoft-com:office:office" xmlns:r="http://schemas.openxmlformats.org/officeDocument/2006/relationships" xmlns:m="http://schemas.openxmlformats.org/officeDocument/2006/math" xmlns:v="urn:schemas-microsoft-com:vml" xmlns:wp14="http://schemas.microsoft.com/office/word/2010/wordprocessingDrawing" xmlns:wp="http://schemas.openxmlformats.org/drawingml/2006/wordprocessingDrawing" xmlns:w10="urn:schemas-microsoft-com:office:word" xmlns:w="http://schemas.openxmlformats.org/wordprocessingml/2006/main" xmlns:w14="http://schemas.microsoft.com/office/word/2010/wordml" xmlns:w15="http://schemas.microsoft.com/office/word/2012/wordml" xmlns:w16cex="http://schemas.microsoft.com/office/word/2018/wordml/cex" xmlns:w16cid="http://schemas.microsoft.com/office/word/2016/wordml/cid" xmlns:w16="http://schemas.microsoft.com/office/word/2018/wordml" xmlns:w16sdtdh="http://schemas.microsoft.com/office/word/2020/wordml/sdtdatahash" xmlns:w16se="http://schemas.microsoft.com/office/word/2015/wordml/symex" xmlns:wpg="http://schemas.microsoft.com/office/word/2010/wordprocessingGroup" xmlns:wpi="http://schemas.microsoft.com/office/word/2010/wordprocessingInk" xmlns:wne="http://schemas.microsoft.com/office/word/2006/wordml" xmlns:wps="http://schemas.microsoft.com/office/word/2010/wordprocessingShape" mc:Ignorable="w14 w15 w16se w16cid w16 w16cex w16sdtdh wp14">
-  <w:footnote w:type="separator" w:id="-1">
-    <w:p>
-      <w:pPr>
-        <w:spacing w:after="0" w:line="240" w:lineRule="auto"/>
-      </w:pPr>
-      <w:r>
-        <w:separator/>
-      </w:r>
-    </w:p>
-  </w:footnote>
-  <w:footnote w:type="continuationSeparator" w:id="0">
-    <w:p>
-      <w:pPr>
-        <w:spacing w:after="0" w:line="240" w:lineRule="auto"/>
-      </w:pPr>
-      <w:r>
-        <w:continuationSeparator/>
-      </w:r>
-    </w:p>
-  </w:footnote>
-</w:footnotes>
-</file>
-
-<file path=word/header1.xml><?xml version="1.0" encoding="utf-8"?>
+<file path=word/header2.xml><?xml version="1.0" encoding="utf-8"?>
 <w:hdr xmlns:wpc="http://schemas.microsoft.com/office/word/2010/wordprocessingCanvas" xmlns:cx="http://schemas.microsoft.com/office/drawing/2014/chartex" xmlns:cx1="http://schemas.microsoft.com/office/drawing/2015/9/8/chartex" xmlns:cx2="http://schemas.microsoft.com/office/drawing/2015/10/21/chartex" xmlns:cx3="http://schemas.microsoft.com/office/drawing/2016/5/9/chartex" xmlns:cx4="http://schemas.microsoft.com/office/drawing/2016/5/10/chartex" xmlns:cx5="http://schemas.microsoft.com/office/drawing/2016/5/11/chartex" xmlns:cx6="http://schemas.microsoft.com/office/drawing/2016/5/12/chartex" xmlns:cx7="http://schemas.microsoft.com/office/drawing/2016/5/13/chartex" xmlns:cx8="http://schemas.microsoft.com/office/drawing/2016/5/14/chartex" xmlns:mc="http://schemas.openxmlformats.org/markup-compatibility/2006" xmlns:aink="http://schemas.microsoft.com/office/drawing/2016/ink" xmlns:am3d="http://schemas.microsoft.com/office/drawing/2017/model3d" xmlns:o="urn:schemas-microsoft-com:office:office" xmlns:r="http://schemas.openxmlformats.org/officeDocument/2006/relationships" xmlns:m="http://schemas.openxmlformats.org/officeDocument/2006/math" xmlns:v="urn:schemas-microsoft-com:vml" xmlns:wp14="http://schemas.microsoft.com/office/word/2010/wordprocessingDrawing" xmlns:wp="http://schemas.openxmlformats.org/drawingml/2006/wordprocessingDrawing" xmlns:w10="urn:schemas-microsoft-com:office:word" xmlns:w="http://schemas.openxmlformats.org/wordprocessingml/2006/main" xmlns:w14="http://schemas.microsoft.com/office/word/2010/wordml" xmlns:w15="http://schemas.microsoft.com/office/word/2012/wordml" xmlns:w16cex="http://schemas.microsoft.com/office/word/2018/wordml/cex" xmlns:w16cid="http://schemas.microsoft.com/office/word/2016/wordml/cid" xmlns:w16="http://schemas.microsoft.com/office/word/2018/wordml" xmlns:w16sdtdh="http://schemas.microsoft.com/office/word/2020/wordml/sdtdatahash" xmlns:w16se="http://schemas.microsoft.com/office/word/2015/wordml/symex" xmlns:wpg="http://schemas.microsoft.com/office/word/2010/wordprocessingGroup" xmlns:wpi="http://schemas.microsoft.com/office/word/2010/wordprocessingInk" xmlns:wne="http://schemas.microsoft.com/office/word/2006/wordml" xmlns:wps="http://schemas.microsoft.com/office/word/2010/wordprocessingShape" mc:Ignorable="w14 w15 w16se w16cid w16 w16cex w16sdtdh wp14">
   <w:p>
     <w:pPr>
@@ -7641,7 +9012,7 @@
               <c:strCache>
                 <c:ptCount val="1"/>
                 <c:pt idx="0">
-                  <c:v>Series 1</c:v>
+                  <c:v>Cijfer</c:v>
                 </c:pt>
               </c:strCache>
             </c:strRef>
@@ -7717,18 +9088,9 @@
             <c:strRef>
               <c:f>Sheet1!$A$2:$A$5</c:f>
               <c:strCache>
-                <c:ptCount val="4"/>
+                <c:ptCount val="1"/>
                 <c:pt idx="0">
-                  <c:v>Category 1</c:v>
-                </c:pt>
-                <c:pt idx="1">
-                  <c:v>Category 2</c:v>
-                </c:pt>
-                <c:pt idx="2">
-                  <c:v>Category 3</c:v>
-                </c:pt>
-                <c:pt idx="3">
-                  <c:v>Category 4</c:v>
+                  <c:v>Categorie </c:v>
                 </c:pt>
               </c:strCache>
             </c:strRef>
@@ -7740,23 +9102,14 @@
                 <c:formatCode>General</c:formatCode>
                 <c:ptCount val="4"/>
                 <c:pt idx="0">
-                  <c:v>4.3</c:v>
-                </c:pt>
-                <c:pt idx="1">
-                  <c:v>2.5</c:v>
-                </c:pt>
-                <c:pt idx="2">
-                  <c:v>3.5</c:v>
-                </c:pt>
-                <c:pt idx="3">
-                  <c:v>4.5</c:v>
+                  <c:v>0</c:v>
                 </c:pt>
               </c:numCache>
             </c:numRef>
           </c:val>
           <c:extLst>
             <c:ext xmlns:c16="http://schemas.microsoft.com/office/drawing/2014/chart" uri="{C3380CC4-5D6E-409C-BE32-E72D297353CC}">
-              <c16:uniqueId val="{00000000-BA86-4EFA-93C9-BE2F9ED32BE5}"/>
+              <c16:uniqueId val="{00000000-18C6-40DA-81E3-A1A4D31D9FD7}"/>
             </c:ext>
           </c:extLst>
         </c:ser>
@@ -7784,7 +9137,7 @@
               <c:strCache>
                 <c:ptCount val="1"/>
                 <c:pt idx="0">
-                  <c:v>Series 3</c:v>
+                  <c:v>Goedkeurgrens</c:v>
                 </c:pt>
               </c:strCache>
             </c:strRef>
@@ -7808,18 +9161,9 @@
             <c:strRef>
               <c:f>Sheet1!$A$2:$A$5</c:f>
               <c:strCache>
-                <c:ptCount val="4"/>
+                <c:ptCount val="1"/>
                 <c:pt idx="0">
-                  <c:v>Category 1</c:v>
-                </c:pt>
-                <c:pt idx="1">
-                  <c:v>Category 2</c:v>
-                </c:pt>
-                <c:pt idx="2">
-                  <c:v>Category 3</c:v>
-                </c:pt>
-                <c:pt idx="3">
-                  <c:v>Category 4</c:v>
+                  <c:v>Categorie </c:v>
                 </c:pt>
               </c:strCache>
             </c:strRef>
@@ -7831,16 +9175,7 @@
                 <c:formatCode>General</c:formatCode>
                 <c:ptCount val="4"/>
                 <c:pt idx="0">
-                  <c:v>2</c:v>
-                </c:pt>
-                <c:pt idx="1">
-                  <c:v>2</c:v>
-                </c:pt>
-                <c:pt idx="2">
-                  <c:v>3</c:v>
-                </c:pt>
-                <c:pt idx="3">
-                  <c:v>5</c:v>
+                  <c:v>0</c:v>
                 </c:pt>
               </c:numCache>
             </c:numRef>
@@ -7848,7 +9183,7 @@
           <c:smooth val="0"/>
           <c:extLst>
             <c:ext xmlns:c16="http://schemas.microsoft.com/office/drawing/2014/chart" uri="{C3380CC4-5D6E-409C-BE32-E72D297353CC}">
-              <c16:uniqueId val="{00000001-BA86-4EFA-93C9-BE2F9ED32BE5}"/>
+              <c16:uniqueId val="{00000001-18C6-40DA-81E3-A1A4D31D9FD7}"/>
             </c:ext>
           </c:extLst>
         </c:ser>
@@ -8198,7 +9533,7 @@
           <c:smooth val="0"/>
           <c:extLst>
             <c:ext xmlns:c16="http://schemas.microsoft.com/office/drawing/2014/chart" uri="{C3380CC4-5D6E-409C-BE32-E72D297353CC}">
-              <c16:uniqueId val="{00000000-3F61-42FD-9138-96BCB81A212D}"/>
+              <c16:uniqueId val="{00000000-C7F5-4DAE-8812-245A8616168A}"/>
             </c:ext>
           </c:extLst>
         </c:ser>
@@ -8331,7 +9666,7 @@
           <c:smooth val="0"/>
           <c:extLst>
             <c:ext xmlns:c16="http://schemas.microsoft.com/office/drawing/2014/chart" uri="{C3380CC4-5D6E-409C-BE32-E72D297353CC}">
-              <c16:uniqueId val="{00000001-3F61-42FD-9138-96BCB81A212D}"/>
+              <c16:uniqueId val="{00000001-C7F5-4DAE-8812-245A8616168A}"/>
             </c:ext>
           </c:extLst>
         </c:ser>
@@ -8403,7 +9738,7 @@
           <c:smooth val="0"/>
           <c:extLst>
             <c:ext xmlns:c16="http://schemas.microsoft.com/office/drawing/2014/chart" uri="{C3380CC4-5D6E-409C-BE32-E72D297353CC}">
-              <c16:uniqueId val="{00000002-3F61-42FD-9138-96BCB81A212D}"/>
+              <c16:uniqueId val="{00000002-C7F5-4DAE-8812-245A8616168A}"/>
             </c:ext>
           </c:extLst>
         </c:ser>
@@ -8662,7 +9997,7 @@
             <c:bubble3D val="0"/>
             <c:extLst>
               <c:ext xmlns:c16="http://schemas.microsoft.com/office/drawing/2014/chart" uri="{C3380CC4-5D6E-409C-BE32-E72D297353CC}">
-                <c16:uniqueId val="{00000000-F548-4A4F-9617-C4E2F1594E8C}"/>
+                <c16:uniqueId val="{00000000-1C09-492D-8C2A-E4A41C99E3AF}"/>
               </c:ext>
             </c:extLst>
           </c:dPt>
@@ -8671,7 +10006,7 @@
             <c:bubble3D val="0"/>
             <c:extLst>
               <c:ext xmlns:c16="http://schemas.microsoft.com/office/drawing/2014/chart" uri="{C3380CC4-5D6E-409C-BE32-E72D297353CC}">
-                <c16:uniqueId val="{00000001-F548-4A4F-9617-C4E2F1594E8C}"/>
+                <c16:uniqueId val="{00000001-1C09-492D-8C2A-E4A41C99E3AF}"/>
               </c:ext>
             </c:extLst>
           </c:dPt>
@@ -8680,7 +10015,7 @@
             <c:bubble3D val="0"/>
             <c:extLst>
               <c:ext xmlns:c16="http://schemas.microsoft.com/office/drawing/2014/chart" uri="{C3380CC4-5D6E-409C-BE32-E72D297353CC}">
-                <c16:uniqueId val="{00000002-F548-4A4F-9617-C4E2F1594E8C}"/>
+                <c16:uniqueId val="{00000002-1C09-492D-8C2A-E4A41C99E3AF}"/>
               </c:ext>
             </c:extLst>
           </c:dPt>
@@ -8810,28 +10145,28 @@
                   <c:v>0</c:v>
                 </c:pt>
                 <c:pt idx="1">
-                  <c:v>3.2</c:v>
+                  <c:v>0</c:v>
                 </c:pt>
                 <c:pt idx="2">
-                  <c:v>0.8</c:v>
+                  <c:v>0</c:v>
                 </c:pt>
                 <c:pt idx="3">
-                  <c:v>0.8</c:v>
+                  <c:v>0</c:v>
                 </c:pt>
                 <c:pt idx="4">
-                  <c:v>0.8</c:v>
+                  <c:v>0</c:v>
                 </c:pt>
                 <c:pt idx="5">
-                  <c:v>7</c:v>
+                  <c:v>0</c:v>
                 </c:pt>
                 <c:pt idx="6">
-                  <c:v>8</c:v>
+                  <c:v>0</c:v>
                 </c:pt>
                 <c:pt idx="7">
-                  <c:v>9</c:v>
+                  <c:v>0</c:v>
                 </c:pt>
                 <c:pt idx="8">
-                  <c:v>10</c:v>
+                  <c:v>0</c:v>
                 </c:pt>
               </c:numCache>
             </c:numRef>
@@ -8839,7 +10174,7 @@
           <c:smooth val="0"/>
           <c:extLst>
             <c:ext xmlns:c16="http://schemas.microsoft.com/office/drawing/2014/chart" uri="{C3380CC4-5D6E-409C-BE32-E72D297353CC}">
-              <c16:uniqueId val="{00000003-F548-4A4F-9617-C4E2F1594E8C}"/>
+              <c16:uniqueId val="{00000003-1C09-492D-8C2A-E4A41C99E3AF}"/>
             </c:ext>
           </c:extLst>
         </c:ser>
@@ -9053,7 +10388,7 @@
             </c:spPr>
             <c:extLst>
               <c:ext xmlns:c16="http://schemas.microsoft.com/office/drawing/2014/chart" uri="{C3380CC4-5D6E-409C-BE32-E72D297353CC}">
-                <c16:uniqueId val="{00000001-A095-4E98-825A-AD775863BADB}"/>
+                <c16:uniqueId val="{00000001-9580-46EE-B58A-44C3C867283F}"/>
               </c:ext>
             </c:extLst>
           </c:dPt>
@@ -9067,7 +10402,7 @@
             </c:spPr>
             <c:extLst>
               <c:ext xmlns:c16="http://schemas.microsoft.com/office/drawing/2014/chart" uri="{C3380CC4-5D6E-409C-BE32-E72D297353CC}">
-                <c16:uniqueId val="{00000003-A095-4E98-825A-AD775863BADB}"/>
+                <c16:uniqueId val="{00000003-9580-46EE-B58A-44C3C867283F}"/>
               </c:ext>
             </c:extLst>
           </c:dPt>
@@ -9091,7 +10426,7 @@
             </c:spPr>
             <c:extLst>
               <c:ext xmlns:c16="http://schemas.microsoft.com/office/drawing/2014/chart" uri="{C3380CC4-5D6E-409C-BE32-E72D297353CC}">
-                <c16:uniqueId val="{00000005-A095-4E98-825A-AD775863BADB}"/>
+                <c16:uniqueId val="{00000005-9580-46EE-B58A-44C3C867283F}"/>
               </c:ext>
             </c:extLst>
           </c:dPt>
@@ -9103,7 +10438,7 @@
             </c:spPr>
             <c:extLst>
               <c:ext xmlns:c16="http://schemas.microsoft.com/office/drawing/2014/chart" uri="{C3380CC4-5D6E-409C-BE32-E72D297353CC}">
-                <c16:uniqueId val="{00000007-A095-4E98-825A-AD775863BADB}"/>
+                <c16:uniqueId val="{00000007-9580-46EE-B58A-44C3C867283F}"/>
               </c:ext>
             </c:extLst>
           </c:dPt>
@@ -9153,7 +10488,7 @@
           </c:val>
           <c:extLst>
             <c:ext xmlns:c16="http://schemas.microsoft.com/office/drawing/2014/chart" uri="{C3380CC4-5D6E-409C-BE32-E72D297353CC}">
-              <c16:uniqueId val="{00000008-A095-4E98-825A-AD775863BADB}"/>
+              <c16:uniqueId val="{00000008-9580-46EE-B58A-44C3C867283F}"/>
             </c:ext>
           </c:extLst>
         </c:ser>

</xml_diff>